<commit_message>
modified error handling portion, arrows, gramtical mistakes
</commit_message>
<xml_diff>
--- a/docs/HLD/AltitudeMeasurement_HLD.docx
+++ b/docs/HLD/AltitudeMeasurement_HLD.docx
@@ -19,23 +19,21 @@
         </w:rPr>
         <w:t xml:space="preserve">Altitude </w:t>
       </w:r>
-      <w:proofErr w:type="gramStart"/>
       <w:r>
         <w:rPr>
           <w:rFonts w:cstheme="majorHAnsi"/>
           <w:sz w:val="22"/>
           <w:szCs w:val="22"/>
         </w:rPr>
-        <w:t>measurement</w:t>
-      </w:r>
-      <w:proofErr w:type="gramEnd"/>
+        <w:t>M</w:t>
+      </w:r>
       <w:r>
         <w:rPr>
           <w:rFonts w:cstheme="majorHAnsi"/>
           <w:sz w:val="22"/>
           <w:szCs w:val="22"/>
         </w:rPr>
-        <w:t xml:space="preserve"> </w:t>
+        <w:t xml:space="preserve">easurement </w:t>
       </w:r>
       <w:r>
         <w:rPr>
@@ -69,19 +67,25 @@
         <w:rPr>
           <w:rFonts w:asciiTheme="majorHAnsi" w:hAnsiTheme="majorHAnsi" w:cstheme="majorHAnsi"/>
         </w:rPr>
-        <w:t>Date: [</w:t>
-      </w:r>
-      <w:r>
-        <w:rPr>
-          <w:rFonts w:asciiTheme="majorHAnsi" w:hAnsiTheme="majorHAnsi" w:cstheme="majorHAnsi"/>
-        </w:rPr>
-        <w:t>16-02-206</w:t>
-      </w:r>
-      <w:r>
-        <w:rPr>
-          <w:rFonts w:asciiTheme="majorHAnsi" w:hAnsiTheme="majorHAnsi" w:cstheme="majorHAnsi"/>
-        </w:rPr>
-        <w:t>]</w:t>
+        <w:t xml:space="preserve">Date: </w:t>
+      </w:r>
+      <w:r>
+        <w:rPr>
+          <w:rFonts w:asciiTheme="majorHAnsi" w:hAnsiTheme="majorHAnsi" w:cstheme="majorHAnsi"/>
+        </w:rPr>
+        <w:t>16-02-20</w:t>
+      </w:r>
+      <w:r>
+        <w:rPr>
+          <w:rFonts w:asciiTheme="majorHAnsi" w:hAnsiTheme="majorHAnsi" w:cstheme="majorHAnsi"/>
+        </w:rPr>
+        <w:t>2</w:t>
+      </w:r>
+      <w:r>
+        <w:rPr>
+          <w:rFonts w:asciiTheme="majorHAnsi" w:hAnsiTheme="majorHAnsi" w:cstheme="majorHAnsi"/>
+        </w:rPr>
+        <w:t>6</w:t>
       </w:r>
     </w:p>
     <w:p>
@@ -94,19 +98,13 @@
         <w:rPr>
           <w:rFonts w:asciiTheme="majorHAnsi" w:hAnsiTheme="majorHAnsi" w:cstheme="majorHAnsi"/>
         </w:rPr>
-        <w:t>Prepared by: [</w:t>
+        <w:t xml:space="preserve">Prepared by: </w:t>
       </w:r>
       <w:r>
         <w:rPr>
           <w:rFonts w:asciiTheme="majorHAnsi" w:hAnsiTheme="majorHAnsi" w:cstheme="majorHAnsi"/>
         </w:rPr>
         <w:t>Arunya V.A</w:t>
-      </w:r>
-      <w:r>
-        <w:rPr>
-          <w:rFonts w:asciiTheme="majorHAnsi" w:hAnsiTheme="majorHAnsi" w:cstheme="majorHAnsi"/>
-        </w:rPr>
-        <w:t>]</w:t>
       </w:r>
     </w:p>
     <w:p>
@@ -141,34 +139,54 @@
         </w:rPr>
         <w:t xml:space="preserve">The goal </w:t>
       </w:r>
-      <w:proofErr w:type="gramStart"/>
-      <w:r>
-        <w:rPr>
-          <w:rFonts w:asciiTheme="majorHAnsi" w:hAnsiTheme="majorHAnsi" w:cstheme="majorHAnsi"/>
-        </w:rPr>
-        <w:t>of  the</w:t>
-      </w:r>
-      <w:proofErr w:type="gramEnd"/>
-      <w:r>
-        <w:rPr>
-          <w:rFonts w:asciiTheme="majorHAnsi" w:hAnsiTheme="majorHAnsi" w:cstheme="majorHAnsi"/>
-        </w:rPr>
-        <w:t xml:space="preserve"> system is to monitor the altitude value</w:t>
-      </w:r>
-      <w:r>
-        <w:rPr>
-          <w:rFonts w:asciiTheme="majorHAnsi" w:hAnsiTheme="majorHAnsi" w:cstheme="majorHAnsi"/>
-        </w:rPr>
-        <w:t xml:space="preserve"> and validate </w:t>
-      </w:r>
-      <w:proofErr w:type="gramStart"/>
-      <w:r>
-        <w:rPr>
-          <w:rFonts w:asciiTheme="majorHAnsi" w:hAnsiTheme="majorHAnsi" w:cstheme="majorHAnsi"/>
-        </w:rPr>
-        <w:t>it’s</w:t>
-      </w:r>
-      <w:proofErr w:type="gramEnd"/>
+      <w:r>
+        <w:rPr>
+          <w:rFonts w:asciiTheme="majorHAnsi" w:hAnsiTheme="majorHAnsi" w:cstheme="majorHAnsi"/>
+        </w:rPr>
+        <w:t>of the</w:t>
+      </w:r>
+      <w:r>
+        <w:rPr>
+          <w:rFonts w:asciiTheme="majorHAnsi" w:hAnsiTheme="majorHAnsi" w:cstheme="majorHAnsi"/>
+        </w:rPr>
+        <w:t xml:space="preserve"> </w:t>
+      </w:r>
+      <w:r>
+        <w:rPr>
+          <w:rFonts w:asciiTheme="majorHAnsi" w:hAnsiTheme="majorHAnsi" w:cstheme="majorHAnsi"/>
+        </w:rPr>
+        <w:t>document</w:t>
+      </w:r>
+      <w:r>
+        <w:rPr>
+          <w:rFonts w:asciiTheme="majorHAnsi" w:hAnsiTheme="majorHAnsi" w:cstheme="majorHAnsi"/>
+        </w:rPr>
+        <w:t xml:space="preserve"> is to monitor the altitude value</w:t>
+      </w:r>
+      <w:r>
+        <w:rPr>
+          <w:rFonts w:asciiTheme="majorHAnsi" w:hAnsiTheme="majorHAnsi" w:cstheme="majorHAnsi"/>
+        </w:rPr>
+        <w:t xml:space="preserve"> </w:t>
+      </w:r>
+      <w:r>
+        <w:rPr>
+          <w:rFonts w:asciiTheme="majorHAnsi" w:hAnsiTheme="majorHAnsi" w:cstheme="majorHAnsi"/>
+        </w:rPr>
+        <w:t xml:space="preserve">from a sensor module </w:t>
+      </w:r>
+      <w:r>
+        <w:rPr>
+          <w:rFonts w:asciiTheme="majorHAnsi" w:hAnsiTheme="majorHAnsi" w:cstheme="majorHAnsi"/>
+        </w:rPr>
+        <w:t xml:space="preserve">and validate </w:t>
+      </w:r>
+      <w:r>
+        <w:rPr>
+          <w:rFonts w:asciiTheme="majorHAnsi" w:hAnsiTheme="majorHAnsi" w:cstheme="majorHAnsi"/>
+        </w:rPr>
+        <w:t>it</w:t>
+      </w:r>
       <w:r>
         <w:rPr>
           <w:rFonts w:asciiTheme="majorHAnsi" w:hAnsiTheme="majorHAnsi" w:cstheme="majorHAnsi"/>
@@ -289,30 +307,130 @@
           <w:rFonts w:asciiTheme="majorHAnsi" w:hAnsiTheme="majorHAnsi" w:cstheme="majorHAnsi"/>
           <w:u w:val="single"/>
         </w:rPr>
-        <w:t xml:space="preserve">Data </w:t>
-      </w:r>
+        <w:t>Sensor Management</w:t>
+      </w:r>
+      <w:r>
+        <w:rPr>
+          <w:rFonts w:asciiTheme="majorHAnsi" w:hAnsiTheme="majorHAnsi" w:cstheme="majorHAnsi"/>
+        </w:rPr>
+        <w:t xml:space="preserve"> -</w:t>
+      </w:r>
+      <w:r>
+        <w:rPr>
+          <w:rFonts w:asciiTheme="majorHAnsi" w:hAnsiTheme="majorHAnsi" w:cstheme="majorHAnsi"/>
+        </w:rPr>
+        <w:t xml:space="preserve"> </w:t>
+      </w:r>
+      <w:r>
+        <w:rPr>
+          <w:rFonts w:asciiTheme="majorHAnsi" w:hAnsiTheme="majorHAnsi" w:cstheme="majorHAnsi"/>
+        </w:rPr>
+        <w:t xml:space="preserve">The system </w:t>
+      </w:r>
+      <w:r>
+        <w:rPr>
+          <w:rFonts w:asciiTheme="majorHAnsi" w:hAnsiTheme="majorHAnsi" w:cstheme="majorHAnsi"/>
+        </w:rPr>
+        <w:t>interfaces</w:t>
+      </w:r>
+      <w:r>
+        <w:rPr>
+          <w:rFonts w:asciiTheme="majorHAnsi" w:hAnsiTheme="majorHAnsi" w:cstheme="majorHAnsi"/>
+        </w:rPr>
+        <w:t xml:space="preserve"> with the sensor module to gather real time altitude data. </w:t>
+      </w:r>
+      <w:r>
+        <w:rPr>
+          <w:rFonts w:asciiTheme="majorHAnsi" w:hAnsiTheme="majorHAnsi" w:cstheme="majorHAnsi"/>
+        </w:rPr>
+        <w:t xml:space="preserve">The timing is synchronized to a fixed interval to ensure </w:t>
+      </w:r>
+      <w:r>
+        <w:rPr>
+          <w:rFonts w:asciiTheme="majorHAnsi" w:hAnsiTheme="majorHAnsi" w:cstheme="majorHAnsi"/>
+        </w:rPr>
+        <w:t>data consistency</w:t>
+      </w:r>
+      <w:r>
+        <w:rPr>
+          <w:rFonts w:asciiTheme="majorHAnsi" w:hAnsiTheme="majorHAnsi" w:cstheme="majorHAnsi"/>
+        </w:rPr>
+        <w:t>.</w:t>
+      </w:r>
+    </w:p>
+    <w:p>
+      <w:pPr>
+        <w:rPr>
+          <w:rFonts w:asciiTheme="majorHAnsi" w:hAnsiTheme="majorHAnsi" w:cstheme="majorHAnsi"/>
+        </w:rPr>
+      </w:pPr>
       <w:r>
         <w:rPr>
           <w:rFonts w:asciiTheme="majorHAnsi" w:hAnsiTheme="majorHAnsi" w:cstheme="majorHAnsi"/>
           <w:u w:val="single"/>
         </w:rPr>
-        <w:t>gathering</w:t>
-      </w:r>
-      <w:r>
-        <w:rPr>
-          <w:rFonts w:asciiTheme="majorHAnsi" w:hAnsiTheme="majorHAnsi" w:cstheme="majorHAnsi"/>
-        </w:rPr>
-        <w:t xml:space="preserve"> -</w:t>
-      </w:r>
-      <w:r>
-        <w:rPr>
-          <w:rFonts w:asciiTheme="majorHAnsi" w:hAnsiTheme="majorHAnsi" w:cstheme="majorHAnsi"/>
+        <w:t>2.</w:t>
+      </w:r>
+      <w:r>
+        <w:rPr>
+          <w:rFonts w:asciiTheme="majorHAnsi" w:hAnsiTheme="majorHAnsi" w:cstheme="majorHAnsi"/>
+          <w:u w:val="single"/>
+        </w:rPr>
+        <w:t>1.2</w:t>
+      </w:r>
+      <w:r>
+        <w:rPr>
+          <w:rFonts w:asciiTheme="majorHAnsi" w:hAnsiTheme="majorHAnsi" w:cstheme="majorHAnsi"/>
+          <w:u w:val="single"/>
         </w:rPr>
         <w:t xml:space="preserve"> </w:t>
       </w:r>
       <w:r>
         <w:rPr>
           <w:rFonts w:asciiTheme="majorHAnsi" w:hAnsiTheme="majorHAnsi" w:cstheme="majorHAnsi"/>
+          <w:u w:val="single"/>
+        </w:rPr>
+        <w:t>Validation Engine</w:t>
+      </w:r>
+      <w:r>
+        <w:rPr>
+          <w:rFonts w:asciiTheme="majorHAnsi" w:hAnsiTheme="majorHAnsi" w:cstheme="majorHAnsi"/>
+        </w:rPr>
+        <w:t xml:space="preserve"> – Within a specific interval the system </w:t>
+      </w:r>
+      <w:r>
+        <w:rPr>
+          <w:rFonts w:asciiTheme="majorHAnsi" w:hAnsiTheme="majorHAnsi" w:cstheme="majorHAnsi"/>
+        </w:rPr>
+        <w:t>processes</w:t>
+      </w:r>
+      <w:r>
+        <w:rPr>
+          <w:rFonts w:asciiTheme="majorHAnsi" w:hAnsiTheme="majorHAnsi" w:cstheme="majorHAnsi"/>
+        </w:rPr>
+        <w:t xml:space="preserve"> the raw data to </w:t>
+      </w:r>
+      <w:r>
+        <w:rPr>
+          <w:rFonts w:asciiTheme="majorHAnsi" w:hAnsiTheme="majorHAnsi" w:cstheme="majorHAnsi"/>
+        </w:rPr>
+        <w:t>analyze</w:t>
+      </w:r>
+      <w:r>
+        <w:rPr>
+          <w:rFonts w:asciiTheme="majorHAnsi" w:hAnsiTheme="majorHAnsi" w:cstheme="majorHAnsi"/>
+        </w:rPr>
+        <w:t xml:space="preserve"> the altitude values.</w:t>
+      </w:r>
+      <w:r>
+        <w:rPr>
+          <w:rFonts w:asciiTheme="majorHAnsi" w:hAnsiTheme="majorHAnsi" w:cstheme="majorHAnsi"/>
+        </w:rPr>
+        <w:t xml:space="preserve"> </w:t>
+      </w:r>
+      <w:r>
+        <w:rPr>
+          <w:rFonts w:asciiTheme="majorHAnsi" w:hAnsiTheme="majorHAnsi" w:cstheme="majorHAnsi"/>
         </w:rPr>
         <w:t xml:space="preserve">The system </w:t>
       </w:r>
@@ -320,246 +438,191 @@
         <w:rPr>
           <w:rFonts w:asciiTheme="majorHAnsi" w:hAnsiTheme="majorHAnsi" w:cstheme="majorHAnsi"/>
         </w:rPr>
-        <w:t>interfaces</w:t>
-      </w:r>
-      <w:r>
-        <w:rPr>
-          <w:rFonts w:asciiTheme="majorHAnsi" w:hAnsiTheme="majorHAnsi" w:cstheme="majorHAnsi"/>
-        </w:rPr>
-        <w:t xml:space="preserve"> with the sensor module to gather real time altitude data. </w:t>
-      </w:r>
-      <w:r>
-        <w:rPr>
-          <w:rFonts w:asciiTheme="majorHAnsi" w:hAnsiTheme="majorHAnsi" w:cstheme="majorHAnsi"/>
-        </w:rPr>
-        <w:t xml:space="preserve">The timing is synchronized to a fixed interval to ensure </w:t>
-      </w:r>
-      <w:r>
+        <w:t>validates</w:t>
+      </w:r>
+      <w:r>
+        <w:rPr>
+          <w:rFonts w:asciiTheme="majorHAnsi" w:hAnsiTheme="majorHAnsi" w:cstheme="majorHAnsi"/>
+        </w:rPr>
+        <w:t xml:space="preserve"> the altitude readings against </w:t>
+      </w:r>
+      <w:r>
+        <w:rPr>
+          <w:rFonts w:asciiTheme="majorHAnsi" w:hAnsiTheme="majorHAnsi" w:cstheme="majorHAnsi"/>
+        </w:rPr>
+        <w:t>predefined thresholds</w:t>
+      </w:r>
+      <w:r>
+        <w:rPr>
+          <w:rFonts w:asciiTheme="majorHAnsi" w:hAnsiTheme="majorHAnsi" w:cstheme="majorHAnsi"/>
+        </w:rPr>
+        <w:t xml:space="preserve"> </w:t>
+      </w:r>
+      <w:r>
+        <w:rPr>
+          <w:rFonts w:asciiTheme="majorHAnsi" w:hAnsiTheme="majorHAnsi" w:cstheme="majorHAnsi"/>
+        </w:rPr>
+        <w:t>[THRESHOLD_MIN, THRESOLD_MAX]</w:t>
+      </w:r>
+      <w:r>
+        <w:rPr>
+          <w:rFonts w:asciiTheme="majorHAnsi" w:hAnsiTheme="majorHAnsi" w:cstheme="majorHAnsi"/>
+        </w:rPr>
+        <w:t>.</w:t>
+      </w:r>
+      <w:r>
+        <w:rPr>
+          <w:rFonts w:asciiTheme="majorHAnsi" w:hAnsiTheme="majorHAnsi" w:cstheme="majorHAnsi"/>
+        </w:rPr>
+        <w:t xml:space="preserve"> </w:t>
+      </w:r>
+      <w:r>
+        <w:rPr>
+          <w:rFonts w:asciiTheme="majorHAnsi" w:hAnsiTheme="majorHAnsi" w:cstheme="majorHAnsi"/>
+        </w:rPr>
+        <w:t xml:space="preserve">If a value </w:t>
+      </w:r>
+      <w:r>
+        <w:rPr>
+          <w:rFonts w:asciiTheme="majorHAnsi" w:hAnsiTheme="majorHAnsi" w:cstheme="majorHAnsi"/>
+        </w:rPr>
+        <w:t>exceeds the limit</w:t>
+      </w:r>
+      <w:r>
+        <w:rPr>
+          <w:rFonts w:asciiTheme="majorHAnsi" w:hAnsiTheme="majorHAnsi" w:cstheme="majorHAnsi"/>
+        </w:rPr>
+        <w:t xml:space="preserve"> set event bit.</w:t>
+      </w:r>
+    </w:p>
+    <w:p>
+      <w:pPr>
+        <w:rPr>
+          <w:rFonts w:asciiTheme="majorHAnsi" w:hAnsiTheme="majorHAnsi" w:cstheme="majorHAnsi"/>
+        </w:rPr>
+      </w:pPr>
+      <w:r>
+        <w:rPr>
+          <w:rFonts w:asciiTheme="majorHAnsi" w:hAnsiTheme="majorHAnsi" w:cstheme="majorHAnsi"/>
+          <w:u w:val="single"/>
+        </w:rPr>
+        <w:t>2.1.3</w:t>
+      </w:r>
+      <w:r>
+        <w:rPr>
+          <w:rFonts w:asciiTheme="majorHAnsi" w:hAnsiTheme="majorHAnsi" w:cstheme="majorHAnsi"/>
+          <w:u w:val="single"/>
+        </w:rPr>
+        <w:t>.</w:t>
+      </w:r>
+      <w:r>
+        <w:rPr>
+          <w:rFonts w:asciiTheme="majorHAnsi" w:hAnsiTheme="majorHAnsi" w:cstheme="majorHAnsi"/>
+          <w:u w:val="single"/>
+        </w:rPr>
+        <w:t xml:space="preserve"> </w:t>
+      </w:r>
+      <w:r>
+        <w:rPr>
+          <w:rFonts w:asciiTheme="majorHAnsi" w:hAnsiTheme="majorHAnsi" w:cstheme="majorHAnsi"/>
+          <w:u w:val="single"/>
+        </w:rPr>
+        <w:t>Alarm Management</w:t>
+      </w:r>
+      <w:r>
+        <w:rPr>
+          <w:rFonts w:asciiTheme="majorHAnsi" w:hAnsiTheme="majorHAnsi" w:cstheme="majorHAnsi"/>
+        </w:rPr>
+        <w:t xml:space="preserve"> </w:t>
+      </w:r>
+      <w:r>
+        <w:rPr>
+          <w:rFonts w:asciiTheme="majorHAnsi" w:hAnsiTheme="majorHAnsi" w:cstheme="majorHAnsi"/>
+        </w:rPr>
+        <w:t>–</w:t>
+      </w:r>
+      <w:r>
+        <w:rPr>
+          <w:rFonts w:asciiTheme="majorHAnsi" w:hAnsiTheme="majorHAnsi" w:cstheme="majorHAnsi"/>
+        </w:rPr>
+        <w:t xml:space="preserve"> </w:t>
+      </w:r>
+      <w:r>
+        <w:rPr>
+          <w:rFonts w:asciiTheme="majorHAnsi" w:hAnsiTheme="majorHAnsi" w:cstheme="majorHAnsi"/>
+        </w:rPr>
+        <w:t xml:space="preserve">The system </w:t>
+      </w:r>
+      <w:r>
+        <w:rPr>
+          <w:rFonts w:asciiTheme="majorHAnsi" w:hAnsiTheme="majorHAnsi" w:cstheme="majorHAnsi"/>
+        </w:rPr>
+        <w:t xml:space="preserve">read the event </w:t>
+      </w:r>
+      <w:r>
+        <w:rPr>
+          <w:rFonts w:asciiTheme="majorHAnsi" w:hAnsiTheme="majorHAnsi" w:cstheme="majorHAnsi"/>
+        </w:rPr>
+        <w:t>bit,</w:t>
+      </w:r>
+      <w:r>
+        <w:rPr>
+          <w:rFonts w:asciiTheme="majorHAnsi" w:hAnsiTheme="majorHAnsi" w:cstheme="majorHAnsi"/>
+        </w:rPr>
+        <w:t xml:space="preserve"> and</w:t>
+      </w:r>
+      <w:r>
+        <w:rPr>
+          <w:rFonts w:asciiTheme="majorHAnsi" w:hAnsiTheme="majorHAnsi" w:cstheme="majorHAnsi"/>
+        </w:rPr>
+        <w:t xml:space="preserve"> an alarm is triggered up to a specified </w:t>
+      </w:r>
+      <w:r>
+        <w:rPr>
+          <w:rFonts w:asciiTheme="majorHAnsi" w:hAnsiTheme="majorHAnsi" w:cstheme="majorHAnsi"/>
+        </w:rPr>
+        <w:t>interval</w:t>
+      </w:r>
+      <w:r>
+        <w:rPr>
+          <w:rFonts w:asciiTheme="majorHAnsi" w:hAnsiTheme="majorHAnsi" w:cstheme="majorHAnsi"/>
+        </w:rPr>
+        <w:t xml:space="preserve"> </w:t>
+      </w:r>
+      <w:r>
+        <w:rPr>
+          <w:rFonts w:asciiTheme="majorHAnsi" w:hAnsiTheme="majorHAnsi" w:cstheme="majorHAnsi"/>
+        </w:rPr>
+        <w:t>[ALARM_TIMEOUT]</w:t>
+      </w:r>
+      <w:r>
+        <w:rPr>
+          <w:rFonts w:asciiTheme="majorHAnsi" w:hAnsiTheme="majorHAnsi" w:cstheme="majorHAnsi"/>
+        </w:rPr>
+        <w:t>.</w:t>
+      </w:r>
+    </w:p>
+    <w:p>
+      <w:pPr>
         <w:rPr>
           <w:rFonts w:asciiTheme="majorHAnsi" w:hAnsiTheme="majorHAnsi" w:cstheme="majorHAnsi"/>
           <w:b/>
           <w:bCs/>
         </w:rPr>
-        <w:t>data consistency</w:t>
-      </w:r>
-      <w:r>
-        <w:rPr>
-          <w:rFonts w:asciiTheme="majorHAnsi" w:hAnsiTheme="majorHAnsi" w:cstheme="majorHAnsi"/>
-        </w:rPr>
-        <w:t>.</w:t>
+      </w:pPr>
+      <w:r>
+        <w:rPr>
+          <w:rFonts w:asciiTheme="majorHAnsi" w:hAnsiTheme="majorHAnsi" w:cstheme="majorHAnsi"/>
+          <w:b/>
+          <w:bCs/>
+        </w:rPr>
+        <w:t>2.2 High Level Architecture</w:t>
       </w:r>
     </w:p>
     <w:p>
       <w:pPr>
         <w:rPr>
           <w:rFonts w:asciiTheme="majorHAnsi" w:hAnsiTheme="majorHAnsi" w:cstheme="majorHAnsi"/>
-        </w:rPr>
-      </w:pPr>
-      <w:r>
-        <w:rPr>
-          <w:rFonts w:asciiTheme="majorHAnsi" w:hAnsiTheme="majorHAnsi" w:cstheme="majorHAnsi"/>
-          <w:u w:val="single"/>
-        </w:rPr>
-        <w:t>2.</w:t>
-      </w:r>
-      <w:r>
-        <w:rPr>
-          <w:rFonts w:asciiTheme="majorHAnsi" w:hAnsiTheme="majorHAnsi" w:cstheme="majorHAnsi"/>
-          <w:u w:val="single"/>
-        </w:rPr>
-        <w:t>1.2</w:t>
-      </w:r>
-      <w:r>
-        <w:rPr>
-          <w:rFonts w:asciiTheme="majorHAnsi" w:hAnsiTheme="majorHAnsi" w:cstheme="majorHAnsi"/>
-          <w:u w:val="single"/>
-        </w:rPr>
-        <w:t xml:space="preserve"> Data processing</w:t>
-      </w:r>
-      <w:r>
-        <w:rPr>
-          <w:rFonts w:asciiTheme="majorHAnsi" w:hAnsiTheme="majorHAnsi" w:cstheme="majorHAnsi"/>
-        </w:rPr>
-        <w:t xml:space="preserve"> – Within a specific interval the system </w:t>
-      </w:r>
-      <w:r>
-        <w:rPr>
-          <w:rFonts w:asciiTheme="majorHAnsi" w:hAnsiTheme="majorHAnsi" w:cstheme="majorHAnsi"/>
-        </w:rPr>
-        <w:t>processes</w:t>
-      </w:r>
-      <w:r>
-        <w:rPr>
-          <w:rFonts w:asciiTheme="majorHAnsi" w:hAnsiTheme="majorHAnsi" w:cstheme="majorHAnsi"/>
-        </w:rPr>
-        <w:t xml:space="preserve"> the raw data to </w:t>
-      </w:r>
-      <w:r>
-        <w:rPr>
-          <w:rFonts w:asciiTheme="majorHAnsi" w:hAnsiTheme="majorHAnsi" w:cstheme="majorHAnsi"/>
-        </w:rPr>
-        <w:t>analyze</w:t>
-      </w:r>
-      <w:r>
-        <w:rPr>
-          <w:rFonts w:asciiTheme="majorHAnsi" w:hAnsiTheme="majorHAnsi" w:cstheme="majorHAnsi"/>
-        </w:rPr>
-        <w:t xml:space="preserve"> the altitude values.</w:t>
-      </w:r>
-    </w:p>
-    <w:p>
-      <w:pPr>
-        <w:rPr>
-          <w:rFonts w:asciiTheme="majorHAnsi" w:hAnsiTheme="majorHAnsi" w:cstheme="majorHAnsi"/>
-        </w:rPr>
-      </w:pPr>
-      <w:r>
-        <w:rPr>
-          <w:rFonts w:asciiTheme="majorHAnsi" w:hAnsiTheme="majorHAnsi" w:cstheme="majorHAnsi"/>
-          <w:u w:val="single"/>
-        </w:rPr>
-        <w:t>2.1.3</w:t>
-      </w:r>
-      <w:r>
-        <w:rPr>
-          <w:rFonts w:asciiTheme="majorHAnsi" w:hAnsiTheme="majorHAnsi" w:cstheme="majorHAnsi"/>
-          <w:u w:val="single"/>
-        </w:rPr>
-        <w:t>.</w:t>
-      </w:r>
-      <w:r>
-        <w:rPr>
-          <w:rFonts w:asciiTheme="majorHAnsi" w:hAnsiTheme="majorHAnsi" w:cstheme="majorHAnsi"/>
-          <w:u w:val="single"/>
-        </w:rPr>
-        <w:t xml:space="preserve"> </w:t>
-      </w:r>
-      <w:proofErr w:type="gramStart"/>
-      <w:r>
-        <w:rPr>
-          <w:rFonts w:asciiTheme="majorHAnsi" w:hAnsiTheme="majorHAnsi" w:cstheme="majorHAnsi"/>
-          <w:u w:val="single"/>
-        </w:rPr>
-        <w:t>Data</w:t>
-      </w:r>
-      <w:proofErr w:type="gramEnd"/>
-      <w:r>
-        <w:rPr>
-          <w:rFonts w:asciiTheme="majorHAnsi" w:hAnsiTheme="majorHAnsi" w:cstheme="majorHAnsi"/>
-          <w:u w:val="single"/>
-        </w:rPr>
-        <w:t xml:space="preserve"> validation</w:t>
-      </w:r>
-      <w:r>
-        <w:rPr>
-          <w:rFonts w:asciiTheme="majorHAnsi" w:hAnsiTheme="majorHAnsi" w:cstheme="majorHAnsi"/>
-        </w:rPr>
-        <w:t xml:space="preserve"> </w:t>
-      </w:r>
-      <w:r>
-        <w:rPr>
-          <w:rFonts w:asciiTheme="majorHAnsi" w:hAnsiTheme="majorHAnsi" w:cstheme="majorHAnsi"/>
-        </w:rPr>
-        <w:t>–</w:t>
-      </w:r>
-      <w:r>
-        <w:rPr>
-          <w:rFonts w:asciiTheme="majorHAnsi" w:hAnsiTheme="majorHAnsi" w:cstheme="majorHAnsi"/>
-        </w:rPr>
-        <w:t xml:space="preserve"> </w:t>
-      </w:r>
-      <w:r>
-        <w:rPr>
-          <w:rFonts w:asciiTheme="majorHAnsi" w:hAnsiTheme="majorHAnsi" w:cstheme="majorHAnsi"/>
-        </w:rPr>
-        <w:t xml:space="preserve">The system </w:t>
-      </w:r>
-      <w:r>
-        <w:rPr>
-          <w:rFonts w:asciiTheme="majorHAnsi" w:hAnsiTheme="majorHAnsi" w:cstheme="majorHAnsi"/>
-          <w:b/>
-          <w:bCs/>
-        </w:rPr>
-        <w:t>validates</w:t>
-      </w:r>
-      <w:r>
-        <w:rPr>
-          <w:rFonts w:asciiTheme="majorHAnsi" w:hAnsiTheme="majorHAnsi" w:cstheme="majorHAnsi"/>
-        </w:rPr>
-        <w:t xml:space="preserve"> the altitude readings against </w:t>
-      </w:r>
-      <w:r>
-        <w:rPr>
-          <w:rFonts w:asciiTheme="majorHAnsi" w:hAnsiTheme="majorHAnsi" w:cstheme="majorHAnsi"/>
-          <w:b/>
-          <w:bCs/>
-        </w:rPr>
-        <w:t>predefined thresholds</w:t>
-      </w:r>
-      <w:r>
-        <w:rPr>
-          <w:rFonts w:asciiTheme="majorHAnsi" w:hAnsiTheme="majorHAnsi" w:cstheme="majorHAnsi"/>
-        </w:rPr>
-        <w:t xml:space="preserve">. If a value </w:t>
-      </w:r>
-      <w:r>
-        <w:rPr>
-          <w:rFonts w:asciiTheme="majorHAnsi" w:hAnsiTheme="majorHAnsi" w:cstheme="majorHAnsi"/>
-          <w:b/>
-          <w:bCs/>
-        </w:rPr>
-        <w:t>exceeds the limit</w:t>
-      </w:r>
-      <w:r>
-        <w:rPr>
-          <w:rFonts w:asciiTheme="majorHAnsi" w:hAnsiTheme="majorHAnsi" w:cstheme="majorHAnsi"/>
-        </w:rPr>
-        <w:t xml:space="preserve">, an alarm is triggered up to a </w:t>
-      </w:r>
-      <w:r>
-        <w:rPr>
-          <w:rFonts w:asciiTheme="majorHAnsi" w:hAnsiTheme="majorHAnsi" w:cstheme="majorHAnsi"/>
-          <w:b/>
-          <w:bCs/>
-        </w:rPr>
-        <w:t xml:space="preserve">specified </w:t>
-      </w:r>
-      <w:r>
-        <w:rPr>
-          <w:rFonts w:asciiTheme="majorHAnsi" w:hAnsiTheme="majorHAnsi" w:cstheme="majorHAnsi"/>
-          <w:b/>
-          <w:bCs/>
-        </w:rPr>
-        <w:t>interval</w:t>
-      </w:r>
-      <w:r>
-        <w:rPr>
-          <w:rFonts w:asciiTheme="majorHAnsi" w:hAnsiTheme="majorHAnsi" w:cstheme="majorHAnsi"/>
-        </w:rPr>
-        <w:t>.</w:t>
-      </w:r>
-    </w:p>
-    <w:p>
-      <w:pPr>
-        <w:rPr>
-          <w:rFonts w:asciiTheme="majorHAnsi" w:hAnsiTheme="majorHAnsi" w:cstheme="majorHAnsi"/>
-          <w:b/>
-          <w:bCs/>
-        </w:rPr>
-      </w:pPr>
-      <w:r>
-        <w:rPr>
-          <w:rFonts w:asciiTheme="majorHAnsi" w:hAnsiTheme="majorHAnsi" w:cstheme="majorHAnsi"/>
-          <w:b/>
-          <w:bCs/>
-        </w:rPr>
-        <w:t>2.2 High Level Architecture</w:t>
-      </w:r>
-    </w:p>
-    <w:p>
-      <w:pPr>
-        <w:rPr>
-          <w:rFonts w:asciiTheme="majorHAnsi" w:hAnsiTheme="majorHAnsi" w:cstheme="majorHAnsi"/>
           <w:lang w:val="en-IN"/>
         </w:rPr>
       </w:pPr>
@@ -569,10 +632,10 @@
           <w:lang w:val="en-IN"/>
         </w:rPr>
         <w:drawing>
-          <wp:inline distT="0" distB="0" distL="0" distR="0" wp14:anchorId="169A5739" wp14:editId="398FCFFE">
-            <wp:extent cx="5486400" cy="711835"/>
-            <wp:effectExtent l="0" t="0" r="0" b="0"/>
-            <wp:docPr id="550993247" name="Picture 2"/>
+          <wp:inline distT="0" distB="0" distL="0" distR="0" wp14:anchorId="3DF81336" wp14:editId="7C2CB43A">
+            <wp:extent cx="5441950" cy="584200"/>
+            <wp:effectExtent l="0" t="0" r="6350" b="6350"/>
+            <wp:docPr id="565269656" name="Picture 2"/>
             <wp:cNvGraphicFramePr>
               <a:graphicFrameLocks xmlns:a="http://schemas.openxmlformats.org/drawingml/2006/main" noChangeAspect="1"/>
             </wp:cNvGraphicFramePr>
@@ -601,7 +664,7 @@
                   <pic:spPr bwMode="auto">
                     <a:xfrm>
                       <a:off x="0" y="0"/>
-                      <a:ext cx="5486400" cy="711835"/>
+                      <a:ext cx="5441950" cy="584200"/>
                     </a:xfrm>
                     <a:prstGeom prst="rect">
                       <a:avLst/>
@@ -620,6 +683,14 @@
     </w:p>
     <w:p>
       <w:pPr>
+        <w:rPr>
+          <w:rFonts w:asciiTheme="majorHAnsi" w:hAnsiTheme="majorHAnsi" w:cstheme="majorHAnsi"/>
+          <w:lang w:val="en-IN"/>
+        </w:rPr>
+      </w:pPr>
+    </w:p>
+    <w:p>
+      <w:pPr>
         <w:pStyle w:val="Heading2"/>
         <w:rPr>
           <w:rFonts w:cstheme="majorHAnsi"/>
@@ -656,28 +727,24 @@
         </w:rPr>
         <w:t xml:space="preserve">is designed to follow layered </w:t>
       </w:r>
-      <w:proofErr w:type="gramStart"/>
-      <w:r>
-        <w:rPr>
-          <w:rFonts w:asciiTheme="majorHAnsi" w:hAnsiTheme="majorHAnsi" w:cstheme="majorHAnsi"/>
-        </w:rPr>
-        <w:t>architecture ,</w:t>
-      </w:r>
-      <w:proofErr w:type="gramEnd"/>
+      <w:r>
+        <w:rPr>
+          <w:rFonts w:asciiTheme="majorHAnsi" w:hAnsiTheme="majorHAnsi" w:cstheme="majorHAnsi"/>
+        </w:rPr>
+        <w:t>architecture,</w:t>
+      </w:r>
       <w:r>
         <w:rPr>
           <w:rFonts w:asciiTheme="majorHAnsi" w:hAnsiTheme="majorHAnsi" w:cstheme="majorHAnsi"/>
         </w:rPr>
         <w:t xml:space="preserve"> that </w:t>
       </w:r>
-      <w:proofErr w:type="gramStart"/>
-      <w:r>
-        <w:rPr>
-          <w:rFonts w:asciiTheme="majorHAnsi" w:hAnsiTheme="majorHAnsi" w:cstheme="majorHAnsi"/>
-        </w:rPr>
-        <w:t>ensure</w:t>
-      </w:r>
-      <w:proofErr w:type="gramEnd"/>
+      <w:r>
+        <w:rPr>
+          <w:rFonts w:asciiTheme="majorHAnsi" w:hAnsiTheme="majorHAnsi" w:cstheme="majorHAnsi"/>
+        </w:rPr>
+        <w:t>ensures</w:t>
+      </w:r>
       <w:r>
         <w:rPr>
           <w:rFonts w:asciiTheme="majorHAnsi" w:hAnsiTheme="majorHAnsi" w:cstheme="majorHAnsi"/>
@@ -828,7 +895,6 @@
                 <w:rFonts w:asciiTheme="majorHAnsi" w:hAnsiTheme="majorHAnsi" w:cstheme="majorHAnsi"/>
               </w:rPr>
             </w:pPr>
-            <w:proofErr w:type="spellStart"/>
             <w:r>
               <w:rPr>
                 <w:rFonts w:asciiTheme="majorHAnsi" w:hAnsiTheme="majorHAnsi" w:cstheme="majorHAnsi"/>
@@ -839,9 +905,20 @@
               <w:rPr>
                 <w:rFonts w:asciiTheme="majorHAnsi" w:hAnsiTheme="majorHAnsi" w:cstheme="majorHAnsi"/>
               </w:rPr>
-              <w:t>Module</w:t>
+              <w:t xml:space="preserve"> </w:t>
             </w:r>
-            <w:proofErr w:type="spellEnd"/>
+            <w:r>
+              <w:rPr>
+                <w:rFonts w:asciiTheme="majorHAnsi" w:hAnsiTheme="majorHAnsi" w:cstheme="majorHAnsi"/>
+              </w:rPr>
+              <w:t>M</w:t>
+            </w:r>
+            <w:r>
+              <w:rPr>
+                <w:rFonts w:asciiTheme="majorHAnsi" w:hAnsiTheme="majorHAnsi" w:cstheme="majorHAnsi"/>
+              </w:rPr>
+              <w:t>anagement</w:t>
+            </w:r>
           </w:p>
         </w:tc>
         <w:tc>
@@ -858,7 +935,25 @@
               <w:rPr>
                 <w:rFonts w:asciiTheme="majorHAnsi" w:hAnsiTheme="majorHAnsi" w:cstheme="majorHAnsi"/>
               </w:rPr>
-              <w:t xml:space="preserve">Initialize the sensor module with ‘f’ </w:t>
+              <w:t xml:space="preserve">Initialize the sensor module with </w:t>
+            </w:r>
+            <w:r>
+              <w:rPr>
+                <w:rFonts w:asciiTheme="majorHAnsi" w:hAnsiTheme="majorHAnsi" w:cstheme="majorHAnsi"/>
+              </w:rPr>
+              <w:t>[f</w:t>
+            </w:r>
+            <w:r>
+              <w:rPr>
+                <w:rFonts w:asciiTheme="majorHAnsi" w:hAnsiTheme="majorHAnsi" w:cstheme="majorHAnsi"/>
+              </w:rPr>
+              <w:t>]</w:t>
+            </w:r>
+            <w:r>
+              <w:rPr>
+                <w:rFonts w:asciiTheme="majorHAnsi" w:hAnsiTheme="majorHAnsi" w:cstheme="majorHAnsi"/>
+              </w:rPr>
+              <w:t xml:space="preserve"> </w:t>
             </w:r>
             <w:r>
               <w:rPr>
@@ -870,7 +965,38 @@
               <w:rPr>
                 <w:rFonts w:asciiTheme="majorHAnsi" w:hAnsiTheme="majorHAnsi" w:cstheme="majorHAnsi"/>
               </w:rPr>
-              <w:t xml:space="preserve"> Read data from ‘I’ interval and push to the message queue </w:t>
+              <w:t xml:space="preserve"> </w:t>
+            </w:r>
+            <w:r>
+              <w:rPr>
+                <w:rFonts w:asciiTheme="majorHAnsi" w:hAnsiTheme="majorHAnsi" w:cstheme="majorHAnsi"/>
+              </w:rPr>
+              <w:lastRenderedPageBreak/>
+              <w:t xml:space="preserve">Read data from </w:t>
+            </w:r>
+            <w:r>
+              <w:rPr>
+                <w:rFonts w:asciiTheme="majorHAnsi" w:hAnsiTheme="majorHAnsi" w:cstheme="majorHAnsi"/>
+              </w:rPr>
+              <w:t>[</w:t>
+            </w:r>
+            <w:r>
+              <w:rPr>
+                <w:rFonts w:asciiTheme="majorHAnsi" w:hAnsiTheme="majorHAnsi" w:cstheme="majorHAnsi"/>
+              </w:rPr>
+              <w:t>I</w:t>
+            </w:r>
+            <w:r>
+              <w:rPr>
+                <w:rFonts w:asciiTheme="majorHAnsi" w:hAnsiTheme="majorHAnsi" w:cstheme="majorHAnsi"/>
+              </w:rPr>
+              <w:t>]</w:t>
+            </w:r>
+            <w:r>
+              <w:rPr>
+                <w:rFonts w:asciiTheme="majorHAnsi" w:hAnsiTheme="majorHAnsi" w:cstheme="majorHAnsi"/>
+              </w:rPr>
+              <w:t xml:space="preserve"> interval and push to the message queue </w:t>
             </w:r>
           </w:p>
         </w:tc>
@@ -906,20 +1032,12 @@
                 <w:rFonts w:asciiTheme="majorHAnsi" w:hAnsiTheme="majorHAnsi" w:cstheme="majorHAnsi"/>
               </w:rPr>
             </w:pPr>
-            <w:proofErr w:type="spellStart"/>
             <w:r>
               <w:rPr>
                 <w:rFonts w:asciiTheme="majorHAnsi" w:hAnsiTheme="majorHAnsi" w:cstheme="majorHAnsi"/>
               </w:rPr>
-              <w:t>Process</w:t>
+              <w:t>Validation Engine</w:t>
             </w:r>
-            <w:r>
-              <w:rPr>
-                <w:rFonts w:asciiTheme="majorHAnsi" w:hAnsiTheme="majorHAnsi" w:cstheme="majorHAnsi"/>
-              </w:rPr>
-              <w:t>Module</w:t>
-            </w:r>
-            <w:proofErr w:type="spellEnd"/>
           </w:p>
         </w:tc>
         <w:tc>
@@ -942,7 +1060,43 @@
               <w:rPr>
                 <w:rFonts w:asciiTheme="majorHAnsi" w:hAnsiTheme="majorHAnsi" w:cstheme="majorHAnsi"/>
               </w:rPr>
-              <w:t xml:space="preserve">perform validation. If processed output </w:t>
+              <w:t>perform validation</w:t>
+            </w:r>
+            <w:r>
+              <w:rPr>
+                <w:rFonts w:asciiTheme="majorHAnsi" w:hAnsiTheme="majorHAnsi" w:cstheme="majorHAnsi"/>
+              </w:rPr>
+              <w:t xml:space="preserve"> with </w:t>
+            </w:r>
+            <w:r>
+              <w:rPr>
+                <w:rFonts w:asciiTheme="majorHAnsi" w:hAnsiTheme="majorHAnsi" w:cstheme="majorHAnsi"/>
+              </w:rPr>
+              <w:t>[THRESHOLD_</w:t>
+            </w:r>
+            <w:r>
+              <w:rPr>
+                <w:rFonts w:asciiTheme="majorHAnsi" w:hAnsiTheme="majorHAnsi" w:cstheme="majorHAnsi"/>
+              </w:rPr>
+              <w:t>MIN,</w:t>
+            </w:r>
+            <w:r>
+              <w:rPr>
+                <w:rFonts w:asciiTheme="majorHAnsi" w:hAnsiTheme="majorHAnsi" w:cstheme="majorHAnsi"/>
+              </w:rPr>
+              <w:t xml:space="preserve"> THRESOLD_MAX</w:t>
+            </w:r>
+            <w:r>
+              <w:rPr>
+                <w:rFonts w:asciiTheme="majorHAnsi" w:hAnsiTheme="majorHAnsi" w:cstheme="majorHAnsi"/>
+              </w:rPr>
+              <w:t>]</w:t>
+            </w:r>
+            <w:r>
+              <w:rPr>
+                <w:rFonts w:asciiTheme="majorHAnsi" w:hAnsiTheme="majorHAnsi" w:cstheme="majorHAnsi"/>
+              </w:rPr>
+              <w:t xml:space="preserve">. If processed output </w:t>
             </w:r>
             <w:r>
               <w:rPr>
@@ -960,7 +1114,19 @@
               <w:rPr>
                 <w:rFonts w:asciiTheme="majorHAnsi" w:hAnsiTheme="majorHAnsi" w:cstheme="majorHAnsi"/>
               </w:rPr>
-              <w:t>, it</w:t>
+              <w:t xml:space="preserve"> </w:t>
+            </w:r>
+            <w:r>
+              <w:rPr>
+                <w:rFonts w:asciiTheme="majorHAnsi" w:hAnsiTheme="majorHAnsi" w:cstheme="majorHAnsi"/>
+              </w:rPr>
+              <w:t>it</w:t>
+            </w:r>
+            <w:r>
+              <w:rPr>
+                <w:rFonts w:asciiTheme="majorHAnsi" w:hAnsiTheme="majorHAnsi" w:cstheme="majorHAnsi"/>
+              </w:rPr>
+              <w:t>,</w:t>
             </w:r>
             <w:r>
               <w:rPr>
@@ -1007,14 +1173,18 @@
                 <w:rFonts w:asciiTheme="majorHAnsi" w:hAnsiTheme="majorHAnsi" w:cstheme="majorHAnsi"/>
               </w:rPr>
             </w:pPr>
-            <w:proofErr w:type="spellStart"/>
             <w:r>
               <w:rPr>
                 <w:rFonts w:asciiTheme="majorHAnsi" w:hAnsiTheme="majorHAnsi" w:cstheme="majorHAnsi"/>
               </w:rPr>
-              <w:t>AlarmModule</w:t>
+              <w:t>Alarm</w:t>
             </w:r>
-            <w:proofErr w:type="spellEnd"/>
+            <w:r>
+              <w:rPr>
+                <w:rFonts w:asciiTheme="majorHAnsi" w:hAnsiTheme="majorHAnsi" w:cstheme="majorHAnsi"/>
+              </w:rPr>
+              <w:t xml:space="preserve"> Management</w:t>
+            </w:r>
           </w:p>
         </w:tc>
         <w:tc>
@@ -1043,7 +1213,25 @@
               <w:rPr>
                 <w:rFonts w:asciiTheme="majorHAnsi" w:hAnsiTheme="majorHAnsi" w:cstheme="majorHAnsi"/>
               </w:rPr>
-              <w:t xml:space="preserve"> a defined timeout.</w:t>
+              <w:t xml:space="preserve"> a defined timeout</w:t>
+            </w:r>
+            <w:r>
+              <w:rPr>
+                <w:rFonts w:asciiTheme="majorHAnsi" w:hAnsiTheme="majorHAnsi" w:cstheme="majorHAnsi"/>
+              </w:rPr>
+              <w:t xml:space="preserve"> </w:t>
+            </w:r>
+            <w:r>
+              <w:rPr>
+                <w:rFonts w:asciiTheme="majorHAnsi" w:hAnsiTheme="majorHAnsi" w:cstheme="majorHAnsi"/>
+              </w:rPr>
+              <w:t>[ALARM_TIMEOUT]</w:t>
+            </w:r>
+            <w:r>
+              <w:rPr>
+                <w:rFonts w:asciiTheme="majorHAnsi" w:hAnsiTheme="majorHAnsi" w:cstheme="majorHAnsi"/>
+              </w:rPr>
+              <w:t>.</w:t>
             </w:r>
           </w:p>
         </w:tc>
@@ -1092,10 +1280,10 @@
           <w:lang w:val="en-IN"/>
         </w:rPr>
         <w:drawing>
-          <wp:inline distT="0" distB="0" distL="0" distR="0" wp14:anchorId="6F7725F8" wp14:editId="51861124">
-            <wp:extent cx="5486400" cy="3226435"/>
+          <wp:inline distT="0" distB="0" distL="0" distR="0" wp14:anchorId="435722A7" wp14:editId="1B361DD9">
+            <wp:extent cx="5486400" cy="1455420"/>
             <wp:effectExtent l="0" t="0" r="0" b="0"/>
-            <wp:docPr id="807457551" name="Picture 4"/>
+            <wp:docPr id="766529023" name="Picture 6"/>
             <wp:cNvGraphicFramePr>
               <a:graphicFrameLocks xmlns:a="http://schemas.openxmlformats.org/drawingml/2006/main" noChangeAspect="1"/>
             </wp:cNvGraphicFramePr>
@@ -1103,7 +1291,7 @@
               <a:graphicData uri="http://schemas.openxmlformats.org/drawingml/2006/picture">
                 <pic:pic xmlns:pic="http://schemas.openxmlformats.org/drawingml/2006/picture">
                   <pic:nvPicPr>
-                    <pic:cNvPr id="0" name="Picture 13"/>
+                    <pic:cNvPr id="0" name="Picture 20"/>
                     <pic:cNvPicPr>
                       <a:picLocks noChangeAspect="1" noChangeArrowheads="1"/>
                     </pic:cNvPicPr>
@@ -1124,7 +1312,7 @@
                   <pic:spPr bwMode="auto">
                     <a:xfrm>
                       <a:off x="0" y="0"/>
-                      <a:ext cx="5486400" cy="3226435"/>
+                      <a:ext cx="5486400" cy="1455420"/>
                     </a:xfrm>
                     <a:prstGeom prst="rect">
                       <a:avLst/>
@@ -1143,6 +1331,14 @@
     </w:p>
     <w:p>
       <w:pPr>
+        <w:rPr>
+          <w:rFonts w:asciiTheme="majorHAnsi" w:hAnsiTheme="majorHAnsi" w:cstheme="majorHAnsi"/>
+          <w:lang w:val="en-IN"/>
+        </w:rPr>
+      </w:pPr>
+    </w:p>
+    <w:p>
+      <w:pPr>
         <w:pStyle w:val="Heading2"/>
         <w:rPr>
           <w:rFonts w:cstheme="majorHAnsi"/>
@@ -1161,6 +1357,11 @@
     </w:p>
     <w:p>
       <w:pPr>
+        <w:pStyle w:val="ListParagraph"/>
+        <w:numPr>
+          <w:ilvl w:val="1"/>
+          <w:numId w:val="29"/>
+        </w:numPr>
         <w:rPr>
           <w:rFonts w:asciiTheme="majorHAnsi" w:hAnsiTheme="majorHAnsi" w:cstheme="majorHAnsi"/>
           <w:b/>
@@ -1173,7 +1374,7 @@
           <w:b/>
           <w:bCs/>
         </w:rPr>
-        <w:t>4</w:t>
+        <w:t>Sensor M</w:t>
       </w:r>
       <w:r>
         <w:rPr>
@@ -1181,393 +1382,410 @@
           <w:b/>
           <w:bCs/>
         </w:rPr>
-        <w:t xml:space="preserve">.1 Sensor Module </w:t>
+        <w:t>anagement</w:t>
+      </w:r>
+      <w:r>
+        <w:rPr>
+          <w:rFonts w:asciiTheme="majorHAnsi" w:hAnsiTheme="majorHAnsi" w:cstheme="majorHAnsi"/>
+          <w:b/>
+          <w:bCs/>
+        </w:rPr>
+        <w:t xml:space="preserve"> </w:t>
       </w:r>
     </w:p>
     <w:p>
       <w:pPr>
+        <w:rPr>
+          <w:rFonts w:asciiTheme="majorHAnsi" w:hAnsiTheme="majorHAnsi" w:cstheme="majorHAnsi"/>
+        </w:rPr>
+      </w:pPr>
+      <w:r>
+        <w:rPr>
+          <w:rFonts w:asciiTheme="majorHAnsi" w:hAnsiTheme="majorHAnsi" w:cstheme="majorHAnsi"/>
+        </w:rPr>
+        <w:t>4.1.</w:t>
+      </w:r>
+      <w:r>
+        <w:rPr>
+          <w:rFonts w:asciiTheme="majorHAnsi" w:hAnsiTheme="majorHAnsi" w:cstheme="majorHAnsi"/>
+        </w:rPr>
+        <w:t>1.</w:t>
+      </w:r>
+      <w:r>
+        <w:rPr>
+          <w:rFonts w:asciiTheme="majorHAnsi" w:hAnsiTheme="majorHAnsi" w:cstheme="majorHAnsi"/>
+        </w:rPr>
+        <w:t xml:space="preserve"> This</w:t>
+      </w:r>
+      <w:r>
+        <w:rPr>
+          <w:rFonts w:asciiTheme="majorHAnsi" w:hAnsiTheme="majorHAnsi" w:cstheme="majorHAnsi"/>
+        </w:rPr>
+        <w:t xml:space="preserve"> module </w:t>
+      </w:r>
+      <w:r>
+        <w:rPr>
+          <w:rFonts w:asciiTheme="majorHAnsi" w:hAnsiTheme="majorHAnsi" w:cstheme="majorHAnsi"/>
+        </w:rPr>
+        <w:t>is also</w:t>
+      </w:r>
+      <w:r>
+        <w:rPr>
+          <w:rFonts w:asciiTheme="majorHAnsi" w:hAnsiTheme="majorHAnsi" w:cstheme="majorHAnsi"/>
+        </w:rPr>
+        <w:t xml:space="preserve"> responsible for the initialization of sensor module with </w:t>
+      </w:r>
+      <w:r>
+        <w:rPr>
+          <w:rFonts w:asciiTheme="majorHAnsi" w:hAnsiTheme="majorHAnsi" w:cstheme="majorHAnsi"/>
+        </w:rPr>
+        <w:t>[f]</w:t>
+      </w:r>
+      <w:r>
+        <w:rPr>
+          <w:rFonts w:asciiTheme="majorHAnsi" w:hAnsiTheme="majorHAnsi" w:cstheme="majorHAnsi"/>
+        </w:rPr>
+        <w:t xml:space="preserve"> frequency.</w:t>
+      </w:r>
+    </w:p>
+    <w:p>
+      <w:pPr>
+        <w:rPr>
+          <w:rFonts w:asciiTheme="majorHAnsi" w:hAnsiTheme="majorHAnsi" w:cstheme="majorHAnsi"/>
+        </w:rPr>
+      </w:pPr>
+      <w:r>
+        <w:rPr>
+          <w:rFonts w:asciiTheme="majorHAnsi" w:hAnsiTheme="majorHAnsi" w:cstheme="majorHAnsi"/>
+        </w:rPr>
+        <w:t>4.1.</w:t>
+      </w:r>
+      <w:r>
+        <w:rPr>
+          <w:rFonts w:asciiTheme="majorHAnsi" w:hAnsiTheme="majorHAnsi" w:cstheme="majorHAnsi"/>
+        </w:rPr>
+        <w:t>2.</w:t>
+      </w:r>
+      <w:r>
+        <w:rPr>
+          <w:rFonts w:asciiTheme="majorHAnsi" w:hAnsiTheme="majorHAnsi" w:cstheme="majorHAnsi"/>
+        </w:rPr>
+        <w:t xml:space="preserve"> It</w:t>
+      </w:r>
+      <w:r>
+        <w:rPr>
+          <w:rFonts w:asciiTheme="majorHAnsi" w:hAnsiTheme="majorHAnsi" w:cstheme="majorHAnsi"/>
+        </w:rPr>
+        <w:t xml:space="preserve"> </w:t>
+      </w:r>
+      <w:r>
+        <w:rPr>
+          <w:rFonts w:asciiTheme="majorHAnsi" w:hAnsiTheme="majorHAnsi" w:cstheme="majorHAnsi"/>
+        </w:rPr>
+        <w:t>triggers</w:t>
+      </w:r>
+      <w:r>
+        <w:rPr>
+          <w:rFonts w:asciiTheme="majorHAnsi" w:hAnsiTheme="majorHAnsi" w:cstheme="majorHAnsi"/>
+        </w:rPr>
+        <w:t xml:space="preserve"> SensorReadData()</w:t>
+      </w:r>
+      <w:r>
+        <w:rPr>
+          <w:rFonts w:asciiTheme="majorHAnsi" w:hAnsiTheme="majorHAnsi" w:cstheme="majorHAnsi"/>
+        </w:rPr>
+        <w:t xml:space="preserve"> </w:t>
+      </w:r>
+      <w:r>
+        <w:rPr>
+          <w:rFonts w:asciiTheme="majorHAnsi" w:hAnsiTheme="majorHAnsi" w:cstheme="majorHAnsi"/>
+        </w:rPr>
+        <w:t xml:space="preserve">in </w:t>
+      </w:r>
+      <w:r>
+        <w:rPr>
+          <w:rFonts w:asciiTheme="majorHAnsi" w:hAnsiTheme="majorHAnsi" w:cstheme="majorHAnsi"/>
+        </w:rPr>
+        <w:t>[</w:t>
+      </w:r>
+      <w:r>
+        <w:rPr>
+          <w:rFonts w:asciiTheme="majorHAnsi" w:hAnsiTheme="majorHAnsi" w:cstheme="majorHAnsi"/>
+        </w:rPr>
+        <w:t>I</w:t>
+      </w:r>
+      <w:r>
+        <w:rPr>
+          <w:rFonts w:asciiTheme="majorHAnsi" w:hAnsiTheme="majorHAnsi" w:cstheme="majorHAnsi"/>
+        </w:rPr>
+        <w:t>]</w:t>
+      </w:r>
+      <w:r>
+        <w:rPr>
+          <w:rFonts w:asciiTheme="majorHAnsi" w:hAnsiTheme="majorHAnsi" w:cstheme="majorHAnsi"/>
+        </w:rPr>
+        <w:t xml:space="preserve"> interval and push the raw data in </w:t>
+      </w:r>
+      <w:r>
+        <w:rPr>
+          <w:rFonts w:asciiTheme="majorHAnsi" w:hAnsiTheme="majorHAnsi" w:cstheme="majorHAnsi"/>
+        </w:rPr>
+        <w:t>a</w:t>
+      </w:r>
+      <w:r>
+        <w:rPr>
+          <w:rFonts w:asciiTheme="majorHAnsi" w:hAnsiTheme="majorHAnsi" w:cstheme="majorHAnsi"/>
+        </w:rPr>
+        <w:t xml:space="preserve"> queue. We expect data with </w:t>
+      </w:r>
+      <w:r>
+        <w:rPr>
+          <w:rFonts w:asciiTheme="majorHAnsi" w:hAnsiTheme="majorHAnsi" w:cstheme="majorHAnsi"/>
+        </w:rPr>
+        <w:t>limit of</w:t>
+      </w:r>
+      <w:r>
+        <w:rPr>
+          <w:rFonts w:asciiTheme="majorHAnsi" w:hAnsiTheme="majorHAnsi" w:cstheme="majorHAnsi"/>
+        </w:rPr>
+        <w:t xml:space="preserve"> 0 to max value of 4 bytes.</w:t>
+      </w:r>
+      <w:r>
+        <w:rPr>
+          <w:rFonts w:asciiTheme="majorHAnsi" w:hAnsiTheme="majorHAnsi" w:cstheme="majorHAnsi"/>
+        </w:rPr>
+        <w:t xml:space="preserve"> </w:t>
+      </w:r>
+    </w:p>
+    <w:p>
+      <w:pPr>
         <w:pStyle w:val="ListParagraph"/>
         <w:numPr>
-          <w:ilvl w:val="0"/>
-          <w:numId w:val="23"/>
+          <w:ilvl w:val="1"/>
+          <w:numId w:val="29"/>
         </w:numPr>
         <w:rPr>
           <w:rFonts w:asciiTheme="majorHAnsi" w:hAnsiTheme="majorHAnsi" w:cstheme="majorHAnsi"/>
-        </w:rPr>
-      </w:pPr>
-      <w:r>
-        <w:rPr>
-          <w:rFonts w:asciiTheme="majorHAnsi" w:hAnsiTheme="majorHAnsi" w:cstheme="majorHAnsi"/>
-        </w:rPr>
-        <w:t xml:space="preserve">This module </w:t>
-      </w:r>
-      <w:proofErr w:type="gramStart"/>
-      <w:r>
-        <w:rPr>
-          <w:rFonts w:asciiTheme="majorHAnsi" w:hAnsiTheme="majorHAnsi" w:cstheme="majorHAnsi"/>
-        </w:rPr>
-        <w:t>also</w:t>
-      </w:r>
-      <w:proofErr w:type="gramEnd"/>
-      <w:r>
-        <w:rPr>
-          <w:rFonts w:asciiTheme="majorHAnsi" w:hAnsiTheme="majorHAnsi" w:cstheme="majorHAnsi"/>
-        </w:rPr>
-        <w:t xml:space="preserve"> responsible for the initialization of sensor module with ‘f </w:t>
-      </w:r>
-      <w:proofErr w:type="gramStart"/>
-      <w:r>
-        <w:rPr>
-          <w:rFonts w:asciiTheme="majorHAnsi" w:hAnsiTheme="majorHAnsi" w:cstheme="majorHAnsi"/>
-        </w:rPr>
-        <w:t>‘ frequency</w:t>
-      </w:r>
-      <w:proofErr w:type="gramEnd"/>
-      <w:r>
-        <w:rPr>
-          <w:rFonts w:asciiTheme="majorHAnsi" w:hAnsiTheme="majorHAnsi" w:cstheme="majorHAnsi"/>
-        </w:rPr>
-        <w:t>.</w:t>
+          <w:b/>
+          <w:bCs/>
+        </w:rPr>
+      </w:pPr>
+      <w:r>
+        <w:rPr>
+          <w:rFonts w:asciiTheme="majorHAnsi" w:hAnsiTheme="majorHAnsi" w:cstheme="majorHAnsi"/>
+          <w:b/>
+          <w:bCs/>
+        </w:rPr>
+        <w:t>Validation Engine</w:t>
+      </w:r>
+      <w:r>
+        <w:rPr>
+          <w:rFonts w:asciiTheme="majorHAnsi" w:hAnsiTheme="majorHAnsi" w:cstheme="majorHAnsi"/>
+          <w:b/>
+          <w:bCs/>
+        </w:rPr>
+        <w:t xml:space="preserve"> </w:t>
       </w:r>
     </w:p>
     <w:p>
       <w:pPr>
+        <w:rPr>
+          <w:rFonts w:asciiTheme="majorHAnsi" w:hAnsiTheme="majorHAnsi" w:cstheme="majorHAnsi"/>
+        </w:rPr>
+      </w:pPr>
+      <w:r>
+        <w:rPr>
+          <w:rFonts w:asciiTheme="majorHAnsi" w:hAnsiTheme="majorHAnsi" w:cstheme="majorHAnsi"/>
+        </w:rPr>
+        <w:t>4.2.1.</w:t>
+      </w:r>
+      <w:r>
+        <w:rPr>
+          <w:rFonts w:asciiTheme="majorHAnsi" w:hAnsiTheme="majorHAnsi" w:cstheme="majorHAnsi"/>
+        </w:rPr>
+        <w:t xml:space="preserve"> The</w:t>
+      </w:r>
+      <w:r>
+        <w:rPr>
+          <w:rFonts w:asciiTheme="majorHAnsi" w:hAnsiTheme="majorHAnsi" w:cstheme="majorHAnsi"/>
+        </w:rPr>
+        <w:t xml:space="preserve"> module </w:t>
+      </w:r>
+      <w:r>
+        <w:rPr>
+          <w:rFonts w:asciiTheme="majorHAnsi" w:hAnsiTheme="majorHAnsi" w:cstheme="majorHAnsi"/>
+        </w:rPr>
+        <w:t>is responsible</w:t>
+      </w:r>
+      <w:r>
+        <w:rPr>
+          <w:rFonts w:asciiTheme="majorHAnsi" w:hAnsiTheme="majorHAnsi" w:cstheme="majorHAnsi"/>
+        </w:rPr>
+        <w:t xml:space="preserve"> for </w:t>
+      </w:r>
+      <w:r>
+        <w:rPr>
+          <w:rFonts w:asciiTheme="majorHAnsi" w:hAnsiTheme="majorHAnsi" w:cstheme="majorHAnsi"/>
+        </w:rPr>
+        <w:t>parsing</w:t>
+      </w:r>
+      <w:r>
+        <w:rPr>
+          <w:rFonts w:asciiTheme="majorHAnsi" w:hAnsiTheme="majorHAnsi" w:cstheme="majorHAnsi"/>
+        </w:rPr>
+        <w:t xml:space="preserve"> the raw data from the message queue and </w:t>
+      </w:r>
+      <w:r>
+        <w:rPr>
+          <w:rFonts w:asciiTheme="majorHAnsi" w:hAnsiTheme="majorHAnsi" w:cstheme="majorHAnsi"/>
+        </w:rPr>
+        <w:t>converting it</w:t>
+      </w:r>
+      <w:r>
+        <w:rPr>
+          <w:rFonts w:asciiTheme="majorHAnsi" w:hAnsiTheme="majorHAnsi" w:cstheme="majorHAnsi"/>
+        </w:rPr>
+        <w:t xml:space="preserve"> to required altitude format. We expect a </w:t>
+      </w:r>
+      <w:r>
+        <w:rPr>
+          <w:rFonts w:asciiTheme="majorHAnsi" w:hAnsiTheme="majorHAnsi" w:cstheme="majorHAnsi"/>
+        </w:rPr>
+        <w:t>4-byte</w:t>
+      </w:r>
+      <w:r>
+        <w:rPr>
+          <w:rFonts w:asciiTheme="majorHAnsi" w:hAnsiTheme="majorHAnsi" w:cstheme="majorHAnsi"/>
+        </w:rPr>
+        <w:t xml:space="preserve"> data in message queue.</w:t>
+      </w:r>
+    </w:p>
+    <w:p>
+      <w:pPr>
+        <w:rPr>
+          <w:rFonts w:asciiTheme="majorHAnsi" w:hAnsiTheme="majorHAnsi" w:cstheme="majorHAnsi"/>
+        </w:rPr>
+      </w:pPr>
+      <w:r>
+        <w:rPr>
+          <w:rFonts w:asciiTheme="majorHAnsi" w:hAnsiTheme="majorHAnsi" w:cstheme="majorHAnsi"/>
+        </w:rPr>
+        <w:t>4.2.2.</w:t>
+      </w:r>
+      <w:r>
+        <w:rPr>
+          <w:rFonts w:asciiTheme="majorHAnsi" w:hAnsiTheme="majorHAnsi" w:cstheme="majorHAnsi"/>
+        </w:rPr>
+        <w:t xml:space="preserve"> Validate</w:t>
+      </w:r>
+      <w:r>
+        <w:rPr>
+          <w:rFonts w:asciiTheme="majorHAnsi" w:hAnsiTheme="majorHAnsi" w:cstheme="majorHAnsi"/>
+        </w:rPr>
+        <w:t xml:space="preserve"> the altitude data with predefined threshold value set in the system. If it </w:t>
+      </w:r>
+      <w:r>
+        <w:rPr>
+          <w:rFonts w:asciiTheme="majorHAnsi" w:hAnsiTheme="majorHAnsi" w:cstheme="majorHAnsi"/>
+        </w:rPr>
+        <w:t>exceeds</w:t>
+      </w:r>
+      <w:r>
+        <w:rPr>
+          <w:rFonts w:asciiTheme="majorHAnsi" w:hAnsiTheme="majorHAnsi" w:cstheme="majorHAnsi"/>
+        </w:rPr>
+        <w:t xml:space="preserve"> the limit set event signal.</w:t>
+      </w:r>
+    </w:p>
+    <w:p>
+      <w:pPr>
         <w:pStyle w:val="ListParagraph"/>
         <w:numPr>
-          <w:ilvl w:val="0"/>
-          <w:numId w:val="23"/>
+          <w:ilvl w:val="1"/>
+          <w:numId w:val="29"/>
         </w:numPr>
         <w:rPr>
           <w:rFonts w:asciiTheme="majorHAnsi" w:hAnsiTheme="majorHAnsi" w:cstheme="majorHAnsi"/>
-        </w:rPr>
-      </w:pPr>
-      <w:r>
-        <w:rPr>
-          <w:rFonts w:asciiTheme="majorHAnsi" w:hAnsiTheme="majorHAnsi" w:cstheme="majorHAnsi"/>
-        </w:rPr>
-        <w:t>It</w:t>
-      </w:r>
-      <w:r>
-        <w:rPr>
-          <w:rFonts w:asciiTheme="majorHAnsi" w:hAnsiTheme="majorHAnsi" w:cstheme="majorHAnsi"/>
-        </w:rPr>
-        <w:t xml:space="preserve"> </w:t>
-      </w:r>
-      <w:proofErr w:type="gramStart"/>
-      <w:r>
-        <w:rPr>
-          <w:rFonts w:asciiTheme="majorHAnsi" w:hAnsiTheme="majorHAnsi" w:cstheme="majorHAnsi"/>
-        </w:rPr>
-        <w:t>trigger</w:t>
-      </w:r>
-      <w:proofErr w:type="gramEnd"/>
-      <w:r>
-        <w:rPr>
-          <w:rFonts w:asciiTheme="majorHAnsi" w:hAnsiTheme="majorHAnsi" w:cstheme="majorHAnsi"/>
-        </w:rPr>
-        <w:t xml:space="preserve"> </w:t>
-      </w:r>
-      <w:proofErr w:type="spellStart"/>
-      <w:proofErr w:type="gramStart"/>
-      <w:r>
-        <w:rPr>
-          <w:rFonts w:asciiTheme="majorHAnsi" w:hAnsiTheme="majorHAnsi" w:cstheme="majorHAnsi"/>
-        </w:rPr>
-        <w:t>SensorReadData</w:t>
-      </w:r>
-      <w:proofErr w:type="spellEnd"/>
-      <w:r>
-        <w:rPr>
-          <w:rFonts w:asciiTheme="majorHAnsi" w:hAnsiTheme="majorHAnsi" w:cstheme="majorHAnsi"/>
-        </w:rPr>
-        <w:t>(</w:t>
-      </w:r>
-      <w:proofErr w:type="gramEnd"/>
-      <w:r>
-        <w:rPr>
-          <w:rFonts w:asciiTheme="majorHAnsi" w:hAnsiTheme="majorHAnsi" w:cstheme="majorHAnsi"/>
-        </w:rPr>
-        <w:t>)</w:t>
-      </w:r>
-      <w:r>
-        <w:rPr>
-          <w:rFonts w:asciiTheme="majorHAnsi" w:hAnsiTheme="majorHAnsi" w:cstheme="majorHAnsi"/>
-        </w:rPr>
-        <w:t xml:space="preserve"> </w:t>
-      </w:r>
-      <w:r>
-        <w:rPr>
-          <w:rFonts w:asciiTheme="majorHAnsi" w:hAnsiTheme="majorHAnsi" w:cstheme="majorHAnsi"/>
-        </w:rPr>
-        <w:t xml:space="preserve">in ‘I’ interval and </w:t>
-      </w:r>
-      <w:proofErr w:type="gramStart"/>
-      <w:r>
-        <w:rPr>
-          <w:rFonts w:asciiTheme="majorHAnsi" w:hAnsiTheme="majorHAnsi" w:cstheme="majorHAnsi"/>
-        </w:rPr>
-        <w:t>push</w:t>
-      </w:r>
-      <w:proofErr w:type="gramEnd"/>
-      <w:r>
-        <w:rPr>
-          <w:rFonts w:asciiTheme="majorHAnsi" w:hAnsiTheme="majorHAnsi" w:cstheme="majorHAnsi"/>
-        </w:rPr>
-        <w:t xml:space="preserve"> the raw data in </w:t>
-      </w:r>
-      <w:r>
-        <w:rPr>
-          <w:rFonts w:asciiTheme="majorHAnsi" w:hAnsiTheme="majorHAnsi" w:cstheme="majorHAnsi"/>
-        </w:rPr>
-        <w:t>a</w:t>
-      </w:r>
-      <w:r>
-        <w:rPr>
-          <w:rFonts w:asciiTheme="majorHAnsi" w:hAnsiTheme="majorHAnsi" w:cstheme="majorHAnsi"/>
-        </w:rPr>
-        <w:t xml:space="preserve"> queue. We expect data with </w:t>
-      </w:r>
-      <w:proofErr w:type="gramStart"/>
-      <w:r>
-        <w:rPr>
-          <w:rFonts w:asciiTheme="majorHAnsi" w:hAnsiTheme="majorHAnsi" w:cstheme="majorHAnsi"/>
-        </w:rPr>
-        <w:t>limit</w:t>
-      </w:r>
-      <w:proofErr w:type="gramEnd"/>
-      <w:r>
-        <w:rPr>
-          <w:rFonts w:asciiTheme="majorHAnsi" w:hAnsiTheme="majorHAnsi" w:cstheme="majorHAnsi"/>
-        </w:rPr>
-        <w:t xml:space="preserve"> 0 to max value of 4 bytes.</w:t>
-      </w:r>
-      <w:r>
-        <w:rPr>
-          <w:rFonts w:asciiTheme="majorHAnsi" w:hAnsiTheme="majorHAnsi" w:cstheme="majorHAnsi"/>
-        </w:rPr>
-        <w:t xml:space="preserve"> </w:t>
+          <w:b/>
+          <w:bCs/>
+        </w:rPr>
+      </w:pPr>
+      <w:r>
+        <w:rPr>
+          <w:rFonts w:asciiTheme="majorHAnsi" w:hAnsiTheme="majorHAnsi" w:cstheme="majorHAnsi"/>
+          <w:b/>
+          <w:bCs/>
+        </w:rPr>
+        <w:t>Alarm</w:t>
+      </w:r>
+      <w:r>
+        <w:rPr>
+          <w:rFonts w:asciiTheme="majorHAnsi" w:hAnsiTheme="majorHAnsi" w:cstheme="majorHAnsi"/>
+          <w:b/>
+          <w:bCs/>
+        </w:rPr>
+        <w:t xml:space="preserve"> Management</w:t>
       </w:r>
     </w:p>
     <w:p>
       <w:pPr>
         <w:rPr>
           <w:rFonts w:asciiTheme="majorHAnsi" w:hAnsiTheme="majorHAnsi" w:cstheme="majorHAnsi"/>
-          <w:b/>
-          <w:bCs/>
-        </w:rPr>
-      </w:pPr>
-      <w:r>
-        <w:rPr>
-          <w:rFonts w:asciiTheme="majorHAnsi" w:hAnsiTheme="majorHAnsi" w:cstheme="majorHAnsi"/>
-          <w:b/>
-          <w:bCs/>
-        </w:rPr>
-        <w:t xml:space="preserve">4.2 </w:t>
-      </w:r>
-      <w:proofErr w:type="spellStart"/>
-      <w:r>
-        <w:rPr>
-          <w:rFonts w:asciiTheme="majorHAnsi" w:hAnsiTheme="majorHAnsi" w:cstheme="majorHAnsi"/>
-          <w:b/>
-          <w:bCs/>
-        </w:rPr>
-        <w:t>ProcessSensorData</w:t>
-      </w:r>
-      <w:r>
-        <w:rPr>
-          <w:rFonts w:asciiTheme="majorHAnsi" w:hAnsiTheme="majorHAnsi" w:cstheme="majorHAnsi"/>
-          <w:b/>
-          <w:bCs/>
-        </w:rPr>
-        <w:t>Module</w:t>
-      </w:r>
-      <w:proofErr w:type="spellEnd"/>
-      <w:r>
-        <w:rPr>
-          <w:rFonts w:asciiTheme="majorHAnsi" w:hAnsiTheme="majorHAnsi" w:cstheme="majorHAnsi"/>
-          <w:b/>
-          <w:bCs/>
+        </w:rPr>
+      </w:pPr>
+      <w:r>
+        <w:rPr>
+          <w:rFonts w:asciiTheme="majorHAnsi" w:hAnsiTheme="majorHAnsi" w:cstheme="majorHAnsi"/>
+        </w:rPr>
+        <w:t xml:space="preserve">4.3.1. </w:t>
+      </w:r>
+      <w:r>
+        <w:rPr>
+          <w:rFonts w:asciiTheme="majorHAnsi" w:hAnsiTheme="majorHAnsi" w:cstheme="majorHAnsi"/>
+        </w:rPr>
+        <w:t xml:space="preserve">Once the </w:t>
+      </w:r>
+      <w:r>
+        <w:rPr>
+          <w:rFonts w:asciiTheme="majorHAnsi" w:hAnsiTheme="majorHAnsi" w:cstheme="majorHAnsi"/>
+        </w:rPr>
+        <w:t xml:space="preserve">Validation </w:t>
+      </w:r>
+      <w:r>
+        <w:rPr>
+          <w:rFonts w:asciiTheme="majorHAnsi" w:hAnsiTheme="majorHAnsi" w:cstheme="majorHAnsi"/>
+        </w:rPr>
+        <w:t>engine</w:t>
+      </w:r>
+      <w:r>
+        <w:rPr>
+          <w:rFonts w:asciiTheme="majorHAnsi" w:hAnsiTheme="majorHAnsi" w:cstheme="majorHAnsi"/>
+        </w:rPr>
+        <w:t xml:space="preserve"> sets</w:t>
+      </w:r>
+      <w:r>
+        <w:rPr>
+          <w:rFonts w:asciiTheme="majorHAnsi" w:hAnsiTheme="majorHAnsi" w:cstheme="majorHAnsi"/>
         </w:rPr>
         <w:t xml:space="preserve"> </w:t>
       </w:r>
-    </w:p>
-    <w:p>
-      <w:pPr>
-        <w:pStyle w:val="ListParagraph"/>
-        <w:numPr>
-          <w:ilvl w:val="0"/>
-          <w:numId w:val="26"/>
-        </w:numPr>
-        <w:rPr>
-          <w:rFonts w:asciiTheme="majorHAnsi" w:hAnsiTheme="majorHAnsi" w:cstheme="majorHAnsi"/>
-        </w:rPr>
-      </w:pPr>
-      <w:r>
-        <w:rPr>
-          <w:rFonts w:asciiTheme="majorHAnsi" w:hAnsiTheme="majorHAnsi" w:cstheme="majorHAnsi"/>
-        </w:rPr>
-        <w:t xml:space="preserve">The module </w:t>
-      </w:r>
-      <w:proofErr w:type="gramStart"/>
-      <w:r>
-        <w:rPr>
-          <w:rFonts w:asciiTheme="majorHAnsi" w:hAnsiTheme="majorHAnsi" w:cstheme="majorHAnsi"/>
-        </w:rPr>
-        <w:t>responsible</w:t>
-      </w:r>
-      <w:proofErr w:type="gramEnd"/>
-      <w:r>
-        <w:rPr>
-          <w:rFonts w:asciiTheme="majorHAnsi" w:hAnsiTheme="majorHAnsi" w:cstheme="majorHAnsi"/>
-        </w:rPr>
-        <w:t xml:space="preserve"> for </w:t>
-      </w:r>
-      <w:proofErr w:type="gramStart"/>
-      <w:r>
-        <w:rPr>
-          <w:rFonts w:asciiTheme="majorHAnsi" w:hAnsiTheme="majorHAnsi" w:cstheme="majorHAnsi"/>
-        </w:rPr>
-        <w:t>parse</w:t>
-      </w:r>
-      <w:proofErr w:type="gramEnd"/>
-      <w:r>
-        <w:rPr>
-          <w:rFonts w:asciiTheme="majorHAnsi" w:hAnsiTheme="majorHAnsi" w:cstheme="majorHAnsi"/>
-        </w:rPr>
-        <w:t xml:space="preserve"> the raw data from the message queue and </w:t>
-      </w:r>
-      <w:proofErr w:type="gramStart"/>
-      <w:r>
-        <w:rPr>
-          <w:rFonts w:asciiTheme="majorHAnsi" w:hAnsiTheme="majorHAnsi" w:cstheme="majorHAnsi"/>
-        </w:rPr>
-        <w:t>convert</w:t>
-      </w:r>
-      <w:proofErr w:type="gramEnd"/>
-      <w:r>
-        <w:rPr>
-          <w:rFonts w:asciiTheme="majorHAnsi" w:hAnsiTheme="majorHAnsi" w:cstheme="majorHAnsi"/>
-        </w:rPr>
-        <w:t xml:space="preserve"> to required altitude format. We expect a </w:t>
-      </w:r>
-      <w:proofErr w:type="gramStart"/>
-      <w:r>
-        <w:rPr>
-          <w:rFonts w:asciiTheme="majorHAnsi" w:hAnsiTheme="majorHAnsi" w:cstheme="majorHAnsi"/>
-        </w:rPr>
-        <w:t>4 byte</w:t>
-      </w:r>
-      <w:proofErr w:type="gramEnd"/>
-      <w:r>
-        <w:rPr>
-          <w:rFonts w:asciiTheme="majorHAnsi" w:hAnsiTheme="majorHAnsi" w:cstheme="majorHAnsi"/>
-        </w:rPr>
-        <w:t xml:space="preserve"> data in message queue.</w:t>
-      </w:r>
-    </w:p>
-    <w:p>
-      <w:pPr>
-        <w:pStyle w:val="ListParagraph"/>
-        <w:numPr>
-          <w:ilvl w:val="0"/>
-          <w:numId w:val="26"/>
-        </w:numPr>
-        <w:rPr>
-          <w:rFonts w:asciiTheme="majorHAnsi" w:hAnsiTheme="majorHAnsi" w:cstheme="majorHAnsi"/>
-        </w:rPr>
-      </w:pPr>
-      <w:r>
-        <w:rPr>
-          <w:rFonts w:asciiTheme="majorHAnsi" w:hAnsiTheme="majorHAnsi" w:cstheme="majorHAnsi"/>
-        </w:rPr>
-        <w:t xml:space="preserve">Validate the altitude data with predefined threshold value set in the system. If it </w:t>
-      </w:r>
-      <w:proofErr w:type="gramStart"/>
-      <w:r>
-        <w:rPr>
-          <w:rFonts w:asciiTheme="majorHAnsi" w:hAnsiTheme="majorHAnsi" w:cstheme="majorHAnsi"/>
-        </w:rPr>
-        <w:t>exceed</w:t>
-      </w:r>
-      <w:proofErr w:type="gramEnd"/>
-      <w:r>
-        <w:rPr>
-          <w:rFonts w:asciiTheme="majorHAnsi" w:hAnsiTheme="majorHAnsi" w:cstheme="majorHAnsi"/>
-        </w:rPr>
-        <w:t xml:space="preserve"> the limit set event signal.</w:t>
-      </w:r>
-    </w:p>
-    <w:p>
-      <w:pPr>
-        <w:rPr>
-          <w:rFonts w:asciiTheme="majorHAnsi" w:hAnsiTheme="majorHAnsi" w:cstheme="majorHAnsi"/>
-          <w:b/>
-          <w:bCs/>
-        </w:rPr>
-      </w:pPr>
-      <w:r>
-        <w:rPr>
-          <w:rFonts w:asciiTheme="majorHAnsi" w:hAnsiTheme="majorHAnsi" w:cstheme="majorHAnsi"/>
-          <w:b/>
-          <w:bCs/>
-        </w:rPr>
-        <w:t xml:space="preserve">4.3 </w:t>
-      </w:r>
-      <w:proofErr w:type="spellStart"/>
-      <w:r>
-        <w:rPr>
-          <w:rFonts w:asciiTheme="majorHAnsi" w:hAnsiTheme="majorHAnsi" w:cstheme="majorHAnsi"/>
-          <w:b/>
-          <w:bCs/>
-        </w:rPr>
-        <w:t>AlarmData</w:t>
-      </w:r>
-      <w:r>
-        <w:rPr>
-          <w:rFonts w:asciiTheme="majorHAnsi" w:hAnsiTheme="majorHAnsi" w:cstheme="majorHAnsi"/>
-          <w:b/>
-          <w:bCs/>
-        </w:rPr>
-        <w:t>Module</w:t>
-      </w:r>
-      <w:proofErr w:type="spellEnd"/>
-    </w:p>
-    <w:p>
-      <w:pPr>
-        <w:pStyle w:val="ListParagraph"/>
-        <w:numPr>
-          <w:ilvl w:val="0"/>
-          <w:numId w:val="27"/>
-        </w:numPr>
-        <w:rPr>
-          <w:rFonts w:asciiTheme="majorHAnsi" w:hAnsiTheme="majorHAnsi" w:cstheme="majorHAnsi"/>
-        </w:rPr>
-      </w:pPr>
-      <w:r>
-        <w:rPr>
-          <w:rFonts w:asciiTheme="majorHAnsi" w:hAnsiTheme="majorHAnsi" w:cstheme="majorHAnsi"/>
-        </w:rPr>
-        <w:t xml:space="preserve">Once the </w:t>
-      </w:r>
-      <w:proofErr w:type="spellStart"/>
-      <w:r>
-        <w:rPr>
-          <w:rFonts w:asciiTheme="majorHAnsi" w:hAnsiTheme="majorHAnsi" w:cstheme="majorHAnsi"/>
-        </w:rPr>
-        <w:t>ProcessSensorData</w:t>
-      </w:r>
-      <w:proofErr w:type="spellEnd"/>
-      <w:r>
-        <w:rPr>
-          <w:rFonts w:asciiTheme="majorHAnsi" w:hAnsiTheme="majorHAnsi" w:cstheme="majorHAnsi"/>
-        </w:rPr>
-        <w:t xml:space="preserve"> module </w:t>
-      </w:r>
-      <w:r>
-        <w:rPr>
-          <w:rFonts w:asciiTheme="majorHAnsi" w:hAnsiTheme="majorHAnsi" w:cstheme="majorHAnsi"/>
-        </w:rPr>
-        <w:t>sets</w:t>
+      <w:r>
+        <w:rPr>
+          <w:rFonts w:asciiTheme="majorHAnsi" w:hAnsiTheme="majorHAnsi" w:cstheme="majorHAnsi"/>
+        </w:rPr>
+        <w:t>signal,</w:t>
+      </w:r>
+      <w:r>
+        <w:rPr>
+          <w:rFonts w:asciiTheme="majorHAnsi" w:hAnsiTheme="majorHAnsi" w:cstheme="majorHAnsi"/>
+        </w:rPr>
+        <w:t xml:space="preserve"> it </w:t>
+      </w:r>
+      <w:r>
+        <w:rPr>
+          <w:rFonts w:asciiTheme="majorHAnsi" w:hAnsiTheme="majorHAnsi" w:cstheme="majorHAnsi"/>
+        </w:rPr>
+        <w:t>triggers</w:t>
       </w:r>
       <w:r>
         <w:rPr>
@@ -1575,60 +1793,30 @@
         </w:rPr>
         <w:t xml:space="preserve"> </w:t>
       </w:r>
-      <w:proofErr w:type="gramStart"/>
-      <w:r>
-        <w:rPr>
-          <w:rFonts w:asciiTheme="majorHAnsi" w:hAnsiTheme="majorHAnsi" w:cstheme="majorHAnsi"/>
-        </w:rPr>
-        <w:t>signal ,</w:t>
-      </w:r>
-      <w:proofErr w:type="gramEnd"/>
-      <w:r>
-        <w:rPr>
-          <w:rFonts w:asciiTheme="majorHAnsi" w:hAnsiTheme="majorHAnsi" w:cstheme="majorHAnsi"/>
-        </w:rPr>
-        <w:t xml:space="preserve"> it </w:t>
-      </w:r>
-      <w:proofErr w:type="gramStart"/>
-      <w:r>
-        <w:rPr>
-          <w:rFonts w:asciiTheme="majorHAnsi" w:hAnsiTheme="majorHAnsi" w:cstheme="majorHAnsi"/>
-        </w:rPr>
-        <w:t>trigger</w:t>
-      </w:r>
-      <w:proofErr w:type="gramEnd"/>
+      <w:r>
+        <w:rPr>
+          <w:rFonts w:asciiTheme="majorHAnsi" w:hAnsiTheme="majorHAnsi" w:cstheme="majorHAnsi"/>
+        </w:rPr>
+        <w:t>an</w:t>
+      </w:r>
+      <w:r>
+        <w:rPr>
+          <w:rFonts w:asciiTheme="majorHAnsi" w:hAnsiTheme="majorHAnsi" w:cstheme="majorHAnsi"/>
+        </w:rPr>
+        <w:t xml:space="preserve"> alarm </w:t>
+      </w:r>
+      <w:r>
+        <w:rPr>
+          <w:rFonts w:asciiTheme="majorHAnsi" w:hAnsiTheme="majorHAnsi" w:cstheme="majorHAnsi"/>
+        </w:rPr>
+        <w:t>up to</w:t>
+      </w:r>
       <w:r>
         <w:rPr>
           <w:rFonts w:asciiTheme="majorHAnsi" w:hAnsiTheme="majorHAnsi" w:cstheme="majorHAnsi"/>
         </w:rPr>
         <w:t xml:space="preserve"> </w:t>
       </w:r>
-      <w:proofErr w:type="gramStart"/>
-      <w:r>
-        <w:rPr>
-          <w:rFonts w:asciiTheme="majorHAnsi" w:hAnsiTheme="majorHAnsi" w:cstheme="majorHAnsi"/>
-        </w:rPr>
-        <w:t>a</w:t>
-      </w:r>
-      <w:proofErr w:type="gramEnd"/>
-      <w:r>
-        <w:rPr>
-          <w:rFonts w:asciiTheme="majorHAnsi" w:hAnsiTheme="majorHAnsi" w:cstheme="majorHAnsi"/>
-        </w:rPr>
-        <w:t xml:space="preserve"> alarm </w:t>
-      </w:r>
-      <w:r>
-        <w:rPr>
-          <w:rFonts w:asciiTheme="majorHAnsi" w:hAnsiTheme="majorHAnsi" w:cstheme="majorHAnsi"/>
-        </w:rPr>
-        <w:t>up to</w:t>
-      </w:r>
-      <w:r>
-        <w:rPr>
-          <w:rFonts w:asciiTheme="majorHAnsi" w:hAnsiTheme="majorHAnsi" w:cstheme="majorHAnsi"/>
-        </w:rPr>
-        <w:t xml:space="preserve"> </w:t>
-      </w:r>
       <w:r>
         <w:rPr>
           <w:rFonts w:asciiTheme="majorHAnsi" w:hAnsiTheme="majorHAnsi" w:cstheme="majorHAnsi"/>
@@ -1651,16 +1839,26 @@
         <w:rPr>
           <w:rFonts w:asciiTheme="majorHAnsi" w:hAnsiTheme="majorHAnsi" w:cstheme="majorHAnsi"/>
         </w:rPr>
-        <w:t xml:space="preserve">out and </w:t>
-      </w:r>
-      <w:proofErr w:type="gramStart"/>
-      <w:r>
-        <w:rPr>
-          <w:rFonts w:asciiTheme="majorHAnsi" w:hAnsiTheme="majorHAnsi" w:cstheme="majorHAnsi"/>
-        </w:rPr>
-        <w:t>clear</w:t>
-      </w:r>
-      <w:proofErr w:type="gramEnd"/>
+        <w:t xml:space="preserve">out </w:t>
+      </w:r>
+      <w:r>
+        <w:rPr>
+          <w:rFonts w:asciiTheme="majorHAnsi" w:hAnsiTheme="majorHAnsi" w:cstheme="majorHAnsi"/>
+        </w:rPr>
+        <w:t xml:space="preserve">[ALARM_TIMEOUT] </w:t>
+      </w:r>
+      <w:r>
+        <w:rPr>
+          <w:rFonts w:asciiTheme="majorHAnsi" w:hAnsiTheme="majorHAnsi" w:cstheme="majorHAnsi"/>
+        </w:rPr>
+        <w:t xml:space="preserve">and </w:t>
+      </w:r>
+      <w:r>
+        <w:rPr>
+          <w:rFonts w:asciiTheme="majorHAnsi" w:hAnsiTheme="majorHAnsi" w:cstheme="majorHAnsi"/>
+        </w:rPr>
+        <w:t>clears</w:t>
+      </w:r>
       <w:r>
         <w:rPr>
           <w:rFonts w:asciiTheme="majorHAnsi" w:hAnsiTheme="majorHAnsi" w:cstheme="majorHAnsi"/>
@@ -1671,13 +1869,7 @@
         <w:rPr>
           <w:rFonts w:asciiTheme="majorHAnsi" w:hAnsiTheme="majorHAnsi" w:cstheme="majorHAnsi"/>
         </w:rPr>
-        <w:t xml:space="preserve"> </w:t>
-      </w:r>
-      <w:r>
-        <w:rPr>
-          <w:rFonts w:asciiTheme="majorHAnsi" w:hAnsiTheme="majorHAnsi" w:cstheme="majorHAnsi"/>
-        </w:rPr>
-        <w:t xml:space="preserve"> </w:t>
+        <w:t xml:space="preserve">  </w:t>
       </w:r>
     </w:p>
     <w:p>
@@ -1695,7 +1887,6 @@
           <w:sz w:val="22"/>
           <w:szCs w:val="22"/>
         </w:rPr>
-        <w:lastRenderedPageBreak/>
         <w:t>5. Interface Design</w:t>
       </w:r>
     </w:p>
@@ -1747,7 +1938,6 @@
                 <w:bCs/>
               </w:rPr>
             </w:pPr>
-            <w:proofErr w:type="spellStart"/>
             <w:r>
               <w:rPr>
                 <w:rFonts w:asciiTheme="majorHAnsi" w:hAnsiTheme="majorHAnsi" w:cstheme="majorHAnsi"/>
@@ -1756,7 +1946,6 @@
               </w:rPr>
               <w:t>sensor.c</w:t>
             </w:r>
-            <w:proofErr w:type="spellEnd"/>
           </w:p>
         </w:tc>
         <w:tc>
@@ -1825,7 +2014,62 @@
               <w:rPr>
                 <w:rFonts w:asciiTheme="majorHAnsi" w:hAnsiTheme="majorHAnsi" w:cstheme="majorHAnsi"/>
               </w:rPr>
-              <w:t xml:space="preserve"> interface for initializing the sensor module with ‘f’ frequency, Read sensor data with ‘I’ interval and Push to the message queue.</w:t>
+              <w:t xml:space="preserve"> interface for initializing the sensor module </w:t>
+            </w:r>
+            <w:r>
+              <w:rPr>
+                <w:rFonts w:asciiTheme="majorHAnsi" w:hAnsiTheme="majorHAnsi" w:cstheme="majorHAnsi"/>
+              </w:rPr>
+              <w:lastRenderedPageBreak/>
+              <w:t xml:space="preserve">with </w:t>
+            </w:r>
+            <w:r>
+              <w:rPr>
+                <w:rFonts w:asciiTheme="majorHAnsi" w:hAnsiTheme="majorHAnsi" w:cstheme="majorHAnsi"/>
+              </w:rPr>
+              <w:t>[</w:t>
+            </w:r>
+            <w:r>
+              <w:rPr>
+                <w:rFonts w:asciiTheme="majorHAnsi" w:hAnsiTheme="majorHAnsi" w:cstheme="majorHAnsi"/>
+              </w:rPr>
+              <w:t>f</w:t>
+            </w:r>
+            <w:r>
+              <w:rPr>
+                <w:rFonts w:asciiTheme="majorHAnsi" w:hAnsiTheme="majorHAnsi" w:cstheme="majorHAnsi"/>
+              </w:rPr>
+              <w:t>]</w:t>
+            </w:r>
+            <w:r>
+              <w:rPr>
+                <w:rFonts w:asciiTheme="majorHAnsi" w:hAnsiTheme="majorHAnsi" w:cstheme="majorHAnsi"/>
+              </w:rPr>
+              <w:t xml:space="preserve"> frequency, Read sensor data with </w:t>
+            </w:r>
+            <w:r>
+              <w:rPr>
+                <w:rFonts w:asciiTheme="majorHAnsi" w:hAnsiTheme="majorHAnsi" w:cstheme="majorHAnsi"/>
+              </w:rPr>
+              <w:t>[</w:t>
+            </w:r>
+            <w:r>
+              <w:rPr>
+                <w:rFonts w:asciiTheme="majorHAnsi" w:hAnsiTheme="majorHAnsi" w:cstheme="majorHAnsi"/>
+              </w:rPr>
+              <w:t>I</w:t>
+            </w:r>
+            <w:r>
+              <w:rPr>
+                <w:rFonts w:asciiTheme="majorHAnsi" w:hAnsiTheme="majorHAnsi" w:cstheme="majorHAnsi"/>
+              </w:rPr>
+              <w:t>]</w:t>
+            </w:r>
+            <w:r>
+              <w:rPr>
+                <w:rFonts w:asciiTheme="majorHAnsi" w:hAnsiTheme="majorHAnsi" w:cstheme="majorHAnsi"/>
+              </w:rPr>
+              <w:t xml:space="preserve"> interval and Push to the message queue.</w:t>
             </w:r>
           </w:p>
         </w:tc>
@@ -1855,6 +2099,7 @@
                 <w:b/>
                 <w:bCs/>
               </w:rPr>
+              <w:lastRenderedPageBreak/>
               <w:t>Interface</w:t>
             </w:r>
             <w:r>
@@ -1974,43 +2219,7 @@
               <w:rPr>
                 <w:rFonts w:asciiTheme="majorHAnsi" w:hAnsiTheme="majorHAnsi" w:cstheme="majorHAnsi"/>
               </w:rPr>
-              <w:t xml:space="preserve">bool </w:t>
-            </w:r>
-            <w:proofErr w:type="spellStart"/>
-            <w:proofErr w:type="gramStart"/>
-            <w:r>
-              <w:rPr>
-                <w:rFonts w:asciiTheme="majorHAnsi" w:hAnsiTheme="majorHAnsi" w:cstheme="majorHAnsi"/>
-              </w:rPr>
-              <w:t>SensorInitialization</w:t>
-            </w:r>
-            <w:proofErr w:type="spellEnd"/>
-            <w:r>
-              <w:rPr>
-                <w:rFonts w:asciiTheme="majorHAnsi" w:hAnsiTheme="majorHAnsi" w:cstheme="majorHAnsi"/>
-              </w:rPr>
-              <w:t>(</w:t>
-            </w:r>
-            <w:proofErr w:type="gramEnd"/>
-            <w:r>
-              <w:rPr>
-                <w:rFonts w:asciiTheme="majorHAnsi" w:hAnsiTheme="majorHAnsi" w:cstheme="majorHAnsi"/>
-              </w:rPr>
-              <w:t xml:space="preserve">uint32_t </w:t>
-            </w:r>
-            <w:proofErr w:type="spellStart"/>
-            <w:r>
-              <w:rPr>
-                <w:rFonts w:asciiTheme="majorHAnsi" w:hAnsiTheme="majorHAnsi" w:cstheme="majorHAnsi"/>
-              </w:rPr>
-              <w:t>ulFrequency</w:t>
-            </w:r>
-            <w:proofErr w:type="spellEnd"/>
-            <w:r>
-              <w:rPr>
-                <w:rFonts w:asciiTheme="majorHAnsi" w:hAnsiTheme="majorHAnsi" w:cstheme="majorHAnsi"/>
-              </w:rPr>
-              <w:t>)</w:t>
+              <w:t>bool SensorInitialization(uint32_t ulFrequency)</w:t>
             </w:r>
           </w:p>
         </w:tc>
@@ -2059,16 +2268,8 @@
               <w:rPr>
                 <w:rFonts w:asciiTheme="majorHAnsi" w:hAnsiTheme="majorHAnsi" w:cstheme="majorHAnsi"/>
               </w:rPr>
-              <w:t xml:space="preserve">uint32_t </w:t>
+              <w:t>uint32_t ulFrequency</w:t>
             </w:r>
-            <w:proofErr w:type="spellStart"/>
-            <w:r>
-              <w:rPr>
-                <w:rFonts w:asciiTheme="majorHAnsi" w:hAnsiTheme="majorHAnsi" w:cstheme="majorHAnsi"/>
-              </w:rPr>
-              <w:t>ulFrequency</w:t>
-            </w:r>
-            <w:proofErr w:type="spellEnd"/>
           </w:p>
         </w:tc>
         <w:tc>
@@ -2132,29 +2333,7 @@
               <w:rPr>
                 <w:rFonts w:asciiTheme="majorHAnsi" w:hAnsiTheme="majorHAnsi" w:cstheme="majorHAnsi"/>
               </w:rPr>
-              <w:t xml:space="preserve">void* </w:t>
-            </w:r>
-            <w:proofErr w:type="spellStart"/>
-            <w:proofErr w:type="gramStart"/>
-            <w:r>
-              <w:rPr>
-                <w:rFonts w:asciiTheme="majorHAnsi" w:hAnsiTheme="majorHAnsi" w:cstheme="majorHAnsi"/>
-              </w:rPr>
-              <w:t>SensorReadHandler</w:t>
-            </w:r>
-            <w:proofErr w:type="spellEnd"/>
-            <w:r>
-              <w:rPr>
-                <w:rFonts w:asciiTheme="majorHAnsi" w:hAnsiTheme="majorHAnsi" w:cstheme="majorHAnsi"/>
-              </w:rPr>
-              <w:t>(</w:t>
-            </w:r>
-            <w:proofErr w:type="gramEnd"/>
-            <w:r>
-              <w:rPr>
-                <w:rFonts w:asciiTheme="majorHAnsi" w:hAnsiTheme="majorHAnsi" w:cstheme="majorHAnsi"/>
-              </w:rPr>
-              <w:t>)</w:t>
+              <w:t>void* SensorReadHandler()</w:t>
             </w:r>
           </w:p>
         </w:tc>
@@ -2241,21 +2420,7 @@
               <w:rPr>
                 <w:rFonts w:asciiTheme="majorHAnsi" w:hAnsiTheme="majorHAnsi" w:cstheme="majorHAnsi"/>
               </w:rPr>
-              <w:t xml:space="preserve">uint32_t </w:t>
-            </w:r>
-            <w:proofErr w:type="spellStart"/>
-            <w:r>
-              <w:rPr>
-                <w:rFonts w:asciiTheme="majorHAnsi" w:hAnsiTheme="majorHAnsi" w:cstheme="majorHAnsi"/>
-              </w:rPr>
-              <w:t>SensorReadData</w:t>
-            </w:r>
-            <w:proofErr w:type="spellEnd"/>
-            <w:r>
-              <w:rPr>
-                <w:rFonts w:asciiTheme="majorHAnsi" w:hAnsiTheme="majorHAnsi" w:cstheme="majorHAnsi"/>
-              </w:rPr>
-              <w:t>(void)</w:t>
+              <w:t>uint32_t SensorReadData(void)</w:t>
             </w:r>
           </w:p>
         </w:tc>
@@ -2381,7 +2546,6 @@
                 <w:bCs/>
               </w:rPr>
             </w:pPr>
-            <w:proofErr w:type="spellStart"/>
             <w:r>
               <w:rPr>
                 <w:rFonts w:asciiTheme="majorHAnsi" w:hAnsiTheme="majorHAnsi" w:cstheme="majorHAnsi"/>
@@ -2390,7 +2554,6 @@
               </w:rPr>
               <w:t>Process.c</w:t>
             </w:r>
-            <w:proofErr w:type="spellEnd"/>
           </w:p>
           <w:p>
             <w:pPr>
@@ -2537,29 +2700,7 @@
               <w:rPr>
                 <w:rFonts w:asciiTheme="majorHAnsi" w:hAnsiTheme="majorHAnsi" w:cstheme="majorHAnsi"/>
               </w:rPr>
-              <w:t xml:space="preserve">void* </w:t>
-            </w:r>
-            <w:proofErr w:type="spellStart"/>
-            <w:proofErr w:type="gramStart"/>
-            <w:r>
-              <w:rPr>
-                <w:rFonts w:asciiTheme="majorHAnsi" w:hAnsiTheme="majorHAnsi" w:cstheme="majorHAnsi"/>
-              </w:rPr>
-              <w:t>ProcessSensorData</w:t>
-            </w:r>
-            <w:proofErr w:type="spellEnd"/>
-            <w:r>
-              <w:rPr>
-                <w:rFonts w:asciiTheme="majorHAnsi" w:hAnsiTheme="majorHAnsi" w:cstheme="majorHAnsi"/>
-              </w:rPr>
-              <w:t>(</w:t>
-            </w:r>
-            <w:proofErr w:type="gramEnd"/>
-            <w:r>
-              <w:rPr>
-                <w:rFonts w:asciiTheme="majorHAnsi" w:hAnsiTheme="majorHAnsi" w:cstheme="majorHAnsi"/>
-              </w:rPr>
-              <w:t>)</w:t>
+              <w:t>void* ProcessSensorData()</w:t>
             </w:r>
           </w:p>
         </w:tc>
@@ -2579,14 +2720,12 @@
               </w:rPr>
               <w:t xml:space="preserve">Thread implementation to process the sensor data from the message queue and validate with define threshold </w:t>
             </w:r>
-            <w:proofErr w:type="gramStart"/>
             <w:r>
               <w:rPr>
                 <w:rFonts w:asciiTheme="majorHAnsi" w:hAnsiTheme="majorHAnsi" w:cstheme="majorHAnsi"/>
               </w:rPr>
-              <w:t>value ,set</w:t>
+              <w:t>value, set</w:t>
             </w:r>
-            <w:proofErr w:type="gramEnd"/>
             <w:r>
               <w:rPr>
                 <w:rFonts w:asciiTheme="majorHAnsi" w:hAnsiTheme="majorHAnsi" w:cstheme="majorHAnsi"/>
@@ -2635,57 +2774,7 @@
               <w:rPr>
                 <w:rFonts w:asciiTheme="majorHAnsi" w:hAnsiTheme="majorHAnsi" w:cstheme="majorHAnsi"/>
               </w:rPr>
-              <w:t xml:space="preserve">bool </w:t>
-            </w:r>
-            <w:proofErr w:type="spellStart"/>
-            <w:proofErr w:type="gramStart"/>
-            <w:r>
-              <w:rPr>
-                <w:rFonts w:asciiTheme="majorHAnsi" w:hAnsiTheme="majorHAnsi" w:cstheme="majorHAnsi"/>
-              </w:rPr>
-              <w:t>ProcessDataValidation</w:t>
-            </w:r>
-            <w:proofErr w:type="spellEnd"/>
-            <w:r>
-              <w:rPr>
-                <w:rFonts w:asciiTheme="majorHAnsi" w:hAnsiTheme="majorHAnsi" w:cstheme="majorHAnsi"/>
-              </w:rPr>
-              <w:t>(</w:t>
-            </w:r>
-            <w:proofErr w:type="gramEnd"/>
-            <w:r>
-              <w:rPr>
-                <w:rFonts w:asciiTheme="majorHAnsi" w:hAnsiTheme="majorHAnsi" w:cstheme="majorHAnsi"/>
-              </w:rPr>
-              <w:t xml:space="preserve">uint32_t </w:t>
-            </w:r>
-            <w:proofErr w:type="gramStart"/>
-            <w:r>
-              <w:rPr>
-                <w:rFonts w:asciiTheme="majorHAnsi" w:hAnsiTheme="majorHAnsi" w:cstheme="majorHAnsi"/>
-              </w:rPr>
-              <w:t>ulAltitudeVal,uint</w:t>
-            </w:r>
-            <w:proofErr w:type="gramEnd"/>
-            <w:r>
-              <w:rPr>
-                <w:rFonts w:asciiTheme="majorHAnsi" w:hAnsiTheme="majorHAnsi" w:cstheme="majorHAnsi"/>
-              </w:rPr>
-              <w:t xml:space="preserve">32_t </w:t>
-            </w:r>
-            <w:proofErr w:type="spellStart"/>
-            <w:r>
-              <w:rPr>
-                <w:rFonts w:asciiTheme="majorHAnsi" w:hAnsiTheme="majorHAnsi" w:cstheme="majorHAnsi"/>
-              </w:rPr>
-              <w:t>ulDefinedThresholdValue</w:t>
-            </w:r>
-            <w:proofErr w:type="spellEnd"/>
-            <w:r>
-              <w:rPr>
-                <w:rFonts w:asciiTheme="majorHAnsi" w:hAnsiTheme="majorHAnsi" w:cstheme="majorHAnsi"/>
-              </w:rPr>
-              <w:t>)</w:t>
+              <w:t>bool ProcessDataValidation(uint32_t ulAltitudeVal,uint32_t ulDefinedThresholdValue)</w:t>
             </w:r>
           </w:p>
         </w:tc>
@@ -2721,21 +2810,7 @@
               <w:rPr>
                 <w:rFonts w:asciiTheme="majorHAnsi" w:hAnsiTheme="majorHAnsi" w:cstheme="majorHAnsi"/>
               </w:rPr>
-              <w:t xml:space="preserve">uint32_t </w:t>
-            </w:r>
-            <w:proofErr w:type="spellStart"/>
-            <w:r>
-              <w:rPr>
-                <w:rFonts w:asciiTheme="majorHAnsi" w:hAnsiTheme="majorHAnsi" w:cstheme="majorHAnsi"/>
-              </w:rPr>
-              <w:t>ulAltitudeVal</w:t>
-            </w:r>
-            <w:proofErr w:type="spellEnd"/>
-            <w:r>
-              <w:rPr>
-                <w:rFonts w:asciiTheme="majorHAnsi" w:hAnsiTheme="majorHAnsi" w:cstheme="majorHAnsi"/>
-              </w:rPr>
-              <w:t xml:space="preserve"> – value from sensor.</w:t>
+              <w:t>uint32_t ulAltitudeVal – value from sensor.</w:t>
             </w:r>
           </w:p>
           <w:p>
@@ -2748,30 +2823,8 @@
               <w:rPr>
                 <w:rFonts w:asciiTheme="majorHAnsi" w:hAnsiTheme="majorHAnsi" w:cstheme="majorHAnsi"/>
               </w:rPr>
-              <w:t xml:space="preserve">uint32_t </w:t>
+              <w:t>uint32_t ulDefinedThresholdValue – defined thresholdvalue</w:t>
             </w:r>
-            <w:proofErr w:type="spellStart"/>
-            <w:r>
-              <w:rPr>
-                <w:rFonts w:asciiTheme="majorHAnsi" w:hAnsiTheme="majorHAnsi" w:cstheme="majorHAnsi"/>
-              </w:rPr>
-              <w:t>ulDefinedThresholdValue</w:t>
-            </w:r>
-            <w:proofErr w:type="spellEnd"/>
-            <w:r>
-              <w:rPr>
-                <w:rFonts w:asciiTheme="majorHAnsi" w:hAnsiTheme="majorHAnsi" w:cstheme="majorHAnsi"/>
-              </w:rPr>
-              <w:t xml:space="preserve"> – defined </w:t>
-            </w:r>
-            <w:proofErr w:type="spellStart"/>
-            <w:r>
-              <w:rPr>
-                <w:rFonts w:asciiTheme="majorHAnsi" w:hAnsiTheme="majorHAnsi" w:cstheme="majorHAnsi"/>
-              </w:rPr>
-              <w:t>thresholdvalue</w:t>
-            </w:r>
-            <w:proofErr w:type="spellEnd"/>
           </w:p>
         </w:tc>
         <w:tc>
@@ -2821,21 +2874,7 @@
               <w:rPr>
                 <w:rFonts w:asciiTheme="majorHAnsi" w:hAnsiTheme="majorHAnsi" w:cstheme="majorHAnsi"/>
               </w:rPr>
-              <w:t xml:space="preserve">void </w:t>
-            </w:r>
-            <w:proofErr w:type="spellStart"/>
-            <w:r>
-              <w:rPr>
-                <w:rFonts w:asciiTheme="majorHAnsi" w:hAnsiTheme="majorHAnsi" w:cstheme="majorHAnsi"/>
-              </w:rPr>
-              <w:t>ProcessSetEvent</w:t>
-            </w:r>
-            <w:proofErr w:type="spellEnd"/>
-            <w:r>
-              <w:rPr>
-                <w:rFonts w:asciiTheme="majorHAnsi" w:hAnsiTheme="majorHAnsi" w:cstheme="majorHAnsi"/>
-              </w:rPr>
-              <w:t>(void)</w:t>
+              <w:t>void ProcessSetEvent(void)</w:t>
             </w:r>
           </w:p>
         </w:tc>
@@ -2853,29 +2892,7 @@
               <w:rPr>
                 <w:rFonts w:asciiTheme="majorHAnsi" w:hAnsiTheme="majorHAnsi" w:cstheme="majorHAnsi"/>
               </w:rPr>
-              <w:t xml:space="preserve">This will set the event bit to 1, after checking the </w:t>
-            </w:r>
-            <w:proofErr w:type="spellStart"/>
-            <w:proofErr w:type="gramStart"/>
-            <w:r>
-              <w:rPr>
-                <w:rFonts w:asciiTheme="majorHAnsi" w:hAnsiTheme="majorHAnsi" w:cstheme="majorHAnsi"/>
-              </w:rPr>
-              <w:t>ProcessDataValidation</w:t>
-            </w:r>
-            <w:proofErr w:type="spellEnd"/>
-            <w:r>
-              <w:rPr>
-                <w:rFonts w:asciiTheme="majorHAnsi" w:hAnsiTheme="majorHAnsi" w:cstheme="majorHAnsi"/>
-              </w:rPr>
-              <w:t>(</w:t>
-            </w:r>
-            <w:proofErr w:type="gramEnd"/>
-            <w:r>
-              <w:rPr>
-                <w:rFonts w:asciiTheme="majorHAnsi" w:hAnsiTheme="majorHAnsi" w:cstheme="majorHAnsi"/>
-              </w:rPr>
-              <w:t>)</w:t>
+              <w:t>This will set the event bit to 1, after checking the ProcessDataValidation()</w:t>
             </w:r>
           </w:p>
         </w:tc>
@@ -2961,7 +2978,6 @@
                 <w:bCs/>
               </w:rPr>
             </w:pPr>
-            <w:proofErr w:type="spellStart"/>
             <w:r>
               <w:rPr>
                 <w:rFonts w:asciiTheme="majorHAnsi" w:hAnsiTheme="majorHAnsi" w:cstheme="majorHAnsi"/>
@@ -2970,7 +2986,6 @@
               </w:rPr>
               <w:t>Alarminfo.c</w:t>
             </w:r>
-            <w:proofErr w:type="spellEnd"/>
           </w:p>
         </w:tc>
       </w:tr>
@@ -3010,19 +3025,35 @@
               </w:rPr>
               <w:t xml:space="preserve">This </w:t>
             </w:r>
-            <w:proofErr w:type="gramStart"/>
             <w:r>
               <w:rPr>
                 <w:rFonts w:asciiTheme="majorHAnsi" w:hAnsiTheme="majorHAnsi" w:cstheme="majorHAnsi"/>
               </w:rPr>
-              <w:t>define</w:t>
+              <w:t>defines</w:t>
             </w:r>
-            <w:proofErr w:type="gramEnd"/>
             <w:r>
               <w:rPr>
                 <w:rFonts w:asciiTheme="majorHAnsi" w:hAnsiTheme="majorHAnsi" w:cstheme="majorHAnsi"/>
               </w:rPr>
-              <w:t xml:space="preserve"> the interfaces to check the event flag and execute alarm up to a given interval.</w:t>
+              <w:t xml:space="preserve"> the interfaces to check the event flag and execute alarm up to a given interval</w:t>
+            </w:r>
+            <w:r>
+              <w:rPr>
+                <w:rFonts w:asciiTheme="majorHAnsi" w:hAnsiTheme="majorHAnsi" w:cstheme="majorHAnsi"/>
+              </w:rPr>
+              <w:t xml:space="preserve"> </w:t>
+            </w:r>
+            <w:r>
+              <w:rPr>
+                <w:rFonts w:asciiTheme="majorHAnsi" w:hAnsiTheme="majorHAnsi" w:cstheme="majorHAnsi"/>
+              </w:rPr>
+              <w:t>[ALARM_TIMEOUT]</w:t>
+            </w:r>
+            <w:r>
+              <w:rPr>
+                <w:rFonts w:asciiTheme="majorHAnsi" w:hAnsiTheme="majorHAnsi" w:cstheme="majorHAnsi"/>
+              </w:rPr>
+              <w:t>.</w:t>
             </w:r>
           </w:p>
         </w:tc>
@@ -3136,29 +3167,7 @@
               <w:rPr>
                 <w:rFonts w:asciiTheme="majorHAnsi" w:hAnsiTheme="majorHAnsi" w:cstheme="majorHAnsi"/>
               </w:rPr>
-              <w:t>Void*</w:t>
-            </w:r>
-            <w:proofErr w:type="spellStart"/>
-            <w:proofErr w:type="gramStart"/>
-            <w:r>
-              <w:rPr>
-                <w:rFonts w:asciiTheme="majorHAnsi" w:hAnsiTheme="majorHAnsi" w:cstheme="majorHAnsi"/>
-              </w:rPr>
-              <w:t>AlarmInfoProcessHandler</w:t>
-            </w:r>
-            <w:proofErr w:type="spellEnd"/>
-            <w:r>
-              <w:rPr>
-                <w:rFonts w:asciiTheme="majorHAnsi" w:hAnsiTheme="majorHAnsi" w:cstheme="majorHAnsi"/>
-              </w:rPr>
-              <w:t>(</w:t>
-            </w:r>
-            <w:proofErr w:type="gramEnd"/>
-            <w:r>
-              <w:rPr>
-                <w:rFonts w:asciiTheme="majorHAnsi" w:hAnsiTheme="majorHAnsi" w:cstheme="majorHAnsi"/>
-              </w:rPr>
-              <w:t>)</w:t>
+              <w:t>Void*AlarmInfoProcessHandler()</w:t>
             </w:r>
           </w:p>
         </w:tc>
@@ -3176,28 +3185,38 @@
               <w:rPr>
                 <w:rFonts w:asciiTheme="majorHAnsi" w:hAnsiTheme="majorHAnsi" w:cstheme="majorHAnsi"/>
               </w:rPr>
-              <w:t xml:space="preserve">Thread </w:t>
+              <w:t xml:space="preserve">Thread implementation which </w:t>
             </w:r>
             <w:r>
               <w:rPr>
                 <w:rFonts w:asciiTheme="majorHAnsi" w:hAnsiTheme="majorHAnsi" w:cstheme="majorHAnsi"/>
               </w:rPr>
+              <w:t>checks</w:t>
+            </w:r>
+            <w:r>
+              <w:rPr>
+                <w:rFonts w:asciiTheme="majorHAnsi" w:hAnsiTheme="majorHAnsi" w:cstheme="majorHAnsi"/>
+              </w:rPr>
+              <w:t xml:space="preserve"> the event bit and </w:t>
+            </w:r>
+            <w:r>
+              <w:rPr>
+                <w:rFonts w:asciiTheme="majorHAnsi" w:hAnsiTheme="majorHAnsi" w:cstheme="majorHAnsi"/>
+              </w:rPr>
+              <w:t>calls</w:t>
+            </w:r>
+            <w:r>
+              <w:rPr>
+                <w:rFonts w:asciiTheme="majorHAnsi" w:hAnsiTheme="majorHAnsi" w:cstheme="majorHAnsi"/>
+              </w:rPr>
+              <w:t xml:space="preserve"> the alarm </w:t>
+            </w:r>
+            <w:r>
+              <w:rPr>
+                <w:rFonts w:asciiTheme="majorHAnsi" w:hAnsiTheme="majorHAnsi" w:cstheme="majorHAnsi"/>
+              </w:rPr>
               <w:lastRenderedPageBreak/>
-              <w:t xml:space="preserve">implementation which </w:t>
-            </w:r>
-            <w:proofErr w:type="gramStart"/>
-            <w:r>
-              <w:rPr>
-                <w:rFonts w:asciiTheme="majorHAnsi" w:hAnsiTheme="majorHAnsi" w:cstheme="majorHAnsi"/>
-              </w:rPr>
-              <w:t>check</w:t>
-            </w:r>
-            <w:proofErr w:type="gramEnd"/>
-            <w:r>
-              <w:rPr>
-                <w:rFonts w:asciiTheme="majorHAnsi" w:hAnsiTheme="majorHAnsi" w:cstheme="majorHAnsi"/>
-              </w:rPr>
-              <w:t xml:space="preserve"> the event bit and call the alarm execution function.</w:t>
+              <w:t>execution function.</w:t>
             </w:r>
           </w:p>
         </w:tc>
@@ -3242,43 +3261,7 @@
               <w:rPr>
                 <w:rFonts w:asciiTheme="majorHAnsi" w:hAnsiTheme="majorHAnsi" w:cstheme="majorHAnsi"/>
               </w:rPr>
-              <w:t xml:space="preserve">bool </w:t>
-            </w:r>
-            <w:proofErr w:type="spellStart"/>
-            <w:proofErr w:type="gramStart"/>
-            <w:r>
-              <w:rPr>
-                <w:rFonts w:asciiTheme="majorHAnsi" w:hAnsiTheme="majorHAnsi" w:cstheme="majorHAnsi"/>
-              </w:rPr>
-              <w:t>AlarmInfoExecution</w:t>
-            </w:r>
-            <w:proofErr w:type="spellEnd"/>
-            <w:r>
-              <w:rPr>
-                <w:rFonts w:asciiTheme="majorHAnsi" w:hAnsiTheme="majorHAnsi" w:cstheme="majorHAnsi"/>
-              </w:rPr>
-              <w:t>(</w:t>
-            </w:r>
-            <w:proofErr w:type="gramEnd"/>
-            <w:r>
-              <w:rPr>
-                <w:rFonts w:asciiTheme="majorHAnsi" w:hAnsiTheme="majorHAnsi" w:cstheme="majorHAnsi"/>
-              </w:rPr>
-              <w:t xml:space="preserve">uint8_t </w:t>
-            </w:r>
-            <w:proofErr w:type="spellStart"/>
-            <w:r>
-              <w:rPr>
-                <w:rFonts w:asciiTheme="majorHAnsi" w:hAnsiTheme="majorHAnsi" w:cstheme="majorHAnsi"/>
-              </w:rPr>
-              <w:t>ucInterval</w:t>
-            </w:r>
-            <w:proofErr w:type="spellEnd"/>
-            <w:r>
-              <w:rPr>
-                <w:rFonts w:asciiTheme="majorHAnsi" w:hAnsiTheme="majorHAnsi" w:cstheme="majorHAnsi"/>
-              </w:rPr>
-              <w:t xml:space="preserve">) </w:t>
+              <w:t xml:space="preserve">bool AlarmInfoExecution(uint8_t ucInterval) </w:t>
             </w:r>
           </w:p>
         </w:tc>
@@ -3314,16 +3297,8 @@
               <w:rPr>
                 <w:rFonts w:asciiTheme="majorHAnsi" w:hAnsiTheme="majorHAnsi" w:cstheme="majorHAnsi"/>
               </w:rPr>
-              <w:t xml:space="preserve">uint8_t </w:t>
+              <w:t>uint8_t ucInterval</w:t>
             </w:r>
-            <w:proofErr w:type="spellStart"/>
-            <w:r>
-              <w:rPr>
-                <w:rFonts w:asciiTheme="majorHAnsi" w:hAnsiTheme="majorHAnsi" w:cstheme="majorHAnsi"/>
-              </w:rPr>
-              <w:t>ucInterval</w:t>
-            </w:r>
-            <w:proofErr w:type="spellEnd"/>
           </w:p>
         </w:tc>
         <w:tc>
@@ -3342,14 +3317,12 @@
                 <w:rFonts w:asciiTheme="majorHAnsi" w:hAnsiTheme="majorHAnsi" w:cstheme="majorHAnsi"/>
               </w:rPr>
             </w:pPr>
-            <w:proofErr w:type="spellStart"/>
             <w:r>
               <w:rPr>
                 <w:rFonts w:asciiTheme="majorHAnsi" w:hAnsiTheme="majorHAnsi" w:cstheme="majorHAnsi"/>
               </w:rPr>
-              <w:t>Onsuccess</w:t>
+              <w:t>On success</w:t>
             </w:r>
-            <w:proofErr w:type="spellEnd"/>
           </w:p>
           <w:p>
             <w:pPr>
@@ -3368,14 +3341,12 @@
               </w:rPr>
               <w:t xml:space="preserve">On </w:t>
             </w:r>
-            <w:proofErr w:type="spellStart"/>
             <w:r>
               <w:rPr>
                 <w:rFonts w:asciiTheme="majorHAnsi" w:hAnsiTheme="majorHAnsi" w:cstheme="majorHAnsi"/>
               </w:rPr>
-              <w:t>failue</w:t>
+              <w:t>failure</w:t>
             </w:r>
-            <w:proofErr w:type="spellEnd"/>
           </w:p>
         </w:tc>
       </w:tr>
@@ -3418,10 +3389,10 @@
           <w:lang w:val="en-IN"/>
         </w:rPr>
         <w:drawing>
-          <wp:inline distT="0" distB="0" distL="0" distR="0" wp14:anchorId="0D0AF394" wp14:editId="51625D1B">
+          <wp:inline distT="0" distB="0" distL="0" distR="0" wp14:anchorId="2493FE4F" wp14:editId="72D9F53E">
             <wp:extent cx="5486400" cy="3498850"/>
             <wp:effectExtent l="0" t="0" r="0" b="6350"/>
-            <wp:docPr id="34039408" name="Picture 6"/>
+            <wp:docPr id="179709906" name="Picture 10"/>
             <wp:cNvGraphicFramePr>
               <a:graphicFrameLocks xmlns:a="http://schemas.openxmlformats.org/drawingml/2006/main" noChangeAspect="1"/>
             </wp:cNvGraphicFramePr>
@@ -3429,7 +3400,7 @@
               <a:graphicData uri="http://schemas.openxmlformats.org/drawingml/2006/picture">
                 <pic:pic xmlns:pic="http://schemas.openxmlformats.org/drawingml/2006/picture">
                   <pic:nvPicPr>
-                    <pic:cNvPr id="0" name="Picture 20"/>
+                    <pic:cNvPr id="0" name="Picture 34"/>
                     <pic:cNvPicPr>
                       <a:picLocks noChangeAspect="1" noChangeArrowheads="1"/>
                     </pic:cNvPicPr>
@@ -3471,6 +3442,7 @@
       <w:pPr>
         <w:rPr>
           <w:rFonts w:asciiTheme="majorHAnsi" w:hAnsiTheme="majorHAnsi" w:cstheme="majorHAnsi"/>
+          <w:lang w:val="en-IN"/>
         </w:rPr>
       </w:pPr>
     </w:p>
@@ -3493,48 +3465,20 @@
       </w:r>
     </w:p>
     <w:p>
-      <w:pPr>
-        <w:rPr>
-          <w:rFonts w:asciiTheme="majorHAnsi" w:hAnsiTheme="majorHAnsi" w:cstheme="majorHAnsi"/>
-        </w:rPr>
-      </w:pPr>
-      <w:r>
-        <w:rPr>
-          <w:rFonts w:asciiTheme="majorHAnsi" w:hAnsiTheme="majorHAnsi" w:cstheme="majorHAnsi"/>
-        </w:rPr>
-        <w:t>7.</w:t>
-      </w:r>
-      <w:r>
-        <w:rPr>
-          <w:rFonts w:asciiTheme="majorHAnsi" w:hAnsiTheme="majorHAnsi" w:cstheme="majorHAnsi"/>
-        </w:rPr>
-        <w:t>1.</w:t>
-      </w:r>
-      <w:r>
-        <w:rPr>
-          <w:rFonts w:asciiTheme="majorHAnsi" w:hAnsiTheme="majorHAnsi" w:cstheme="majorHAnsi"/>
-        </w:rPr>
-        <w:t xml:space="preserve"> Check</w:t>
-      </w:r>
-      <w:r>
-        <w:rPr>
-          <w:rFonts w:asciiTheme="majorHAnsi" w:hAnsiTheme="majorHAnsi" w:cstheme="majorHAnsi"/>
-        </w:rPr>
-        <w:t xml:space="preserve"> the status of thread creation.</w:t>
-      </w:r>
-      <w:r>
-        <w:rPr>
-          <w:rFonts w:asciiTheme="majorHAnsi" w:hAnsiTheme="majorHAnsi" w:cstheme="majorHAnsi"/>
-        </w:rPr>
-        <w:t xml:space="preserve"> If failed to create exit with a warning to the user.</w:t>
+      <w:r>
+        <w:t>7.1 Initialization</w:t>
+      </w:r>
+      <w:r>
+        <w:t xml:space="preserve"> –</w:t>
+      </w:r>
+      <w:r>
+        <w:t xml:space="preserve"> </w:t>
+      </w:r>
+      <w:r>
+        <w:t>Errors</w:t>
       </w:r>
     </w:p>
     <w:p>
-      <w:pPr>
-        <w:rPr>
-          <w:rFonts w:asciiTheme="majorHAnsi" w:hAnsiTheme="majorHAnsi" w:cstheme="majorHAnsi"/>
-        </w:rPr>
-      </w:pPr>
       <w:r>
         <w:rPr>
           <w:rFonts w:asciiTheme="majorHAnsi" w:hAnsiTheme="majorHAnsi" w:cstheme="majorHAnsi"/>
@@ -3545,7 +3489,13 @@
         <w:rPr>
           <w:rFonts w:asciiTheme="majorHAnsi" w:hAnsiTheme="majorHAnsi" w:cstheme="majorHAnsi"/>
         </w:rPr>
-        <w:t>2.</w:t>
+        <w:t>1.</w:t>
+      </w:r>
+      <w:r>
+        <w:rPr>
+          <w:rFonts w:asciiTheme="majorHAnsi" w:hAnsiTheme="majorHAnsi" w:cstheme="majorHAnsi"/>
+        </w:rPr>
+        <w:t>1.</w:t>
       </w:r>
       <w:r>
         <w:rPr>
@@ -3557,7 +3507,7 @@
         <w:rPr>
           <w:rFonts w:asciiTheme="majorHAnsi" w:hAnsiTheme="majorHAnsi" w:cstheme="majorHAnsi"/>
         </w:rPr>
-        <w:t xml:space="preserve"> message queue </w:t>
+        <w:t xml:space="preserve"> the status of thread </w:t>
       </w:r>
       <w:r>
         <w:rPr>
@@ -3575,7 +3525,19 @@
         <w:rPr>
           <w:rFonts w:asciiTheme="majorHAnsi" w:hAnsiTheme="majorHAnsi" w:cstheme="majorHAnsi"/>
         </w:rPr>
-        <w:t xml:space="preserve"> If failed to create exit with a warning to the user</w:t>
+        <w:t xml:space="preserve"> If failed to </w:t>
+      </w:r>
+      <w:r>
+        <w:rPr>
+          <w:rFonts w:asciiTheme="majorHAnsi" w:hAnsiTheme="majorHAnsi" w:cstheme="majorHAnsi"/>
+        </w:rPr>
+        <w:t>initialize</w:t>
+      </w:r>
+      <w:r>
+        <w:rPr>
+          <w:rFonts w:asciiTheme="majorHAnsi" w:hAnsiTheme="majorHAnsi" w:cstheme="majorHAnsi"/>
+        </w:rPr>
+        <w:t xml:space="preserve"> exit with a warning</w:t>
       </w:r>
       <w:r>
         <w:rPr>
@@ -3600,27 +3562,49 @@
         <w:rPr>
           <w:rFonts w:asciiTheme="majorHAnsi" w:hAnsiTheme="majorHAnsi" w:cstheme="majorHAnsi"/>
         </w:rPr>
-        <w:t>3.</w:t>
-      </w:r>
-      <w:r>
-        <w:rPr>
-          <w:rFonts w:asciiTheme="majorHAnsi" w:hAnsiTheme="majorHAnsi" w:cstheme="majorHAnsi"/>
-        </w:rPr>
-        <w:t xml:space="preserve"> </w:t>
-      </w:r>
-      <w:proofErr w:type="gramStart"/>
-      <w:r>
-        <w:rPr>
-          <w:rFonts w:asciiTheme="majorHAnsi" w:hAnsiTheme="majorHAnsi" w:cstheme="majorHAnsi"/>
-        </w:rPr>
-        <w:t>If</w:t>
-      </w:r>
-      <w:proofErr w:type="gramEnd"/>
-      <w:r>
-        <w:rPr>
-          <w:rFonts w:asciiTheme="majorHAnsi" w:hAnsiTheme="majorHAnsi" w:cstheme="majorHAnsi"/>
-        </w:rPr>
-        <w:t xml:space="preserve"> do not receive data with defined interval it shows hardware fault.</w:t>
+        <w:t>1.2</w:t>
+      </w:r>
+      <w:r>
+        <w:rPr>
+          <w:rFonts w:asciiTheme="majorHAnsi" w:hAnsiTheme="majorHAnsi" w:cstheme="majorHAnsi"/>
+        </w:rPr>
+        <w:t>.</w:t>
+      </w:r>
+      <w:r>
+        <w:rPr>
+          <w:rFonts w:asciiTheme="majorHAnsi" w:hAnsiTheme="majorHAnsi" w:cstheme="majorHAnsi"/>
+        </w:rPr>
+        <w:t xml:space="preserve"> Check</w:t>
+      </w:r>
+      <w:r>
+        <w:rPr>
+          <w:rFonts w:asciiTheme="majorHAnsi" w:hAnsiTheme="majorHAnsi" w:cstheme="majorHAnsi"/>
+        </w:rPr>
+        <w:t xml:space="preserve"> message queue </w:t>
+      </w:r>
+      <w:r>
+        <w:rPr>
+          <w:rFonts w:asciiTheme="majorHAnsi" w:hAnsiTheme="majorHAnsi" w:cstheme="majorHAnsi"/>
+        </w:rPr>
+        <w:t>initialization</w:t>
+      </w:r>
+      <w:r>
+        <w:rPr>
+          <w:rFonts w:asciiTheme="majorHAnsi" w:hAnsiTheme="majorHAnsi" w:cstheme="majorHAnsi"/>
+        </w:rPr>
+        <w:t>.</w:t>
+      </w:r>
+      <w:r>
+        <w:rPr>
+          <w:rFonts w:asciiTheme="majorHAnsi" w:hAnsiTheme="majorHAnsi" w:cstheme="majorHAnsi"/>
+        </w:rPr>
+        <w:t xml:space="preserve"> If failed to create exit with a warning</w:t>
+      </w:r>
+      <w:r>
+        <w:rPr>
+          <w:rFonts w:asciiTheme="majorHAnsi" w:hAnsiTheme="majorHAnsi" w:cstheme="majorHAnsi"/>
+        </w:rPr>
+        <w:t>.</w:t>
       </w:r>
     </w:p>
     <w:p>
@@ -3633,31 +3617,140 @@
         <w:rPr>
           <w:rFonts w:asciiTheme="majorHAnsi" w:hAnsiTheme="majorHAnsi" w:cstheme="majorHAnsi"/>
         </w:rPr>
+        <w:t>7.2 Overflow Management</w:t>
+      </w:r>
+    </w:p>
+    <w:p>
+      <w:pPr>
+        <w:rPr>
+          <w:rFonts w:asciiTheme="majorHAnsi" w:hAnsiTheme="majorHAnsi" w:cstheme="majorHAnsi"/>
+        </w:rPr>
+      </w:pPr>
+      <w:r>
+        <w:rPr>
+          <w:rFonts w:asciiTheme="majorHAnsi" w:hAnsiTheme="majorHAnsi" w:cstheme="majorHAnsi"/>
+        </w:rPr>
         <w:t>7.</w:t>
       </w:r>
       <w:r>
         <w:rPr>
           <w:rFonts w:asciiTheme="majorHAnsi" w:hAnsiTheme="majorHAnsi" w:cstheme="majorHAnsi"/>
         </w:rPr>
-        <w:t>4.</w:t>
-      </w:r>
-      <w:r>
-        <w:rPr>
-          <w:rFonts w:asciiTheme="majorHAnsi" w:hAnsiTheme="majorHAnsi" w:cstheme="majorHAnsi"/>
-        </w:rPr>
-        <w:t xml:space="preserve"> Check</w:t>
-      </w:r>
-      <w:r>
-        <w:rPr>
-          <w:rFonts w:asciiTheme="majorHAnsi" w:hAnsiTheme="majorHAnsi" w:cstheme="majorHAnsi"/>
-        </w:rPr>
-        <w:t xml:space="preserve"> the overflow of message queue to prevent system crashes</w:t>
+        <w:t>2</w:t>
       </w:r>
       <w:r>
         <w:rPr>
           <w:rFonts w:asciiTheme="majorHAnsi" w:hAnsiTheme="majorHAnsi" w:cstheme="majorHAnsi"/>
         </w:rPr>
         <w:t>.</w:t>
+      </w:r>
+      <w:r>
+        <w:rPr>
+          <w:rFonts w:asciiTheme="majorHAnsi" w:hAnsiTheme="majorHAnsi" w:cstheme="majorHAnsi"/>
+        </w:rPr>
+        <w:t>1.</w:t>
+      </w:r>
+      <w:r>
+        <w:rPr>
+          <w:rFonts w:asciiTheme="majorHAnsi" w:hAnsiTheme="majorHAnsi" w:cstheme="majorHAnsi"/>
+        </w:rPr>
+        <w:t xml:space="preserve"> </w:t>
+      </w:r>
+      <w:r>
+        <w:rPr>
+          <w:rFonts w:asciiTheme="majorHAnsi" w:hAnsiTheme="majorHAnsi" w:cstheme="majorHAnsi"/>
+        </w:rPr>
+        <w:t>M</w:t>
+      </w:r>
+      <w:r>
+        <w:rPr>
+          <w:rFonts w:asciiTheme="majorHAnsi" w:hAnsiTheme="majorHAnsi" w:cstheme="majorHAnsi"/>
+        </w:rPr>
+        <w:t>essage queue overflow detection and prevention</w:t>
+      </w:r>
+    </w:p>
+    <w:p>
+      <w:pPr>
+        <w:rPr>
+          <w:rFonts w:asciiTheme="majorHAnsi" w:hAnsiTheme="majorHAnsi" w:cstheme="majorHAnsi"/>
+        </w:rPr>
+      </w:pPr>
+      <w:r>
+        <w:rPr>
+          <w:rFonts w:asciiTheme="majorHAnsi" w:hAnsiTheme="majorHAnsi" w:cstheme="majorHAnsi"/>
+        </w:rPr>
+        <w:t>7.</w:t>
+      </w:r>
+      <w:r>
+        <w:rPr>
+          <w:rFonts w:asciiTheme="majorHAnsi" w:hAnsiTheme="majorHAnsi" w:cstheme="majorHAnsi"/>
+        </w:rPr>
+        <w:t>3 System Failure</w:t>
+      </w:r>
+    </w:p>
+    <w:p>
+      <w:pPr>
+        <w:rPr>
+          <w:rFonts w:asciiTheme="majorHAnsi" w:hAnsiTheme="majorHAnsi" w:cstheme="majorHAnsi"/>
+        </w:rPr>
+      </w:pPr>
+      <w:r>
+        <w:rPr>
+          <w:rFonts w:asciiTheme="majorHAnsi" w:hAnsiTheme="majorHAnsi" w:cstheme="majorHAnsi"/>
+        </w:rPr>
+        <w:t xml:space="preserve">7.3.1. If do not get data from message queue in a certain </w:t>
+      </w:r>
+      <w:r>
+        <w:rPr>
+          <w:rFonts w:asciiTheme="majorHAnsi" w:hAnsiTheme="majorHAnsi" w:cstheme="majorHAnsi"/>
+        </w:rPr>
+        <w:t>period</w:t>
+      </w:r>
+      <w:r>
+        <w:rPr>
+          <w:rFonts w:asciiTheme="majorHAnsi" w:hAnsiTheme="majorHAnsi" w:cstheme="majorHAnsi"/>
+        </w:rPr>
+        <w:t xml:space="preserve"> treat as hardware failure.</w:t>
+      </w:r>
+    </w:p>
+    <w:p>
+      <w:pPr>
+        <w:rPr>
+          <w:rFonts w:asciiTheme="majorHAnsi" w:hAnsiTheme="majorHAnsi" w:cstheme="majorHAnsi"/>
+        </w:rPr>
+      </w:pPr>
+      <w:r>
+        <w:rPr>
+          <w:rFonts w:asciiTheme="majorHAnsi" w:hAnsiTheme="majorHAnsi" w:cstheme="majorHAnsi"/>
+        </w:rPr>
+        <w:t>7.4 Common Errors</w:t>
+      </w:r>
+    </w:p>
+    <w:p>
+      <w:pPr>
+        <w:rPr>
+          <w:rFonts w:asciiTheme="majorHAnsi" w:hAnsiTheme="majorHAnsi" w:cstheme="majorHAnsi"/>
+        </w:rPr>
+      </w:pPr>
+      <w:r>
+        <w:rPr>
+          <w:rFonts w:asciiTheme="majorHAnsi" w:hAnsiTheme="majorHAnsi" w:cstheme="majorHAnsi"/>
+        </w:rPr>
+        <w:lastRenderedPageBreak/>
+        <w:t>7.4.1 CPU utilization.</w:t>
+      </w:r>
+    </w:p>
+    <w:p>
+      <w:pPr>
+        <w:rPr>
+          <w:rFonts w:asciiTheme="majorHAnsi" w:hAnsiTheme="majorHAnsi" w:cstheme="majorHAnsi"/>
+        </w:rPr>
+      </w:pPr>
+      <w:r>
+        <w:rPr>
+          <w:rFonts w:asciiTheme="majorHAnsi" w:hAnsiTheme="majorHAnsi" w:cstheme="majorHAnsi"/>
+        </w:rPr>
+        <w:t>7.4.2 Race conditions.</w:t>
       </w:r>
     </w:p>
     <w:p>
@@ -5261,6 +5354,119 @@
     </w:lvl>
   </w:abstractNum>
   <w:abstractNum w:abstractNumId="23" w15:restartNumberingAfterBreak="0">
+    <w:nsid w:val="693A1C3F"/>
+    <w:multiLevelType w:val="multilevel"/>
+    <w:tmpl w:val="A03CAD02"/>
+    <w:lvl w:ilvl="0">
+      <w:start w:val="4"/>
+      <w:numFmt w:val="decimal"/>
+      <w:lvlText w:val="%1"/>
+      <w:lvlJc w:val="left"/>
+      <w:pPr>
+        <w:ind w:left="360" w:hanging="360"/>
+      </w:pPr>
+      <w:rPr>
+        <w:rFonts w:hint="default"/>
+      </w:rPr>
+    </w:lvl>
+    <w:lvl w:ilvl="1">
+      <w:start w:val="1"/>
+      <w:numFmt w:val="decimal"/>
+      <w:lvlText w:val="%1.%2"/>
+      <w:lvlJc w:val="left"/>
+      <w:pPr>
+        <w:ind w:left="360" w:hanging="360"/>
+      </w:pPr>
+      <w:rPr>
+        <w:rFonts w:hint="default"/>
+      </w:rPr>
+    </w:lvl>
+    <w:lvl w:ilvl="2">
+      <w:start w:val="1"/>
+      <w:numFmt w:val="decimal"/>
+      <w:lvlText w:val="%1.%2.%3"/>
+      <w:lvlJc w:val="left"/>
+      <w:pPr>
+        <w:ind w:left="720" w:hanging="720"/>
+      </w:pPr>
+      <w:rPr>
+        <w:rFonts w:hint="default"/>
+      </w:rPr>
+    </w:lvl>
+    <w:lvl w:ilvl="3">
+      <w:start w:val="1"/>
+      <w:numFmt w:val="decimal"/>
+      <w:lvlText w:val="%1.%2.%3.%4"/>
+      <w:lvlJc w:val="left"/>
+      <w:pPr>
+        <w:ind w:left="720" w:hanging="720"/>
+      </w:pPr>
+      <w:rPr>
+        <w:rFonts w:hint="default"/>
+      </w:rPr>
+    </w:lvl>
+    <w:lvl w:ilvl="4">
+      <w:start w:val="1"/>
+      <w:numFmt w:val="decimal"/>
+      <w:lvlText w:val="%1.%2.%3.%4.%5"/>
+      <w:lvlJc w:val="left"/>
+      <w:pPr>
+        <w:ind w:left="1080" w:hanging="1080"/>
+      </w:pPr>
+      <w:rPr>
+        <w:rFonts w:hint="default"/>
+      </w:rPr>
+    </w:lvl>
+    <w:lvl w:ilvl="5">
+      <w:start w:val="1"/>
+      <w:numFmt w:val="decimal"/>
+      <w:lvlText w:val="%1.%2.%3.%4.%5.%6"/>
+      <w:lvlJc w:val="left"/>
+      <w:pPr>
+        <w:ind w:left="1080" w:hanging="1080"/>
+      </w:pPr>
+      <w:rPr>
+        <w:rFonts w:hint="default"/>
+      </w:rPr>
+    </w:lvl>
+    <w:lvl w:ilvl="6">
+      <w:start w:val="1"/>
+      <w:numFmt w:val="decimal"/>
+      <w:lvlText w:val="%1.%2.%3.%4.%5.%6.%7"/>
+      <w:lvlJc w:val="left"/>
+      <w:pPr>
+        <w:ind w:left="1440" w:hanging="1440"/>
+      </w:pPr>
+      <w:rPr>
+        <w:rFonts w:hint="default"/>
+      </w:rPr>
+    </w:lvl>
+    <w:lvl w:ilvl="7">
+      <w:start w:val="1"/>
+      <w:numFmt w:val="decimal"/>
+      <w:lvlText w:val="%1.%2.%3.%4.%5.%6.%7.%8"/>
+      <w:lvlJc w:val="left"/>
+      <w:pPr>
+        <w:ind w:left="1440" w:hanging="1440"/>
+      </w:pPr>
+      <w:rPr>
+        <w:rFonts w:hint="default"/>
+      </w:rPr>
+    </w:lvl>
+    <w:lvl w:ilvl="8">
+      <w:start w:val="1"/>
+      <w:numFmt w:val="decimal"/>
+      <w:lvlText w:val="%1.%2.%3.%4.%5.%6.%7.%8.%9"/>
+      <w:lvlJc w:val="left"/>
+      <w:pPr>
+        <w:ind w:left="1440" w:hanging="1440"/>
+      </w:pPr>
+      <w:rPr>
+        <w:rFonts w:hint="default"/>
+      </w:rPr>
+    </w:lvl>
+  </w:abstractNum>
+  <w:abstractNum w:abstractNumId="24" w15:restartNumberingAfterBreak="0">
     <w:nsid w:val="70E72FFA"/>
     <w:multiLevelType w:val="hybridMultilevel"/>
     <w:tmpl w:val="821859CC"/>
@@ -5373,7 +5579,7 @@
       </w:rPr>
     </w:lvl>
   </w:abstractNum>
-  <w:abstractNum w:abstractNumId="24" w15:restartNumberingAfterBreak="0">
+  <w:abstractNum w:abstractNumId="25" w15:restartNumberingAfterBreak="0">
     <w:nsid w:val="72283511"/>
     <w:multiLevelType w:val="hybridMultilevel"/>
     <w:tmpl w:val="F948CE4C"/>
@@ -5486,7 +5692,7 @@
       </w:rPr>
     </w:lvl>
   </w:abstractNum>
-  <w:abstractNum w:abstractNumId="25" w15:restartNumberingAfterBreak="0">
+  <w:abstractNum w:abstractNumId="26" w15:restartNumberingAfterBreak="0">
     <w:nsid w:val="75784C95"/>
     <w:multiLevelType w:val="hybridMultilevel"/>
     <w:tmpl w:val="35905A1C"/>
@@ -5574,7 +5780,7 @@
       </w:pPr>
     </w:lvl>
   </w:abstractNum>
-  <w:abstractNum w:abstractNumId="26" w15:restartNumberingAfterBreak="0">
+  <w:abstractNum w:abstractNumId="27" w15:restartNumberingAfterBreak="0">
     <w:nsid w:val="7CE35705"/>
     <w:multiLevelType w:val="hybridMultilevel"/>
     <w:tmpl w:val="F7A4E3CC"/>
@@ -5662,7 +5868,7 @@
       </w:pPr>
     </w:lvl>
   </w:abstractNum>
-  <w:abstractNum w:abstractNumId="27" w15:restartNumberingAfterBreak="0">
+  <w:abstractNum w:abstractNumId="28" w15:restartNumberingAfterBreak="0">
     <w:nsid w:val="7E596421"/>
     <w:multiLevelType w:val="hybridMultilevel"/>
     <w:tmpl w:val="33F232E0"/>
@@ -5818,7 +6024,7 @@
     <w:abstractNumId w:val="14"/>
   </w:num>
   <w:num w:numId="15" w16cid:durableId="1870601030">
-    <w:abstractNumId w:val="26"/>
+    <w:abstractNumId w:val="27"/>
   </w:num>
   <w:num w:numId="16" w16cid:durableId="1234390505">
     <w:abstractNumId w:val="18"/>
@@ -5833,22 +6039,22 @@
     <w:abstractNumId w:val="22"/>
   </w:num>
   <w:num w:numId="20" w16cid:durableId="461273406">
-    <w:abstractNumId w:val="25"/>
+    <w:abstractNumId w:val="26"/>
   </w:num>
   <w:num w:numId="21" w16cid:durableId="1209874860">
     <w:abstractNumId w:val="21"/>
   </w:num>
   <w:num w:numId="22" w16cid:durableId="127819321">
-    <w:abstractNumId w:val="27"/>
+    <w:abstractNumId w:val="28"/>
   </w:num>
   <w:num w:numId="23" w16cid:durableId="517545208">
     <w:abstractNumId w:val="9"/>
   </w:num>
   <w:num w:numId="24" w16cid:durableId="2115661203">
-    <w:abstractNumId w:val="23"/>
+    <w:abstractNumId w:val="24"/>
   </w:num>
   <w:num w:numId="25" w16cid:durableId="1039623911">
-    <w:abstractNumId w:val="24"/>
+    <w:abstractNumId w:val="25"/>
   </w:num>
   <w:num w:numId="26" w16cid:durableId="1075665110">
     <w:abstractNumId w:val="19"/>
@@ -5858,6 +6064,9 @@
   </w:num>
   <w:num w:numId="28" w16cid:durableId="1697777500">
     <w:abstractNumId w:val="12"/>
+  </w:num>
+  <w:num w:numId="29" w16cid:durableId="1701593053">
+    <w:abstractNumId w:val="23"/>
   </w:num>
 </w:numbering>
 </file>

</xml_diff>

<commit_message>
changed as per review
</commit_message>
<xml_diff>
--- a/docs/HLD/AltitudeMeasurement_HLD.docx
+++ b/docs/HLD/AltitudeMeasurement_HLD.docx
@@ -48,12 +48,31 @@
         <w:t>1. Purpose</w:t>
       </w:r>
     </w:p>
+    <w:p/>
     <w:p>
       <w:r>
         <w:rPr>
           <w:rFonts w:asciiTheme="majorHAnsi" w:hAnsiTheme="majorHAnsi" w:cstheme="majorHAnsi"/>
         </w:rPr>
-        <w:t>This document defines the procedure for acquiring altitude data from the sensor module, validating the readings against predefined thresholds, and triggering automated alarms based on the processed output</w:t>
+        <w:t xml:space="preserve">This document defines the </w:t>
+      </w:r>
+      <w:r>
+        <w:rPr>
+          <w:rFonts w:asciiTheme="majorHAnsi" w:hAnsiTheme="majorHAnsi" w:cstheme="majorHAnsi"/>
+        </w:rPr>
+        <w:t>high-level</w:t>
+      </w:r>
+      <w:r>
+        <w:rPr>
+          <w:rFonts w:asciiTheme="majorHAnsi" w:hAnsiTheme="majorHAnsi" w:cstheme="majorHAnsi"/>
+        </w:rPr>
+        <w:t xml:space="preserve"> design</w:t>
+      </w:r>
+      <w:r>
+        <w:rPr>
+          <w:rFonts w:asciiTheme="majorHAnsi" w:hAnsiTheme="majorHAnsi" w:cstheme="majorHAnsi"/>
+        </w:rPr>
+        <w:t xml:space="preserve"> for acquiring altitude data from the sensor module, validating the readings against predefined thresholds, and triggering automated alarms based on the processed output</w:t>
       </w:r>
       <w:r>
         <w:rPr>
@@ -70,6 +89,7 @@
         <w:t>2. System Overview</w:t>
       </w:r>
     </w:p>
+    <w:p/>
     <w:p>
       <w:pPr>
         <w:rPr>
@@ -80,7 +100,89 @@
         <w:rPr>
           <w:rFonts w:asciiTheme="majorHAnsi" w:hAnsiTheme="majorHAnsi" w:cstheme="majorHAnsi"/>
         </w:rPr>
-        <w:t xml:space="preserve">The Altitude Measurement System is designed to acquire real-time altitude values from a sensor module. It operates at a defined frequency [F] and monitoring interval [I]. During each interval [I], the system processes sensor data, performs validation against defined altitude thresholds [THRESHOLD_MIN, THRESOLD_MAX], and executes an alarm up to define </w:t>
+        <w:t xml:space="preserve">The Altitude Measurement System is designed to acquire real-time altitude values from a sensor module. It operates at a defined frequency </w:t>
+      </w:r>
+      <w:r>
+        <w:rPr>
+          <w:rFonts w:asciiTheme="majorHAnsi" w:hAnsiTheme="majorHAnsi" w:cstheme="majorHAnsi"/>
+          <w:i/>
+          <w:iCs/>
+        </w:rPr>
+        <w:t>[F]</w:t>
+      </w:r>
+      <w:r>
+        <w:rPr>
+          <w:rFonts w:asciiTheme="majorHAnsi" w:hAnsiTheme="majorHAnsi" w:cstheme="majorHAnsi"/>
+        </w:rPr>
+        <w:t xml:space="preserve"> and monitoring interval </w:t>
+      </w:r>
+      <w:r>
+        <w:rPr>
+          <w:rFonts w:asciiTheme="majorHAnsi" w:hAnsiTheme="majorHAnsi" w:cstheme="majorHAnsi"/>
+          <w:i/>
+          <w:iCs/>
+        </w:rPr>
+        <w:t>[I].</w:t>
+      </w:r>
+      <w:r>
+        <w:rPr>
+          <w:rFonts w:asciiTheme="majorHAnsi" w:hAnsiTheme="majorHAnsi" w:cstheme="majorHAnsi"/>
+        </w:rPr>
+        <w:t xml:space="preserve"> During each interval </w:t>
+      </w:r>
+      <w:r>
+        <w:rPr>
+          <w:rFonts w:asciiTheme="majorHAnsi" w:hAnsiTheme="majorHAnsi" w:cstheme="majorHAnsi"/>
+          <w:i/>
+          <w:iCs/>
+        </w:rPr>
+        <w:t>[I],</w:t>
+      </w:r>
+      <w:r>
+        <w:rPr>
+          <w:rFonts w:asciiTheme="majorHAnsi" w:hAnsiTheme="majorHAnsi" w:cstheme="majorHAnsi"/>
+        </w:rPr>
+        <w:t xml:space="preserve"> the system processes sensor data</w:t>
+      </w:r>
+      <w:r>
+        <w:rPr>
+          <w:rFonts w:asciiTheme="majorHAnsi" w:hAnsiTheme="majorHAnsi" w:cstheme="majorHAnsi"/>
+        </w:rPr>
+        <w:t xml:space="preserve"> </w:t>
+      </w:r>
+      <w:r>
+        <w:rPr>
+          <w:rFonts w:asciiTheme="majorHAnsi" w:hAnsiTheme="majorHAnsi" w:cstheme="majorHAnsi"/>
+        </w:rPr>
+        <w:t>[</w:t>
+      </w:r>
+      <w:r>
+        <w:rPr>
+          <w:rFonts w:asciiTheme="majorHAnsi" w:hAnsiTheme="majorHAnsi" w:cstheme="majorHAnsi"/>
+          <w:i/>
+          <w:iCs/>
+        </w:rPr>
+        <w:t>MIN_RANGE , MAX RANGE]</w:t>
+      </w:r>
+      <w:r>
+        <w:rPr>
+          <w:rFonts w:asciiTheme="majorHAnsi" w:hAnsiTheme="majorHAnsi" w:cstheme="majorHAnsi"/>
+        </w:rPr>
+        <w:t xml:space="preserve">, performs validation against defined altitude thresholds </w:t>
+      </w:r>
+      <w:r>
+        <w:rPr>
+          <w:rFonts w:asciiTheme="majorHAnsi" w:hAnsiTheme="majorHAnsi" w:cstheme="majorHAnsi"/>
+          <w:i/>
+          <w:iCs/>
+        </w:rPr>
+        <w:t>[THRESHOLD_MIN, THRESOLD_MAX],</w:t>
+      </w:r>
+      <w:r>
+        <w:rPr>
+          <w:rFonts w:asciiTheme="majorHAnsi" w:hAnsiTheme="majorHAnsi" w:cstheme="majorHAnsi"/>
+        </w:rPr>
+        <w:t xml:space="preserve"> and executes an alarm up to define </w:t>
       </w:r>
       <w:r>
         <w:rPr>
@@ -92,7 +194,21 @@
         <w:rPr>
           <w:rFonts w:asciiTheme="majorHAnsi" w:hAnsiTheme="majorHAnsi" w:cstheme="majorHAnsi"/>
         </w:rPr>
-        <w:t xml:space="preserve"> [ALARM_TIMEOUT]  if necessary</w:t>
+        <w:t xml:space="preserve"> </w:t>
+      </w:r>
+      <w:r>
+        <w:rPr>
+          <w:rFonts w:asciiTheme="majorHAnsi" w:hAnsiTheme="majorHAnsi" w:cstheme="majorHAnsi"/>
+          <w:i/>
+          <w:iCs/>
+        </w:rPr>
+        <w:t>[ALARM_TIMEOUT]</w:t>
+      </w:r>
+      <w:r>
+        <w:rPr>
+          <w:rFonts w:asciiTheme="majorHAnsi" w:hAnsiTheme="majorHAnsi" w:cstheme="majorHAnsi"/>
+        </w:rPr>
+        <w:t xml:space="preserve">  if necessary</w:t>
       </w:r>
       <w:r>
         <w:rPr>
@@ -100,6 +216,12 @@
         </w:rPr>
         <w:t xml:space="preserve"> .</w:t>
       </w:r>
+      <w:r>
+        <w:rPr>
+          <w:rFonts w:asciiTheme="majorHAnsi" w:hAnsiTheme="majorHAnsi" w:cstheme="majorHAnsi"/>
+        </w:rPr>
+        <w:t xml:space="preserve"> </w:t>
+      </w:r>
     </w:p>
     <w:p>
       <w:pPr>
@@ -109,6 +231,7 @@
         <w:t>2.1 Key components</w:t>
       </w:r>
     </w:p>
+    <w:p/>
     <w:p>
       <w:r>
         <w:rPr>
@@ -124,13 +247,42 @@
         </w:rPr>
         <w:t xml:space="preserve"> </w:t>
       </w:r>
-      <w:r>
-        <w:t>- The system interfaces with the sensor module with given frequency [F] to gather real time altitude data. The timing is synchronized to a fixed interval [I] to ensure data consistency.</w:t>
+    </w:p>
+    <w:p>
+      <w:r>
+        <w:t xml:space="preserve">The </w:t>
+      </w:r>
+      <w:r>
+        <w:t xml:space="preserve">Sensor Management </w:t>
+      </w:r>
+      <w:r>
+        <w:t xml:space="preserve">system interfaces with the sensor module with given frequency </w:t>
+      </w:r>
+      <w:r>
+        <w:rPr>
+          <w:i/>
+          <w:iCs/>
+        </w:rPr>
+        <w:t>[F]</w:t>
+      </w:r>
+      <w:r>
+        <w:t xml:space="preserve"> to gather real time altitude data. The timing is synchronized to a fixed interval </w:t>
+      </w:r>
+      <w:r>
+        <w:rPr>
+          <w:i/>
+          <w:iCs/>
+        </w:rPr>
+        <w:t xml:space="preserve">[I] </w:t>
+      </w:r>
+      <w:r>
+        <w:t>to ensure data consistency.</w:t>
       </w:r>
       <w:r>
         <w:t xml:space="preserve"> Expect sensor value as maximum of  4-byte data. </w:t>
       </w:r>
     </w:p>
+    <w:p/>
     <w:p>
       <w:r>
         <w:rPr>
@@ -146,17 +298,101 @@
         </w:rPr>
         <w:t xml:space="preserve"> </w:t>
       </w:r>
-      <w:r>
-        <w:t>– Within a specific interval [I] the system processes the raw data to analyze the altitude values. The system validates the altitude readings against predefined thresholds [THRESHOLD_MIN, THRESOLD_MAX]. If a value exceeds the limit set event bit.</w:t>
-      </w:r>
     </w:p>
     <w:p>
       <w:r>
+        <w:t>In Validation Engine</w:t>
+      </w:r>
+      <w:r>
+        <w:t>,</w:t>
+      </w:r>
+      <w:r>
+        <w:t xml:space="preserve"> the system </w:t>
+      </w:r>
+      <w:r>
+        <w:t>executes</w:t>
+      </w:r>
+      <w:r>
+        <w:t xml:space="preserve"> w</w:t>
+      </w:r>
+      <w:r>
+        <w:t xml:space="preserve">ithin a specific </w:t>
+      </w:r>
+      <w:r>
+        <w:rPr>
+          <w:i/>
+          <w:iCs/>
+        </w:rPr>
+        <w:t xml:space="preserve">interval </w:t>
+      </w:r>
+      <w:r>
+        <w:rPr>
+          <w:i/>
+          <w:iCs/>
+        </w:rPr>
+        <w:t>[I],</w:t>
+      </w:r>
+      <w:r>
+        <w:t xml:space="preserve"> the system processes </w:t>
+      </w:r>
+      <w:r>
+        <w:t>raw</w:t>
+      </w:r>
+      <w:r>
+        <w:t xml:space="preserve"> data to analyze the altitude values</w:t>
+      </w:r>
+      <w:r>
+        <w:t xml:space="preserve"> within range </w:t>
+      </w:r>
+      <w:r>
+        <w:rPr>
+          <w:rFonts w:asciiTheme="majorHAnsi" w:hAnsiTheme="majorHAnsi" w:cstheme="majorHAnsi"/>
+        </w:rPr>
+        <w:t>[</w:t>
+      </w:r>
+      <w:r>
+        <w:rPr>
+          <w:rFonts w:asciiTheme="majorHAnsi" w:hAnsiTheme="majorHAnsi" w:cstheme="majorHAnsi"/>
+          <w:i/>
+          <w:iCs/>
+        </w:rPr>
+        <w:t>MIN_RANGE , MAX RANGE]</w:t>
+      </w:r>
+      <w:r>
+        <w:t xml:space="preserve"> </w:t>
+      </w:r>
+      <w:r>
+        <w:t xml:space="preserve">. The system validates the altitude readings against predefined thresholds </w:t>
+      </w:r>
+      <w:r>
+        <w:rPr>
+          <w:i/>
+          <w:iCs/>
+        </w:rPr>
+        <w:t>[THRESHOLD_MIN, THRESOLD_MAX].</w:t>
+      </w:r>
+      <w:r>
+        <w:t xml:space="preserve"> If a value exceeds the limit set event bit.</w:t>
+      </w:r>
+    </w:p>
+    <w:p/>
+    <w:p>
+      <w:pPr>
         <w:rPr>
           <w:b/>
           <w:bCs/>
           <w:color w:val="4F81BD" w:themeColor="accent1"/>
         </w:rPr>
+      </w:pPr>
+    </w:p>
+    <w:p>
+      <w:r>
+        <w:rPr>
+          <w:b/>
+          <w:bCs/>
+          <w:color w:val="4F81BD" w:themeColor="accent1"/>
+        </w:rPr>
+        <w:lastRenderedPageBreak/>
         <w:t>2.1.3. Alarm Management</w:t>
       </w:r>
       <w:r>
@@ -165,15 +401,41 @@
         </w:rPr>
         <w:t xml:space="preserve"> </w:t>
       </w:r>
-      <w:r>
-        <w:t xml:space="preserve">– The system read the event bit, and an alarm is triggered up to a specified </w:t>
+    </w:p>
+    <w:p>
+      <w:pPr>
+        <w:rPr>
+          <w:i/>
+          <w:iCs/>
+        </w:rPr>
+      </w:pPr>
+      <w:r>
+        <w:t xml:space="preserve">The alarm management system will be </w:t>
+      </w:r>
+      <w:r>
+        <w:t xml:space="preserve">read the event bit, and an alarm is triggered up to a specified </w:t>
       </w:r>
       <w:r>
         <w:t>timeout</w:t>
       </w:r>
       <w:r>
-        <w:t xml:space="preserve"> [ALARM_TIMEOUT].</w:t>
-      </w:r>
+        <w:t xml:space="preserve"> </w:t>
+      </w:r>
+      <w:r>
+        <w:rPr>
+          <w:i/>
+          <w:iCs/>
+        </w:rPr>
+        <w:t>[ALARM_TIMEOUT].</w:t>
+      </w:r>
+    </w:p>
+    <w:p>
+      <w:pPr>
+        <w:rPr>
+          <w:i/>
+          <w:iCs/>
+        </w:rPr>
+      </w:pPr>
     </w:p>
     <w:p>
       <w:pPr>
@@ -192,6 +454,7 @@
       </w:pPr>
       <w:r>
         <w:rPr>
+          <w:noProof/>
           <w:lang w:val="en-IN"/>
         </w:rPr>
         <w:drawing>
@@ -250,18 +513,19 @@
         <w:pStyle w:val="Heading2"/>
       </w:pPr>
       <w:r>
-        <w:lastRenderedPageBreak/>
         <w:t>3. Software Architecture</w:t>
       </w:r>
     </w:p>
+    <w:p/>
     <w:p>
       <w:r>
-        <w:t xml:space="preserve"> The software is designed to follow layered architecture, that ensures each module is well defined and organized .</w:t>
+        <w:t>The software is designed to follow layered architecture, that ensures each module is well defined and organized .</w:t>
       </w:r>
       <w:r>
         <w:t xml:space="preserve"> </w:t>
       </w:r>
     </w:p>
+    <w:p/>
     <w:p>
       <w:pPr>
         <w:pStyle w:val="Heading3"/>
@@ -270,6 +534,7 @@
         <w:t>3.1. Modules</w:t>
       </w:r>
     </w:p>
+    <w:p/>
     <w:tbl>
       <w:tblPr>
         <w:tblStyle w:val="TableGrid"/>
@@ -277,17 +542,18 @@
         <w:tblLook w:val="04A0" w:firstRow="1" w:lastRow="0" w:firstColumn="1" w:lastColumn="0" w:noHBand="0" w:noVBand="1"/>
       </w:tblPr>
       <w:tblGrid>
-        <w:gridCol w:w="1771"/>
-        <w:gridCol w:w="1771"/>
+        <w:gridCol w:w="675"/>
+        <w:gridCol w:w="2867"/>
         <w:gridCol w:w="5497"/>
       </w:tblGrid>
       <w:tr>
         <w:tc>
           <w:tcPr>
-            <w:tcW w:w="1771" w:type="dxa"/>
+            <w:tcW w:w="675" w:type="dxa"/>
           </w:tcPr>
           <w:p>
             <w:pPr>
+              <w:jc w:val="center"/>
               <w:rPr>
                 <w:b/>
                 <w:bCs/>
@@ -306,10 +572,11 @@
         </w:tc>
         <w:tc>
           <w:tcPr>
-            <w:tcW w:w="1771" w:type="dxa"/>
+            <w:tcW w:w="2867" w:type="dxa"/>
           </w:tcPr>
           <w:p>
             <w:pPr>
+              <w:jc w:val="center"/>
               <w:rPr>
                 <w:b/>
                 <w:bCs/>
@@ -332,6 +599,7 @@
           </w:tcPr>
           <w:p>
             <w:pPr>
+              <w:jc w:val="center"/>
               <w:rPr>
                 <w:b/>
                 <w:bCs/>
@@ -352,9 +620,12 @@
       <w:tr>
         <w:tc>
           <w:tcPr>
-            <w:tcW w:w="1771" w:type="dxa"/>
+            <w:tcW w:w="675" w:type="dxa"/>
           </w:tcPr>
           <w:p>
+            <w:pPr>
+              <w:jc w:val="center"/>
+            </w:pPr>
             <w:r>
               <w:t>1</w:t>
             </w:r>
@@ -362,9 +633,12 @@
         </w:tc>
         <w:tc>
           <w:tcPr>
-            <w:tcW w:w="1771" w:type="dxa"/>
+            <w:tcW w:w="2867" w:type="dxa"/>
           </w:tcPr>
           <w:p>
+            <w:pPr>
+              <w:jc w:val="center"/>
+            </w:pPr>
             <w:r>
               <w:t>Sensor Management</w:t>
             </w:r>
@@ -376,13 +650,27 @@
           </w:tcPr>
           <w:p>
             <w:r>
-              <w:t>Initialize the sensor module with [</w:t>
+              <w:t xml:space="preserve">Initialize the sensor module with </w:t>
             </w:r>
             <w:r>
-              <w:t>F</w:t>
+              <w:rPr>
+                <w:i/>
+                <w:iCs/>
+              </w:rPr>
+              <w:t>[F]</w:t>
             </w:r>
             <w:r>
-              <w:t>] frequency. Read data from [I] interval and push to the message queue</w:t>
+              <w:t xml:space="preserve"> frequency. Read data from </w:t>
+            </w:r>
+            <w:r>
+              <w:rPr>
+                <w:i/>
+                <w:iCs/>
+              </w:rPr>
+              <w:t>[I]</w:t>
+            </w:r>
+            <w:r>
+              <w:t xml:space="preserve"> interval and push to the message queue</w:t>
             </w:r>
             <w:r>
               <w:t>.</w:t>
@@ -393,10 +681,11 @@
       <w:tr>
         <w:tc>
           <w:tcPr>
-            <w:tcW w:w="1771" w:type="dxa"/>
+            <w:tcW w:w="675" w:type="dxa"/>
           </w:tcPr>
           <w:p>
             <w:pPr>
+              <w:jc w:val="center"/>
               <w:rPr>
                 <w:color w:val="4F81BD" w:themeColor="accent1"/>
               </w:rPr>
@@ -408,10 +697,11 @@
         </w:tc>
         <w:tc>
           <w:tcPr>
-            <w:tcW w:w="1771" w:type="dxa"/>
+            <w:tcW w:w="2867" w:type="dxa"/>
           </w:tcPr>
           <w:p>
             <w:pPr>
+              <w:jc w:val="center"/>
               <w:rPr>
                 <w:color w:val="4F81BD" w:themeColor="accent1"/>
               </w:rPr>
@@ -432,7 +722,17 @@
               </w:rPr>
             </w:pPr>
             <w:r>
-              <w:t>Read data from the message queue and perform validation with [THRESHOLD_MIN, THRESOLD_MAX]. If processed output exceeds the limit it, set event signal.</w:t>
+              <w:t xml:space="preserve">Read data from the message queue and perform validation with </w:t>
+            </w:r>
+            <w:r>
+              <w:rPr>
+                <w:i/>
+                <w:iCs/>
+              </w:rPr>
+              <w:t>[THRESHOLD_MIN, THRESOLD_MAX].</w:t>
+            </w:r>
+            <w:r>
+              <w:t xml:space="preserve"> If processed output exceeds the limit it, set event signal.</w:t>
             </w:r>
           </w:p>
         </w:tc>
@@ -440,10 +740,11 @@
       <w:tr>
         <w:tc>
           <w:tcPr>
-            <w:tcW w:w="1771" w:type="dxa"/>
+            <w:tcW w:w="675" w:type="dxa"/>
           </w:tcPr>
           <w:p>
             <w:pPr>
+              <w:jc w:val="center"/>
               <w:rPr>
                 <w:color w:val="4F81BD" w:themeColor="accent1"/>
               </w:rPr>
@@ -455,10 +756,11 @@
         </w:tc>
         <w:tc>
           <w:tcPr>
-            <w:tcW w:w="1771" w:type="dxa"/>
+            <w:tcW w:w="2867" w:type="dxa"/>
           </w:tcPr>
           <w:p>
             <w:pPr>
+              <w:jc w:val="center"/>
               <w:rPr>
                 <w:color w:val="4F81BD" w:themeColor="accent1"/>
               </w:rPr>
@@ -497,13 +799,15 @@
               <w:rPr>
                 <w:rFonts w:asciiTheme="majorHAnsi" w:hAnsiTheme="majorHAnsi" w:cstheme="majorHAnsi"/>
               </w:rPr>
-              <w:t xml:space="preserve"> [ALARM_TIMEOUT]</w:t>
+              <w:t xml:space="preserve"> </w:t>
             </w:r>
             <w:r>
               <w:rPr>
                 <w:rFonts w:asciiTheme="majorHAnsi" w:hAnsiTheme="majorHAnsi" w:cstheme="majorHAnsi"/>
+                <w:i/>
+                <w:iCs/>
               </w:rPr>
-              <w:t>.</w:t>
+              <w:t>[ALARM_TIMEOUT].</w:t>
             </w:r>
           </w:p>
         </w:tc>
@@ -518,6 +822,34 @@
     </w:p>
     <w:p>
       <w:pPr>
+        <w:rPr>
+          <w:color w:val="4F81BD" w:themeColor="accent1"/>
+        </w:rPr>
+      </w:pPr>
+    </w:p>
+    <w:p>
+      <w:pPr>
+        <w:rPr>
+          <w:color w:val="4F81BD" w:themeColor="accent1"/>
+        </w:rPr>
+      </w:pPr>
+    </w:p>
+    <w:p>
+      <w:pPr>
+        <w:rPr>
+          <w:color w:val="4F81BD" w:themeColor="accent1"/>
+        </w:rPr>
+      </w:pPr>
+    </w:p>
+    <w:p>
+      <w:pPr>
+        <w:rPr>
+          <w:color w:val="4F81BD" w:themeColor="accent1"/>
+        </w:rPr>
+      </w:pPr>
+    </w:p>
+    <w:p>
+      <w:pPr>
         <w:pStyle w:val="Heading3"/>
       </w:pPr>
       <w:r>
@@ -533,6 +865,7 @@
       </w:pPr>
       <w:r>
         <w:rPr>
+          <w:noProof/>
           <w:lang w:val="en-IN"/>
         </w:rPr>
         <w:drawing>
@@ -611,12 +944,16 @@
         <w:t>Sensor Management</w:t>
       </w:r>
     </w:p>
+    <w:p/>
     <w:p>
       <w:r>
         <w:t xml:space="preserve">     </w:t>
       </w:r>
       <w:r>
         <w:t xml:space="preserve">  </w:t>
+      </w:r>
+      <w:r>
+        <w:t xml:space="preserve">Sensor management will initialize ,read and push the altitude data. </w:t>
       </w:r>
       <w:r>
         <w:t>The responsibility of the modules is</w:t>
@@ -640,13 +977,17 @@
         <w:t>tion</w:t>
       </w:r>
       <w:r>
-        <w:t xml:space="preserve"> of sensor module with [</w:t>
-      </w:r>
-      <w:r>
-        <w:t>F</w:t>
-      </w:r>
-      <w:r>
-        <w:t>] frequency</w:t>
+        <w:t xml:space="preserve"> of sensor module with </w:t>
+      </w:r>
+      <w:r>
+        <w:rPr>
+          <w:i/>
+          <w:iCs/>
+        </w:rPr>
+        <w:t>[F]</w:t>
+      </w:r>
+      <w:r>
+        <w:t xml:space="preserve"> frequency</w:t>
       </w:r>
       <w:r>
         <w:t>.</w:t>
@@ -670,7 +1011,17 @@
         <w:t xml:space="preserve"> data </w:t>
       </w:r>
       <w:r>
-        <w:t xml:space="preserve"> in [I] interval</w:t>
+        <w:t xml:space="preserve"> in </w:t>
+      </w:r>
+      <w:r>
+        <w:rPr>
+          <w:i/>
+          <w:iCs/>
+        </w:rPr>
+        <w:t>[I]</w:t>
+      </w:r>
+      <w:r>
+        <w:t xml:space="preserve"> interval</w:t>
       </w:r>
       <w:r>
         <w:t>.</w:t>
@@ -685,27 +1036,43 @@
         </w:numPr>
       </w:pPr>
       <w:r>
-        <w:t>Push the raw data in message queue.</w:t>
+        <w:t>Create message queue.</w:t>
       </w:r>
     </w:p>
     <w:p>
       <w:pPr>
-        <w:pStyle w:val="Heading3"/>
-      </w:pPr>
-      <w:r>
-        <w:t>4.2</w:t>
-      </w:r>
-      <w:r>
-        <w:t xml:space="preserve"> </w:t>
-      </w:r>
-      <w:r>
-        <w:t>Validation Engine</w:t>
-      </w:r>
-      <w:r>
-        <w:t xml:space="preserve"> </w:t>
+        <w:pStyle w:val="ListParagraph"/>
+        <w:numPr>
+          <w:ilvl w:val="0"/>
+          <w:numId w:val="10"/>
+        </w:numPr>
+      </w:pPr>
+      <w:r>
+        <w:t>Push the raw data in message queue.</w:t>
       </w:r>
     </w:p>
     <w:p>
+      <w:pPr>
+        <w:pStyle w:val="Heading3"/>
+      </w:pPr>
+      <w:r>
+        <w:t>4.2</w:t>
+      </w:r>
+      <w:r>
+        <w:t xml:space="preserve"> </w:t>
+      </w:r>
+      <w:r>
+        <w:t>Validation Engine</w:t>
+      </w:r>
+      <w:r>
+        <w:t xml:space="preserve"> </w:t>
+      </w:r>
+    </w:p>
+    <w:p/>
+    <w:p>
+      <w:r>
+        <w:t>The Validation engine performs the processing of data and validation.</w:t>
+      </w:r>
       <w:r>
         <w:t xml:space="preserve"> The responsibility of the modules </w:t>
       </w:r>
@@ -728,19 +1095,21 @@
         <w:rPr>
           <w:rFonts w:asciiTheme="majorHAnsi" w:hAnsiTheme="majorHAnsi" w:cstheme="majorHAnsi"/>
         </w:rPr>
-        <w:t>Read</w:t>
+        <w:t>Read the raw data from the message queue</w:t>
       </w:r>
       <w:r>
         <w:rPr>
           <w:rFonts w:asciiTheme="majorHAnsi" w:hAnsiTheme="majorHAnsi" w:cstheme="majorHAnsi"/>
         </w:rPr>
-        <w:t xml:space="preserve"> the raw data from the message queue</w:t>
+        <w:t xml:space="preserve"> and check them with [</w:t>
       </w:r>
       <w:r>
         <w:rPr>
           <w:rFonts w:asciiTheme="majorHAnsi" w:hAnsiTheme="majorHAnsi" w:cstheme="majorHAnsi"/>
+          <w:i/>
+          <w:iCs/>
         </w:rPr>
-        <w:t>.</w:t>
+        <w:t>MIN_RANGE , MAX RANGE]</w:t>
       </w:r>
     </w:p>
     <w:p>
@@ -750,6 +1119,10 @@
           <w:ilvl w:val="0"/>
           <w:numId w:val="11"/>
         </w:numPr>
+        <w:rPr>
+          <w:i/>
+          <w:iCs/>
+        </w:rPr>
       </w:pPr>
       <w:r>
         <w:rPr>
@@ -758,7 +1131,25 @@
         <w:t xml:space="preserve">Validate the altitude data with predefined threshold value </w:t>
       </w:r>
       <w:r>
-        <w:t>[THRESHOLD_MIN, THRESOLD_MAX].</w:t>
+        <w:rPr>
+          <w:i/>
+          <w:iCs/>
+        </w:rPr>
+        <w:t>[THRESHOLD_MIN, THRES</w:t>
+      </w:r>
+      <w:r>
+        <w:rPr>
+          <w:i/>
+          <w:iCs/>
+        </w:rPr>
+        <w:t>H</w:t>
+      </w:r>
+      <w:r>
+        <w:rPr>
+          <w:i/>
+          <w:iCs/>
+        </w:rPr>
+        <w:t>OLD_MAX].</w:t>
       </w:r>
     </w:p>
     <w:p>
@@ -776,83 +1167,100 @@
         <w:rPr>
           <w:rFonts w:asciiTheme="majorHAnsi" w:hAnsiTheme="majorHAnsi" w:cstheme="majorHAnsi"/>
         </w:rPr>
-        <w:lastRenderedPageBreak/>
-        <w:t xml:space="preserve">If </w:t>
+        <w:t xml:space="preserve">If altitude exceeds the boundary </w:t>
+      </w:r>
+      <w:r>
+        <w:rPr>
+          <w:i/>
+          <w:iCs/>
+        </w:rPr>
+        <w:t>[THRESHOLD_MIN, THRES</w:t>
+      </w:r>
+      <w:r>
+        <w:rPr>
+          <w:i/>
+          <w:iCs/>
+        </w:rPr>
+        <w:t>H</w:t>
+      </w:r>
+      <w:r>
+        <w:rPr>
+          <w:i/>
+          <w:iCs/>
+        </w:rPr>
+        <w:t xml:space="preserve">OLD_MAX] </w:t>
       </w:r>
       <w:r>
         <w:rPr>
           <w:rFonts w:asciiTheme="majorHAnsi" w:hAnsiTheme="majorHAnsi" w:cstheme="majorHAnsi"/>
         </w:rPr>
-        <w:t>altitude</w:t>
-      </w:r>
-      <w:r>
+        <w:t>we set, then  set an event signal.</w:t>
+      </w:r>
+    </w:p>
+    <w:p>
+      <w:pPr>
         <w:rPr>
           <w:rFonts w:asciiTheme="majorHAnsi" w:hAnsiTheme="majorHAnsi" w:cstheme="majorHAnsi"/>
         </w:rPr>
-        <w:t xml:space="preserve"> exceeds the </w:t>
-      </w:r>
-      <w:r>
+      </w:pPr>
+    </w:p>
+    <w:p>
+      <w:pPr>
         <w:rPr>
           <w:rFonts w:asciiTheme="majorHAnsi" w:hAnsiTheme="majorHAnsi" w:cstheme="majorHAnsi"/>
         </w:rPr>
-        <w:t xml:space="preserve">boundary </w:t>
-      </w:r>
-      <w:r>
-        <w:t>[THRESHOLD_MIN, THRESOLD_MAX]</w:t>
+      </w:pPr>
+    </w:p>
+    <w:p>
+      <w:pPr>
+        <w:pStyle w:val="Heading3"/>
+      </w:pPr>
+      <w:r>
+        <w:t xml:space="preserve">4.3 </w:t>
+      </w:r>
+      <w:r>
+        <w:t>Alarm Management</w:t>
       </w:r>
       <w:r>
         <w:t xml:space="preserve"> </w:t>
       </w:r>
-      <w:r>
+    </w:p>
+    <w:p/>
+    <w:p>
+      <w:pPr>
         <w:rPr>
           <w:rFonts w:asciiTheme="majorHAnsi" w:hAnsiTheme="majorHAnsi" w:cstheme="majorHAnsi"/>
         </w:rPr>
-        <w:t xml:space="preserve">we set, then </w:t>
-      </w:r>
+      </w:pPr>
       <w:r>
         <w:rPr>
           <w:rFonts w:asciiTheme="majorHAnsi" w:hAnsiTheme="majorHAnsi" w:cstheme="majorHAnsi"/>
         </w:rPr>
-        <w:t xml:space="preserve"> set </w:t>
+        <w:t xml:space="preserve">  </w:t>
       </w:r>
       <w:r>
         <w:rPr>
           <w:rFonts w:asciiTheme="majorHAnsi" w:hAnsiTheme="majorHAnsi" w:cstheme="majorHAnsi"/>
         </w:rPr>
-        <w:t xml:space="preserve">an </w:t>
+        <w:t xml:space="preserve">Alarm Management system will be </w:t>
       </w:r>
       <w:r>
         <w:rPr>
           <w:rFonts w:asciiTheme="majorHAnsi" w:hAnsiTheme="majorHAnsi" w:cstheme="majorHAnsi"/>
         </w:rPr>
-        <w:t>event signal.</w:t>
-      </w:r>
-    </w:p>
-    <w:p>
-      <w:pPr>
-        <w:pStyle w:val="Heading3"/>
-      </w:pPr>
-      <w:r>
-        <w:t xml:space="preserve">4.3 </w:t>
-      </w:r>
-      <w:r>
-        <w:t>Alarm Management</w:t>
-      </w:r>
-      <w:r>
-        <w:t xml:space="preserve"> </w:t>
-      </w:r>
-    </w:p>
-    <w:p>
-      <w:pPr>
+        <w:t>triggering</w:t>
+      </w:r>
+      <w:r>
         <w:rPr>
           <w:rFonts w:asciiTheme="majorHAnsi" w:hAnsiTheme="majorHAnsi" w:cstheme="majorHAnsi"/>
         </w:rPr>
-      </w:pPr>
+        <w:t xml:space="preserve"> the alarm based on received event signal.</w:t>
+      </w:r>
       <w:r>
         <w:rPr>
           <w:rFonts w:asciiTheme="majorHAnsi" w:hAnsiTheme="majorHAnsi" w:cstheme="majorHAnsi"/>
         </w:rPr>
-        <w:t xml:space="preserve">   </w:t>
+        <w:t xml:space="preserve"> </w:t>
       </w:r>
       <w:r>
         <w:rPr>
@@ -899,14 +1307,10 @@
       <w:r>
         <w:rPr>
           <w:rFonts w:asciiTheme="majorHAnsi" w:hAnsiTheme="majorHAnsi" w:cstheme="majorHAnsi"/>
+          <w:i/>
+          <w:iCs/>
         </w:rPr>
-        <w:t>[ALARM_TIMEOUT]</w:t>
-      </w:r>
-      <w:r>
-        <w:rPr>
-          <w:rFonts w:asciiTheme="majorHAnsi" w:hAnsiTheme="majorHAnsi" w:cstheme="majorHAnsi"/>
-        </w:rPr>
-        <w:t>.</w:t>
+        <w:t>[ALARM_TIMEOUT].</w:t>
       </w:r>
     </w:p>
     <w:p>
@@ -929,20 +1333,30 @@
     </w:p>
     <w:p>
       <w:pPr>
-        <w:pStyle w:val="Heading2"/>
-      </w:pPr>
-      <w:r>
-        <w:t>5. Interface Design</w:t>
-      </w:r>
+        <w:pStyle w:val="ListParagraph"/>
+        <w:rPr>
+          <w:rFonts w:asciiTheme="majorHAnsi" w:hAnsiTheme="majorHAnsi" w:cstheme="majorHAnsi"/>
+        </w:rPr>
+      </w:pPr>
     </w:p>
     <w:p>
       <w:pPr>
+        <w:pStyle w:val="Heading2"/>
+      </w:pPr>
+      <w:r>
+        <w:t>5. Interface Design</w:t>
+      </w:r>
+    </w:p>
+    <w:p/>
+    <w:p>
+      <w:pPr>
         <w:pStyle w:val="Heading3"/>
       </w:pPr>
       <w:r>
         <w:t>5.1 Define APIs</w:t>
       </w:r>
     </w:p>
+    <w:p/>
     <w:tbl>
       <w:tblPr>
         <w:tblStyle w:val="TableGrid"/>
@@ -1080,6 +1494,8 @@
             <w:r>
               <w:rPr>
                 <w:rFonts w:asciiTheme="majorHAnsi" w:hAnsiTheme="majorHAnsi" w:cstheme="majorHAnsi"/>
+                <w:i/>
+                <w:iCs/>
               </w:rPr>
               <w:t>[F]</w:t>
             </w:r>
@@ -1167,7 +1583,15 @@
               <w:rPr>
                 <w:rFonts w:asciiTheme="majorHAnsi" w:hAnsiTheme="majorHAnsi" w:cstheme="majorHAnsi"/>
               </w:rPr>
-              <w:t xml:space="preserve"> [I]</w:t>
+              <w:t xml:space="preserve"> </w:t>
+            </w:r>
+            <w:r>
+              <w:rPr>
+                <w:rFonts w:asciiTheme="majorHAnsi" w:hAnsiTheme="majorHAnsi" w:cstheme="majorHAnsi"/>
+                <w:i/>
+                <w:iCs/>
+              </w:rPr>
+              <w:t>[I]</w:t>
             </w:r>
             <w:r>
               <w:rPr>
@@ -1240,13 +1664,25 @@
               <w:t xml:space="preserve"> </w:t>
             </w:r>
             <w:r>
+              <w:rPr>
+                <w:i/>
+                <w:iCs/>
+              </w:rPr>
               <w:t>[THRESHOLD_MIN, THRESOLD_MAX]</w:t>
             </w:r>
             <w:r>
               <w:rPr>
                 <w:rFonts w:asciiTheme="majorHAnsi" w:hAnsiTheme="majorHAnsi" w:cstheme="majorHAnsi"/>
+                <w:i/>
+                <w:iCs/>
               </w:rPr>
-              <w:t>, set event flag if limit exceeds</w:t>
+              <w:t>,</w:t>
+            </w:r>
+            <w:r>
+              <w:rPr>
+                <w:rFonts w:asciiTheme="majorHAnsi" w:hAnsiTheme="majorHAnsi" w:cstheme="majorHAnsi"/>
+              </w:rPr>
+              <w:t xml:space="preserve"> set event flag if limit exceeds</w:t>
             </w:r>
           </w:p>
         </w:tc>
@@ -1322,47 +1758,105 @@
       </w:tr>
     </w:tbl>
     <w:p/>
+    <w:p/>
     <w:p>
       <w:pPr>
         <w:pStyle w:val="Heading3"/>
       </w:pPr>
       <w:r>
+        <w:lastRenderedPageBreak/>
         <w:t>5.2 Inter-process Communication method</w:t>
+      </w:r>
+    </w:p>
+    <w:p/>
+    <w:p>
+      <w:r>
+        <w:t xml:space="preserve">The system </w:t>
+      </w:r>
+      <w:r>
+        <w:t>implements</w:t>
+      </w:r>
+      <w:r>
+        <w:t xml:space="preserve"> message queue for Inter process communication.</w:t>
+      </w:r>
+      <w:r>
+        <w:t xml:space="preserve"> Sensor management module  pushes sensor data . Validation engine read and execute validation.</w:t>
+      </w:r>
+      <w:r>
+        <w:t xml:space="preserve"> Set below parameter for implementing message queue.</w:t>
       </w:r>
     </w:p>
     <w:p>
-      <w:r>
-        <w:t xml:space="preserve">The system </w:t>
-      </w:r>
-      <w:r>
-        <w:t>implements</w:t>
-      </w:r>
-      <w:r>
-        <w:t xml:space="preserve"> message queue for Inter process communication.</w:t>
-      </w:r>
-      <w:r>
-        <w:t xml:space="preserve"> Sensor management module  pushes sensor data . Validation engine read and execute validation.</w:t>
+      <w:pPr>
+        <w:pStyle w:val="ListParagraph"/>
+        <w:numPr>
+          <w:ilvl w:val="0"/>
+          <w:numId w:val="14"/>
+        </w:numPr>
+      </w:pPr>
+      <w:r>
+        <w:t>Set Message Queue size.</w:t>
       </w:r>
     </w:p>
     <w:p>
       <w:pPr>
+        <w:pStyle w:val="ListParagraph"/>
+        <w:numPr>
+          <w:ilvl w:val="0"/>
+          <w:numId w:val="14"/>
+        </w:numPr>
+      </w:pPr>
+      <w:r>
+        <w:t>Set Message Size.</w:t>
+      </w:r>
+    </w:p>
+    <w:p/>
+    <w:p>
+      <w:pPr>
         <w:pStyle w:val="Heading3"/>
-      </w:pPr>
-      <w:r>
-        <w:t>5.3 Data exchange Formats</w:t>
+        <w:numPr>
+          <w:ilvl w:val="1"/>
+          <w:numId w:val="15"/>
+        </w:numPr>
+      </w:pPr>
+      <w:r>
+        <w:t>Data exchange Formats</w:t>
       </w:r>
     </w:p>
+    <w:p/>
     <w:p>
+      <w:pPr>
+        <w:rPr>
+          <w:rFonts w:asciiTheme="majorHAnsi" w:hAnsiTheme="majorHAnsi" w:cstheme="majorHAnsi"/>
+        </w:rPr>
+      </w:pPr>
       <w:r>
         <w:t>The system receives 4-byte unsigned integer from sensor module.</w:t>
       </w:r>
+      <w:r>
+        <w:t xml:space="preserve"> This Must be in range of </w:t>
+      </w:r>
+      <w:r>
+        <w:rPr>
+          <w:rFonts w:asciiTheme="majorHAnsi" w:hAnsiTheme="majorHAnsi" w:cstheme="majorHAnsi"/>
+        </w:rPr>
+        <w:t>[</w:t>
+      </w:r>
+      <w:r>
+        <w:rPr>
+          <w:rFonts w:asciiTheme="majorHAnsi" w:hAnsiTheme="majorHAnsi" w:cstheme="majorHAnsi"/>
+          <w:i/>
+          <w:iCs/>
+        </w:rPr>
+        <w:t>MIN_RANGE , MAX RANGE]</w:t>
+      </w:r>
     </w:p>
+    <w:p/>
     <w:p>
       <w:pPr>
         <w:pStyle w:val="Heading2"/>
       </w:pPr>
       <w:r>
-        <w:lastRenderedPageBreak/>
         <w:t>6. Data Flow</w:t>
       </w:r>
     </w:p>
@@ -1374,6 +1868,7 @@
       </w:pPr>
       <w:r>
         <w:rPr>
+          <w:noProof/>
           <w:lang w:val="en-IN"/>
         </w:rPr>
         <w:drawing>
@@ -1432,6 +1927,7 @@
         <w:pStyle w:val="Heading2"/>
       </w:pPr>
       <w:r>
+        <w:lastRenderedPageBreak/>
         <w:t>7. Error Handling &amp; Fault Management</w:t>
       </w:r>
     </w:p>
@@ -1440,10 +1936,7 @@
         <w:pStyle w:val="Heading3"/>
       </w:pPr>
       <w:r>
-        <w:t>7.</w:t>
-      </w:r>
-      <w:r>
-        <w:t>1.Fault Detection</w:t>
+        <w:t>7.1.Fault Detection</w:t>
       </w:r>
     </w:p>
     <w:p>
@@ -1455,7 +1948,19 @@
         </w:numPr>
       </w:pPr>
       <w:r>
-        <w:t>Check the status of thread initialization. If failed to initialize exit with a warning.</w:t>
+        <w:t xml:space="preserve">Check the status of thread initialization. If </w:t>
+      </w:r>
+      <w:r>
+        <w:t>fails</w:t>
+      </w:r>
+      <w:r>
+        <w:t xml:space="preserve"> to initialize</w:t>
+      </w:r>
+      <w:r>
+        <w:t>,</w:t>
+      </w:r>
+      <w:r>
+        <w:t xml:space="preserve"> exit with a warning.</w:t>
       </w:r>
     </w:p>
     <w:p>
@@ -1494,10 +1999,7 @@
         <w:t>If you</w:t>
       </w:r>
       <w:r>
-        <w:t xml:space="preserve"> do not get data from message queue in a certain period </w:t>
-      </w:r>
-      <w:r>
-        <w:t>,</w:t>
+        <w:t xml:space="preserve"> do not get data from message queue in a certain period ,</w:t>
       </w:r>
       <w:r>
         <w:t>treat it</w:t>
@@ -1508,36 +2010,70 @@
     </w:p>
     <w:p>
       <w:pPr>
-        <w:pStyle w:val="Heading3"/>
-      </w:pPr>
-      <w:r>
-        <w:t>7.2.Recovery Mechanism</w:t>
-      </w:r>
+        <w:pStyle w:val="ListParagraph"/>
+      </w:pPr>
     </w:p>
     <w:p>
-      <w:r>
-        <w:t xml:space="preserve">Define an ideal interval [T] , Check the whole system work in that ideal interval [T] , </w:t>
-      </w:r>
-      <w:proofErr w:type="gramStart"/>
-      <w:r>
-        <w:t>If</w:t>
-      </w:r>
-      <w:proofErr w:type="gramEnd"/>
-      <w:r>
-        <w:t xml:space="preserve"> not reboot the whole system.</w:t>
+      <w:pPr>
+        <w:pStyle w:val="Heading3"/>
+      </w:pPr>
+      <w:r>
+        <w:t>7.2.Recovery Mechanism</w:t>
+      </w:r>
+    </w:p>
+    <w:p/>
+    <w:p>
+      <w:r>
+        <w:t xml:space="preserve">Define an ideal interval </w:t>
+      </w:r>
+      <w:r>
+        <w:rPr>
+          <w:i/>
+          <w:iCs/>
+        </w:rPr>
+        <w:t>[T]</w:t>
+      </w:r>
+      <w:r>
+        <w:t xml:space="preserve"> , Check the whole system work in that ideal interval </w:t>
+      </w:r>
+      <w:r>
+        <w:rPr>
+          <w:i/>
+          <w:iCs/>
+        </w:rPr>
+        <w:t xml:space="preserve">[T] </w:t>
+      </w:r>
+      <w:r>
+        <w:t xml:space="preserve">, </w:t>
+      </w:r>
+      <w:r>
+        <w:t>if</w:t>
+      </w:r>
+      <w:r>
+        <w:t xml:space="preserve"> not reboot the whole system</w:t>
+      </w:r>
+      <w:r>
+        <w:t xml:space="preserve"> with escalation warnings</w:t>
+      </w:r>
+      <w:r>
+        <w:t>.</w:t>
+      </w:r>
+    </w:p>
+    <w:p/>
+    <w:p>
+      <w:pPr>
+        <w:pStyle w:val="Heading2"/>
+      </w:pPr>
+      <w:r>
+        <w:t>8. Traceability</w:t>
       </w:r>
     </w:p>
     <w:p>
-      <w:pPr>
-        <w:pStyle w:val="Heading2"/>
-      </w:pPr>
-      <w:r>
-        <w:t>8. Traceability</w:t>
-      </w:r>
-    </w:p>
-    <w:p>
       <w:r>
         <w:t>SRS document – Requirement and functionality analysis</w:t>
+      </w:r>
+      <w:r>
+        <w:t xml:space="preserve"> (V1.0)</w:t>
       </w:r>
     </w:p>
     <w:sectPr>
@@ -2066,6 +2602,232 @@
     <w:nsid w:val="63CC6246"/>
     <w:multiLevelType w:val="hybridMultilevel"/>
     <w:tmpl w:val="69DE07FC"/>
+    <w:lvl w:ilvl="0" w:tplc="40090001">
+      <w:start w:val="1"/>
+      <w:numFmt w:val="bullet"/>
+      <w:lvlText w:val=""/>
+      <w:lvlJc w:val="left"/>
+      <w:pPr>
+        <w:ind w:left="720" w:hanging="360"/>
+      </w:pPr>
+      <w:rPr>
+        <w:rFonts w:ascii="Symbol" w:hAnsi="Symbol" w:hint="default"/>
+      </w:rPr>
+    </w:lvl>
+    <w:lvl w:ilvl="1" w:tplc="40090003" w:tentative="1">
+      <w:start w:val="1"/>
+      <w:numFmt w:val="bullet"/>
+      <w:lvlText w:val="o"/>
+      <w:lvlJc w:val="left"/>
+      <w:pPr>
+        <w:ind w:left="1440" w:hanging="360"/>
+      </w:pPr>
+      <w:rPr>
+        <w:rFonts w:ascii="Courier New" w:hAnsi="Courier New" w:cs="Courier New" w:hint="default"/>
+      </w:rPr>
+    </w:lvl>
+    <w:lvl w:ilvl="2" w:tplc="40090005" w:tentative="1">
+      <w:start w:val="1"/>
+      <w:numFmt w:val="bullet"/>
+      <w:lvlText w:val=""/>
+      <w:lvlJc w:val="left"/>
+      <w:pPr>
+        <w:ind w:left="2160" w:hanging="360"/>
+      </w:pPr>
+      <w:rPr>
+        <w:rFonts w:ascii="Wingdings" w:hAnsi="Wingdings" w:hint="default"/>
+      </w:rPr>
+    </w:lvl>
+    <w:lvl w:ilvl="3" w:tplc="40090001" w:tentative="1">
+      <w:start w:val="1"/>
+      <w:numFmt w:val="bullet"/>
+      <w:lvlText w:val=""/>
+      <w:lvlJc w:val="left"/>
+      <w:pPr>
+        <w:ind w:left="2880" w:hanging="360"/>
+      </w:pPr>
+      <w:rPr>
+        <w:rFonts w:ascii="Symbol" w:hAnsi="Symbol" w:hint="default"/>
+      </w:rPr>
+    </w:lvl>
+    <w:lvl w:ilvl="4" w:tplc="40090003" w:tentative="1">
+      <w:start w:val="1"/>
+      <w:numFmt w:val="bullet"/>
+      <w:lvlText w:val="o"/>
+      <w:lvlJc w:val="left"/>
+      <w:pPr>
+        <w:ind w:left="3600" w:hanging="360"/>
+      </w:pPr>
+      <w:rPr>
+        <w:rFonts w:ascii="Courier New" w:hAnsi="Courier New" w:cs="Courier New" w:hint="default"/>
+      </w:rPr>
+    </w:lvl>
+    <w:lvl w:ilvl="5" w:tplc="40090005" w:tentative="1">
+      <w:start w:val="1"/>
+      <w:numFmt w:val="bullet"/>
+      <w:lvlText w:val=""/>
+      <w:lvlJc w:val="left"/>
+      <w:pPr>
+        <w:ind w:left="4320" w:hanging="360"/>
+      </w:pPr>
+      <w:rPr>
+        <w:rFonts w:ascii="Wingdings" w:hAnsi="Wingdings" w:hint="default"/>
+      </w:rPr>
+    </w:lvl>
+    <w:lvl w:ilvl="6" w:tplc="40090001" w:tentative="1">
+      <w:start w:val="1"/>
+      <w:numFmt w:val="bullet"/>
+      <w:lvlText w:val=""/>
+      <w:lvlJc w:val="left"/>
+      <w:pPr>
+        <w:ind w:left="5040" w:hanging="360"/>
+      </w:pPr>
+      <w:rPr>
+        <w:rFonts w:ascii="Symbol" w:hAnsi="Symbol" w:hint="default"/>
+      </w:rPr>
+    </w:lvl>
+    <w:lvl w:ilvl="7" w:tplc="40090003" w:tentative="1">
+      <w:start w:val="1"/>
+      <w:numFmt w:val="bullet"/>
+      <w:lvlText w:val="o"/>
+      <w:lvlJc w:val="left"/>
+      <w:pPr>
+        <w:ind w:left="5760" w:hanging="360"/>
+      </w:pPr>
+      <w:rPr>
+        <w:rFonts w:ascii="Courier New" w:hAnsi="Courier New" w:cs="Courier New" w:hint="default"/>
+      </w:rPr>
+    </w:lvl>
+    <w:lvl w:ilvl="8" w:tplc="40090005" w:tentative="1">
+      <w:start w:val="1"/>
+      <w:numFmt w:val="bullet"/>
+      <w:lvlText w:val=""/>
+      <w:lvlJc w:val="left"/>
+      <w:pPr>
+        <w:ind w:left="6480" w:hanging="360"/>
+      </w:pPr>
+      <w:rPr>
+        <w:rFonts w:ascii="Wingdings" w:hAnsi="Wingdings" w:hint="default"/>
+      </w:rPr>
+    </w:lvl>
+  </w:abstractNum>
+  <w:abstractNum w:abstractNumId="13" w15:restartNumberingAfterBreak="0">
+    <w:nsid w:val="6B1A1830"/>
+    <w:multiLevelType w:val="multilevel"/>
+    <w:tmpl w:val="443044B0"/>
+    <w:lvl w:ilvl="0">
+      <w:start w:val="5"/>
+      <w:numFmt w:val="decimal"/>
+      <w:lvlText w:val="%1"/>
+      <w:lvlJc w:val="left"/>
+      <w:pPr>
+        <w:ind w:left="360" w:hanging="360"/>
+      </w:pPr>
+      <w:rPr>
+        <w:rFonts w:hint="default"/>
+      </w:rPr>
+    </w:lvl>
+    <w:lvl w:ilvl="1">
+      <w:start w:val="3"/>
+      <w:numFmt w:val="decimal"/>
+      <w:lvlText w:val="%1.%2"/>
+      <w:lvlJc w:val="left"/>
+      <w:pPr>
+        <w:ind w:left="360" w:hanging="360"/>
+      </w:pPr>
+      <w:rPr>
+        <w:rFonts w:hint="default"/>
+      </w:rPr>
+    </w:lvl>
+    <w:lvl w:ilvl="2">
+      <w:start w:val="1"/>
+      <w:numFmt w:val="decimal"/>
+      <w:lvlText w:val="%1.%2.%3"/>
+      <w:lvlJc w:val="left"/>
+      <w:pPr>
+        <w:ind w:left="720" w:hanging="720"/>
+      </w:pPr>
+      <w:rPr>
+        <w:rFonts w:hint="default"/>
+      </w:rPr>
+    </w:lvl>
+    <w:lvl w:ilvl="3">
+      <w:start w:val="1"/>
+      <w:numFmt w:val="decimal"/>
+      <w:lvlText w:val="%1.%2.%3.%4"/>
+      <w:lvlJc w:val="left"/>
+      <w:pPr>
+        <w:ind w:left="720" w:hanging="720"/>
+      </w:pPr>
+      <w:rPr>
+        <w:rFonts w:hint="default"/>
+      </w:rPr>
+    </w:lvl>
+    <w:lvl w:ilvl="4">
+      <w:start w:val="1"/>
+      <w:numFmt w:val="decimal"/>
+      <w:lvlText w:val="%1.%2.%3.%4.%5"/>
+      <w:lvlJc w:val="left"/>
+      <w:pPr>
+        <w:ind w:left="1080" w:hanging="1080"/>
+      </w:pPr>
+      <w:rPr>
+        <w:rFonts w:hint="default"/>
+      </w:rPr>
+    </w:lvl>
+    <w:lvl w:ilvl="5">
+      <w:start w:val="1"/>
+      <w:numFmt w:val="decimal"/>
+      <w:lvlText w:val="%1.%2.%3.%4.%5.%6"/>
+      <w:lvlJc w:val="left"/>
+      <w:pPr>
+        <w:ind w:left="1080" w:hanging="1080"/>
+      </w:pPr>
+      <w:rPr>
+        <w:rFonts w:hint="default"/>
+      </w:rPr>
+    </w:lvl>
+    <w:lvl w:ilvl="6">
+      <w:start w:val="1"/>
+      <w:numFmt w:val="decimal"/>
+      <w:lvlText w:val="%1.%2.%3.%4.%5.%6.%7"/>
+      <w:lvlJc w:val="left"/>
+      <w:pPr>
+        <w:ind w:left="1440" w:hanging="1440"/>
+      </w:pPr>
+      <w:rPr>
+        <w:rFonts w:hint="default"/>
+      </w:rPr>
+    </w:lvl>
+    <w:lvl w:ilvl="7">
+      <w:start w:val="1"/>
+      <w:numFmt w:val="decimal"/>
+      <w:lvlText w:val="%1.%2.%3.%4.%5.%6.%7.%8"/>
+      <w:lvlJc w:val="left"/>
+      <w:pPr>
+        <w:ind w:left="1440" w:hanging="1440"/>
+      </w:pPr>
+      <w:rPr>
+        <w:rFonts w:hint="default"/>
+      </w:rPr>
+    </w:lvl>
+    <w:lvl w:ilvl="8">
+      <w:start w:val="1"/>
+      <w:numFmt w:val="decimal"/>
+      <w:lvlText w:val="%1.%2.%3.%4.%5.%6.%7.%8.%9"/>
+      <w:lvlJc w:val="left"/>
+      <w:pPr>
+        <w:ind w:left="1440" w:hanging="1440"/>
+      </w:pPr>
+      <w:rPr>
+        <w:rFonts w:hint="default"/>
+      </w:rPr>
+    </w:lvl>
+  </w:abstractNum>
+  <w:abstractNum w:abstractNumId="14" w15:restartNumberingAfterBreak="0">
+    <w:nsid w:val="6EA1531F"/>
+    <w:multiLevelType w:val="hybridMultilevel"/>
+    <w:tmpl w:val="674AF5EC"/>
     <w:lvl w:ilvl="0" w:tplc="40090001">
       <w:start w:val="1"/>
       <w:numFmt w:val="bullet"/>
@@ -2213,6 +2975,12 @@
   </w:num>
   <w:num w:numId="13" w16cid:durableId="71243720">
     <w:abstractNumId w:val="9"/>
+  </w:num>
+  <w:num w:numId="14" w16cid:durableId="1097291107">
+    <w:abstractNumId w:val="14"/>
+  </w:num>
+  <w:num w:numId="15" w16cid:durableId="1180050130">
+    <w:abstractNumId w:val="13"/>
   </w:num>
 </w:numbering>
 </file>
@@ -2823,6 +3591,7 @@
   <w:style w:type="character" w:default="1" w:styleId="DefaultParagraphFont">
     <w:name w:val="Default Paragraph Font"/>
     <w:uiPriority w:val="1"/>
+    <w:semiHidden/>
     <w:unhideWhenUsed/>
   </w:style>
   <w:style w:type="table" w:default="1" w:styleId="TableNormal">

</xml_diff>